<commit_message>
Added pages folder and updated Config.yml
</commit_message>
<xml_diff>
--- a/Resume/TylerNobleResume.docx
+++ b/Resume/TylerNobleResume.docx
@@ -18,8 +18,6 @@
         </w:rPr>
         <w:t>Tyler Noble</w:t>
       </w:r>
-      <w:bookmarkStart w:id="0" w:name="_GoBack"/>
-      <w:bookmarkEnd w:id="0"/>
     </w:p>
     <w:p>
       <w:pPr>
@@ -209,8 +207,8 @@
           <w:szCs w:val="24"/>
         </w:rPr>
       </w:pPr>
-      <w:bookmarkStart w:id="1" w:name="_c0rghulzkw3a" w:colFirst="0" w:colLast="0"/>
-      <w:bookmarkEnd w:id="1"/>
+      <w:bookmarkStart w:id="0" w:name="_c0rghulzkw3a" w:colFirst="0" w:colLast="0"/>
+      <w:bookmarkEnd w:id="0"/>
       <w:r>
         <w:rPr>
           <w:sz w:val="24"/>
@@ -220,7 +218,27 @@
       </w:r>
     </w:p>
     <w:p>
-      <w:bookmarkStart w:id="2" w:name="_mduttf3ljmet" w:colFirst="0" w:colLast="0"/>
+      <w:bookmarkStart w:id="1" w:name="_mduttf3ljmet" w:colFirst="0" w:colLast="0"/>
+      <w:bookmarkStart w:id="2" w:name="_GoBack"/>
+      <w:bookmarkEnd w:id="1"/>
+      <w:r>
+        <w:rPr>
+          <w:noProof/>
+        </w:rPr>
+        <w:drawing>
+          <wp:inline distT="0" distB="0" distL="0" distR="0" wp14:anchorId="6F4CC82A" wp14:editId="27F027B7">
+            <wp:extent cx="6810375" cy="447675"/>
+            <wp:effectExtent l="19050" t="171450" r="9525" b="200025"/>
+            <wp:docPr id="1" name="Diagram 1"/>
+            <wp:cNvGraphicFramePr/>
+            <a:graphic xmlns:a="http://schemas.openxmlformats.org/drawingml/2006/main">
+              <a:graphicData uri="http://schemas.openxmlformats.org/drawingml/2006/diagram">
+                <dgm:relIds xmlns:dgm="http://schemas.openxmlformats.org/drawingml/2006/diagram" xmlns:r="http://schemas.openxmlformats.org/officeDocument/2006/relationships" r:dm="rId10" r:lo="rId11" r:qs="rId12" r:cs="rId13"/>
+              </a:graphicData>
+            </a:graphic>
+          </wp:inline>
+        </w:drawing>
+      </w:r>
       <w:bookmarkEnd w:id="2"/>
     </w:p>
     <w:p>
@@ -236,15 +254,6 @@
           <w:szCs w:val="20"/>
         </w:rPr>
       </w:pPr>
-      <w:commentRangeStart w:id="3"/>
-      <w:commentRangeStart w:id="4"/>
-      <w:r>
-        <w:rPr>
-          <w:sz w:val="22"/>
-          <w:szCs w:val="22"/>
-        </w:rPr>
-        <w:t xml:space="preserve">Well Known: </w:t>
-      </w:r>
       <w:r>
         <w:rPr>
           <w:b w:val="0"/>
@@ -304,7 +313,7 @@
           <w:sz w:val="20"/>
           <w:szCs w:val="20"/>
         </w:rPr>
-        <w:t>XML/HTML5, CSS/Bootstrap, Bash,</w:t>
+        <w:t>XML/HTML5, CSS/Bootstrap,</w:t>
       </w:r>
       <w:r>
         <w:rPr>
@@ -312,7 +321,7 @@
           <w:sz w:val="20"/>
           <w:szCs w:val="20"/>
         </w:rPr>
-        <w:t xml:space="preserve"> AJAX, MongoDB, </w:t>
+        <w:t xml:space="preserve"> MongoDB, </w:t>
       </w:r>
       <w:r>
         <w:rPr>
@@ -321,32 +330,6 @@
           <w:szCs w:val="20"/>
         </w:rPr>
         <w:t>React.js</w:t>
-      </w:r>
-      <w:r>
-        <w:rPr>
-          <w:color w:val="666666"/>
-          <w:sz w:val="20"/>
-          <w:szCs w:val="20"/>
-        </w:rPr>
-        <w:t>, Docker, Nginx</w:t>
-      </w:r>
-      <w:commentRangeEnd w:id="3"/>
-      <w:r>
-        <w:rPr>
-          <w:rStyle w:val="CommentReference"/>
-          <w:b w:val="0"/>
-          <w:color w:val="666666"/>
-        </w:rPr>
-        <w:commentReference w:id="3"/>
-      </w:r>
-      <w:commentRangeEnd w:id="4"/>
-      <w:r>
-        <w:rPr>
-          <w:rStyle w:val="CommentReference"/>
-          <w:b w:val="0"/>
-          <w:color w:val="666666"/>
-        </w:rPr>
-        <w:commentReference w:id="4"/>
       </w:r>
     </w:p>
     <w:p>
@@ -387,8 +370,8 @@
           <w:szCs w:val="22"/>
         </w:rPr>
       </w:pPr>
-      <w:bookmarkStart w:id="5" w:name="_f10guox53uzh" w:colFirst="0" w:colLast="0"/>
-      <w:bookmarkEnd w:id="5"/>
+      <w:bookmarkStart w:id="3" w:name="_f10guox53uzh" w:colFirst="0" w:colLast="0"/>
+      <w:bookmarkEnd w:id="3"/>
     </w:p>
     <w:p>
       <w:pPr>
@@ -439,19 +422,13 @@
         <w:rPr>
           <w:b w:val="0"/>
         </w:rPr>
-        <w:t xml:space="preserve">       </w:t>
-      </w:r>
-      <w:r>
-        <w:rPr>
-          <w:b w:val="0"/>
-        </w:rPr>
-        <w:t xml:space="preserve">  </w:t>
-      </w:r>
-      <w:r>
-        <w:rPr>
-          <w:b w:val="0"/>
-        </w:rPr>
-        <w:t xml:space="preserve">   </w:t>
+        <w:t xml:space="preserve">    </w:t>
+      </w:r>
+      <w:r>
+        <w:rPr>
+          <w:b w:val="0"/>
+        </w:rPr>
+        <w:t xml:space="preserve"> </w:t>
       </w:r>
       <w:r>
         <w:rPr>
@@ -460,7 +437,16 @@
           <w:sz w:val="22"/>
           <w:szCs w:val="22"/>
         </w:rPr>
-        <w:t>September 2019 – Present</w:t>
+        <w:t xml:space="preserve">September 2019 – </w:t>
+      </w:r>
+      <w:r>
+        <w:rPr>
+          <w:b w:val="0"/>
+          <w:color w:val="666666"/>
+          <w:sz w:val="22"/>
+          <w:szCs w:val="22"/>
+        </w:rPr>
+        <w:t>March 2020</w:t>
       </w:r>
     </w:p>
     <w:p>
@@ -470,9 +456,21 @@
           <w:numId w:val="2"/>
         </w:numPr>
       </w:pPr>
-      <w:commentRangeStart w:id="6"/>
-      <w:r>
-        <w:t xml:space="preserve">Architect and design </w:t>
+      <w:commentRangeStart w:id="4"/>
+      <w:r>
+        <w:t>Architect</w:t>
+      </w:r>
+      <w:r>
+        <w:t>ed</w:t>
+      </w:r>
+      <w:r>
+        <w:t xml:space="preserve"> and design</w:t>
+      </w:r>
+      <w:r>
+        <w:t>ed</w:t>
+      </w:r>
+      <w:r>
+        <w:t xml:space="preserve"> </w:t>
       </w:r>
       <w:r>
         <w:t>system for facilitation of supply chain management solution</w:t>
@@ -492,10 +490,22 @@
         </w:numPr>
       </w:pPr>
       <w:r>
-        <w:t xml:space="preserve">Design and </w:t>
-      </w:r>
-      <w:r>
-        <w:t xml:space="preserve">implement </w:t>
+        <w:t>Design</w:t>
+      </w:r>
+      <w:r>
+        <w:t>ed</w:t>
+      </w:r>
+      <w:r>
+        <w:t xml:space="preserve"> and </w:t>
+      </w:r>
+      <w:r>
+        <w:t>implement</w:t>
+      </w:r>
+      <w:r>
+        <w:t>ed</w:t>
+      </w:r>
+      <w:r>
+        <w:t xml:space="preserve"> </w:t>
       </w:r>
       <w:r>
         <w:t xml:space="preserve">a </w:t>
@@ -512,12 +522,12 @@
       <w:r>
         <w:t xml:space="preserve">documentation </w:t>
       </w:r>
-      <w:commentRangeEnd w:id="6"/>
+      <w:commentRangeEnd w:id="4"/>
       <w:r>
         <w:rPr>
           <w:rStyle w:val="CommentReference"/>
         </w:rPr>
-        <w:commentReference w:id="6"/>
+        <w:commentReference w:id="4"/>
       </w:r>
     </w:p>
     <w:p>
@@ -527,16 +537,16 @@
           <w:numId w:val="2"/>
         </w:numPr>
       </w:pPr>
-      <w:commentRangeStart w:id="7"/>
+      <w:commentRangeStart w:id="5"/>
       <w:r>
         <w:t xml:space="preserve">Communicate effectively and build rapport with clients to better understand their business needs </w:t>
       </w:r>
-      <w:commentRangeEnd w:id="7"/>
+      <w:commentRangeEnd w:id="5"/>
       <w:r>
         <w:rPr>
           <w:rStyle w:val="CommentReference"/>
         </w:rPr>
-        <w:commentReference w:id="7"/>
+        <w:commentReference w:id="5"/>
       </w:r>
     </w:p>
     <w:p>
@@ -684,8 +694,8 @@
         <w:pStyle w:val="Heading2"/>
         <w:spacing w:before="0"/>
       </w:pPr>
-      <w:bookmarkStart w:id="8" w:name="_777yav3jgwst" w:colFirst="0" w:colLast="0"/>
-      <w:bookmarkEnd w:id="8"/>
+      <w:bookmarkStart w:id="6" w:name="_777yav3jgwst" w:colFirst="0" w:colLast="0"/>
+      <w:bookmarkEnd w:id="6"/>
       <w:r>
         <w:rPr>
           <w:sz w:val="22"/>
@@ -871,11 +881,11 @@
           <w:szCs w:val="24"/>
         </w:rPr>
       </w:pPr>
-      <w:bookmarkStart w:id="9" w:name="_1stknmt494xx" w:colFirst="0" w:colLast="0"/>
-      <w:bookmarkStart w:id="10" w:name="_7gdmgcujgcw7" w:colFirst="0" w:colLast="0"/>
-      <w:bookmarkEnd w:id="9"/>
-      <w:bookmarkEnd w:id="10"/>
-      <w:commentRangeStart w:id="11"/>
+      <w:bookmarkStart w:id="7" w:name="_1stknmt494xx" w:colFirst="0" w:colLast="0"/>
+      <w:bookmarkStart w:id="8" w:name="_7gdmgcujgcw7" w:colFirst="0" w:colLast="0"/>
+      <w:bookmarkEnd w:id="7"/>
+      <w:bookmarkEnd w:id="8"/>
+      <w:commentRangeStart w:id="9"/>
       <w:r>
         <w:rPr>
           <w:sz w:val="24"/>
@@ -883,14 +893,14 @@
         </w:rPr>
         <w:t>PROJECTS &amp; EXTRA CURRICULAR</w:t>
       </w:r>
-      <w:commentRangeEnd w:id="11"/>
+      <w:commentRangeEnd w:id="9"/>
       <w:r>
         <w:rPr>
           <w:rStyle w:val="CommentReference"/>
           <w:b w:val="0"/>
           <w:color w:val="666666"/>
         </w:rPr>
-        <w:commentReference w:id="11"/>
+        <w:commentReference w:id="9"/>
       </w:r>
     </w:p>
     <w:p>
@@ -902,8 +912,8 @@
           <w:szCs w:val="22"/>
         </w:rPr>
       </w:pPr>
-      <w:bookmarkStart w:id="12" w:name="_fnirtl6h3dhp" w:colFirst="0" w:colLast="0"/>
-      <w:bookmarkEnd w:id="12"/>
+      <w:bookmarkStart w:id="10" w:name="_fnirtl6h3dhp" w:colFirst="0" w:colLast="0"/>
+      <w:bookmarkEnd w:id="10"/>
     </w:p>
     <w:p>
       <w:pPr>
@@ -1084,8 +1094,8 @@
           <w:szCs w:val="22"/>
         </w:rPr>
       </w:pPr>
-      <w:bookmarkStart w:id="13" w:name="_gvrnwzclsnm7" w:colFirst="0" w:colLast="0"/>
-      <w:bookmarkEnd w:id="13"/>
+      <w:bookmarkStart w:id="11" w:name="_gvrnwzclsnm7" w:colFirst="0" w:colLast="0"/>
+      <w:bookmarkEnd w:id="11"/>
       <w:r>
         <w:rPr>
           <w:sz w:val="22"/>
@@ -1276,8 +1286,8 @@
           <w:tab w:val="left" w:pos="3915"/>
         </w:tabs>
       </w:pPr>
-      <w:bookmarkStart w:id="14" w:name="_xojk11sepuxy" w:colFirst="0" w:colLast="0"/>
-      <w:bookmarkEnd w:id="14"/>
+      <w:bookmarkStart w:id="12" w:name="_xojk11sepuxy" w:colFirst="0" w:colLast="0"/>
+      <w:bookmarkEnd w:id="12"/>
       <w:r>
         <w:rPr>
           <w:b/>
@@ -1295,8 +1305,8 @@
           <w:szCs w:val="22"/>
         </w:rPr>
       </w:pPr>
-      <w:bookmarkStart w:id="15" w:name="_mxkhnzcefnoy" w:colFirst="0" w:colLast="0"/>
-      <w:bookmarkEnd w:id="15"/>
+      <w:bookmarkStart w:id="13" w:name="_mxkhnzcefnoy" w:colFirst="0" w:colLast="0"/>
+      <w:bookmarkEnd w:id="13"/>
       <w:r>
         <w:rPr>
           <w:sz w:val="22"/>
@@ -1453,8 +1463,8 @@
           <w:szCs w:val="22"/>
         </w:rPr>
       </w:pPr>
-      <w:bookmarkStart w:id="16" w:name="_rtdolc8vpvmb" w:colFirst="0" w:colLast="0"/>
-      <w:bookmarkEnd w:id="16"/>
+      <w:bookmarkStart w:id="14" w:name="_rtdolc8vpvmb" w:colFirst="0" w:colLast="0"/>
+      <w:bookmarkEnd w:id="14"/>
       <w:r>
         <w:rPr>
           <w:sz w:val="22"/>
@@ -1583,8 +1593,8 @@
           <w:szCs w:val="24"/>
         </w:rPr>
       </w:pPr>
-      <w:bookmarkStart w:id="17" w:name="_yhlm05wj74dv" w:colFirst="0" w:colLast="0"/>
-      <w:bookmarkEnd w:id="17"/>
+      <w:bookmarkStart w:id="15" w:name="_yhlm05wj74dv" w:colFirst="0" w:colLast="0"/>
+      <w:bookmarkEnd w:id="15"/>
       <w:r>
         <w:rPr>
           <w:sz w:val="24"/>
@@ -1602,10 +1612,11 @@
           <w:i/>
         </w:rPr>
       </w:pPr>
-      <w:bookmarkStart w:id="18" w:name="_k8ji3tsrcf33" w:colFirst="0" w:colLast="0"/>
-      <w:bookmarkEnd w:id="18"/>
+      <w:bookmarkStart w:id="16" w:name="_k8ji3tsrcf33" w:colFirst="0" w:colLast="0"/>
+      <w:bookmarkEnd w:id="16"/>
       <w:proofErr w:type="spellStart"/>
       <w:r>
+        <w:lastRenderedPageBreak/>
         <w:t>Honours</w:t>
       </w:r>
       <w:proofErr w:type="spellEnd"/>
@@ -1619,8 +1630,8 @@
         </w:rPr>
         <w:t>Lassonde School of Engineering-York University</w:t>
       </w:r>
-      <w:bookmarkStart w:id="19" w:name="_uyi92t8snhda" w:colFirst="0" w:colLast="0"/>
-      <w:bookmarkEnd w:id="19"/>
+      <w:bookmarkStart w:id="17" w:name="_uyi92t8snhda" w:colFirst="0" w:colLast="0"/>
+      <w:bookmarkEnd w:id="17"/>
     </w:p>
     <w:p>
       <w:pPr>
@@ -1657,7 +1668,7 @@
 
 <file path=word/comments.xml><?xml version="1.0" encoding="utf-8"?>
 <w:comments xmlns:wpc="http://schemas.microsoft.com/office/word/2010/wordprocessingCanvas" xmlns:cx="http://schemas.microsoft.com/office/drawing/2014/chartex" xmlns:cx1="http://schemas.microsoft.com/office/drawing/2015/9/8/chartex" xmlns:cx2="http://schemas.microsoft.com/office/drawing/2015/10/21/chartex" xmlns:cx3="http://schemas.microsoft.com/office/drawing/2016/5/9/chartex" xmlns:cx4="http://schemas.microsoft.com/office/drawing/2016/5/10/chartex" xmlns:cx5="http://schemas.microsoft.com/office/drawing/2016/5/11/chartex" xmlns:cx6="http://schemas.microsoft.com/office/drawing/2016/5/12/chartex" xmlns:cx7="http://schemas.microsoft.com/office/drawing/2016/5/13/chartex" xmlns:cx8="http://schemas.microsoft.com/office/drawing/2016/5/14/chartex" xmlns:mc="http://schemas.openxmlformats.org/markup-compatibility/2006" xmlns:aink="http://schemas.microsoft.com/office/drawing/2016/ink" xmlns:am3d="http://schemas.microsoft.com/office/drawing/2017/model3d" xmlns:o="urn:schemas-microsoft-com:office:office" xmlns:r="http://schemas.openxmlformats.org/officeDocument/2006/relationships" xmlns:m="http://schemas.openxmlformats.org/officeDocument/2006/math" xmlns:v="urn:schemas-microsoft-com:vml" xmlns:wp14="http://schemas.microsoft.com/office/word/2010/wordprocessingDrawing" xmlns:wp="http://schemas.openxmlformats.org/drawingml/2006/wordprocessingDrawing" xmlns:w10="urn:schemas-microsoft-com:office:word" xmlns:w="http://schemas.openxmlformats.org/wordprocessingml/2006/main" xmlns:w14="http://schemas.microsoft.com/office/word/2010/wordml" xmlns:w15="http://schemas.microsoft.com/office/word/2012/wordml" xmlns:w16cid="http://schemas.microsoft.com/office/word/2016/wordml/cid" xmlns:w16se="http://schemas.microsoft.com/office/word/2015/wordml/symex" xmlns:wpg="http://schemas.microsoft.com/office/word/2010/wordprocessingGroup" xmlns:wpi="http://schemas.microsoft.com/office/word/2010/wordprocessingInk" xmlns:wne="http://schemas.microsoft.com/office/word/2006/wordml" xmlns:wps="http://schemas.microsoft.com/office/word/2010/wordprocessingShape" mc:Ignorable="w14 w15 w16se w16cid wp14">
-  <w:comment w:id="3" w:author="Tyler Noble" w:date="2020-04-07T15:05:00Z" w:initials="TN">
+  <w:comment w:id="4" w:author="Tyler Noble" w:date="2020-04-07T15:05:00Z" w:initials="TN">
     <w:p>
       <w:pPr>
         <w:pStyle w:val="CommentText"/>
@@ -1669,11 +1680,11 @@
         <w:annotationRef/>
       </w:r>
       <w:r>
-        <w:t>Don’t put in familiar and well known, everything you put on should be well known. Or targeted</w:t>
+        <w:t>Say more of what you did</w:t>
       </w:r>
     </w:p>
   </w:comment>
-  <w:comment w:id="4" w:author="Tyler Noble" w:date="2020-04-07T15:05:00Z" w:initials="TN">
+  <w:comment w:id="5" w:author="Tyler Noble" w:date="2020-04-07T15:05:00Z" w:initials="TN">
     <w:p>
       <w:pPr>
         <w:pStyle w:val="CommentText"/>
@@ -1683,42 +1694,13 @@
           <w:rStyle w:val="CommentReference"/>
         </w:rPr>
         <w:annotationRef/>
+      </w:r>
+      <w:r>
+        <w:t>Too vague</w:t>
       </w:r>
     </w:p>
   </w:comment>
-  <w:comment w:id="6" w:author="Tyler Noble" w:date="2020-04-07T15:05:00Z" w:initials="TN">
-    <w:p>
-      <w:pPr>
-        <w:pStyle w:val="CommentText"/>
-      </w:pPr>
-      <w:r>
-        <w:rPr>
-          <w:rStyle w:val="CommentReference"/>
-        </w:rPr>
-        <w:annotationRef/>
-      </w:r>
-      <w:r>
-        <w:t>Say more of what you did</w:t>
-      </w:r>
-    </w:p>
-  </w:comment>
-  <w:comment w:id="7" w:author="Tyler Noble" w:date="2020-04-07T15:05:00Z" w:initials="TN">
-    <w:p>
-      <w:pPr>
-        <w:pStyle w:val="CommentText"/>
-      </w:pPr>
-      <w:r>
-        <w:rPr>
-          <w:rStyle w:val="CommentReference"/>
-        </w:rPr>
-        <w:annotationRef/>
-      </w:r>
-      <w:r>
-        <w:t>Too vague</w:t>
-      </w:r>
-    </w:p>
-  </w:comment>
-  <w:comment w:id="11" w:author="Tyler Noble" w:date="2020-04-07T15:06:00Z" w:initials="TN">
+  <w:comment w:id="9" w:author="Tyler Noble" w:date="2020-04-07T15:06:00Z" w:initials="TN">
     <w:p>
       <w:pPr>
         <w:pStyle w:val="CommentText"/>
@@ -1739,8 +1721,6 @@
 
 <file path=word/commentsExtended.xml><?xml version="1.0" encoding="utf-8"?>
 <w15:commentsEx xmlns:wpc="http://schemas.microsoft.com/office/word/2010/wordprocessingCanvas" xmlns:cx="http://schemas.microsoft.com/office/drawing/2014/chartex" xmlns:cx1="http://schemas.microsoft.com/office/drawing/2015/9/8/chartex" xmlns:cx2="http://schemas.microsoft.com/office/drawing/2015/10/21/chartex" xmlns:cx3="http://schemas.microsoft.com/office/drawing/2016/5/9/chartex" xmlns:cx4="http://schemas.microsoft.com/office/drawing/2016/5/10/chartex" xmlns:cx5="http://schemas.microsoft.com/office/drawing/2016/5/11/chartex" xmlns:cx6="http://schemas.microsoft.com/office/drawing/2016/5/12/chartex" xmlns:cx7="http://schemas.microsoft.com/office/drawing/2016/5/13/chartex" xmlns:cx8="http://schemas.microsoft.com/office/drawing/2016/5/14/chartex" xmlns:mc="http://schemas.openxmlformats.org/markup-compatibility/2006" xmlns:aink="http://schemas.microsoft.com/office/drawing/2016/ink" xmlns:am3d="http://schemas.microsoft.com/office/drawing/2017/model3d" xmlns:o="urn:schemas-microsoft-com:office:office" xmlns:r="http://schemas.openxmlformats.org/officeDocument/2006/relationships" xmlns:m="http://schemas.openxmlformats.org/officeDocument/2006/math" xmlns:v="urn:schemas-microsoft-com:vml" xmlns:wp14="http://schemas.microsoft.com/office/word/2010/wordprocessingDrawing" xmlns:wp="http://schemas.openxmlformats.org/drawingml/2006/wordprocessingDrawing" xmlns:w10="urn:schemas-microsoft-com:office:word" xmlns:w="http://schemas.openxmlformats.org/wordprocessingml/2006/main" xmlns:w14="http://schemas.microsoft.com/office/word/2010/wordml" xmlns:w15="http://schemas.microsoft.com/office/word/2012/wordml" xmlns:w16cid="http://schemas.microsoft.com/office/word/2016/wordml/cid" xmlns:w16se="http://schemas.microsoft.com/office/word/2015/wordml/symex" xmlns:wpg="http://schemas.microsoft.com/office/word/2010/wordprocessingGroup" xmlns:wpi="http://schemas.microsoft.com/office/word/2010/wordprocessingInk" xmlns:wne="http://schemas.microsoft.com/office/word/2006/wordml" xmlns:wps="http://schemas.microsoft.com/office/word/2010/wordprocessingShape" mc:Ignorable="w14 w15 w16se w16cid wp14">
-  <w15:commentEx w15:paraId="213E6744" w15:done="0"/>
-  <w15:commentEx w15:paraId="60306974" w15:paraIdParent="213E6744" w15:done="0"/>
   <w15:commentEx w15:paraId="09E57C21" w15:done="0"/>
   <w15:commentEx w15:paraId="102BE42E" w15:done="0"/>
   <w15:commentEx w15:paraId="196AD23E" w15:done="0"/>
@@ -1749,8 +1729,6 @@
 
 <file path=word/commentsIds.xml><?xml version="1.0" encoding="utf-8"?>
 <w16cid:commentsIds xmlns:wpc="http://schemas.microsoft.com/office/word/2010/wordprocessingCanvas" xmlns:cx="http://schemas.microsoft.com/office/drawing/2014/chartex" xmlns:cx1="http://schemas.microsoft.com/office/drawing/2015/9/8/chartex" xmlns:cx2="http://schemas.microsoft.com/office/drawing/2015/10/21/chartex" xmlns:cx3="http://schemas.microsoft.com/office/drawing/2016/5/9/chartex" xmlns:cx4="http://schemas.microsoft.com/office/drawing/2016/5/10/chartex" xmlns:cx5="http://schemas.microsoft.com/office/drawing/2016/5/11/chartex" xmlns:cx6="http://schemas.microsoft.com/office/drawing/2016/5/12/chartex" xmlns:cx7="http://schemas.microsoft.com/office/drawing/2016/5/13/chartex" xmlns:cx8="http://schemas.microsoft.com/office/drawing/2016/5/14/chartex" xmlns:mc="http://schemas.openxmlformats.org/markup-compatibility/2006" xmlns:aink="http://schemas.microsoft.com/office/drawing/2016/ink" xmlns:am3d="http://schemas.microsoft.com/office/drawing/2017/model3d" xmlns:o="urn:schemas-microsoft-com:office:office" xmlns:r="http://schemas.openxmlformats.org/officeDocument/2006/relationships" xmlns:m="http://schemas.openxmlformats.org/officeDocument/2006/math" xmlns:v="urn:schemas-microsoft-com:vml" xmlns:wp14="http://schemas.microsoft.com/office/word/2010/wordprocessingDrawing" xmlns:wp="http://schemas.openxmlformats.org/drawingml/2006/wordprocessingDrawing" xmlns:w10="urn:schemas-microsoft-com:office:word" xmlns:w="http://schemas.openxmlformats.org/wordprocessingml/2006/main" xmlns:w14="http://schemas.microsoft.com/office/word/2010/wordml" xmlns:w15="http://schemas.microsoft.com/office/word/2012/wordml" xmlns:w16cid="http://schemas.microsoft.com/office/word/2016/wordml/cid" xmlns:w16se="http://schemas.microsoft.com/office/word/2015/wordml/symex" xmlns:wpg="http://schemas.microsoft.com/office/word/2010/wordprocessingGroup" xmlns:wpi="http://schemas.microsoft.com/office/word/2010/wordprocessingInk" xmlns:wne="http://schemas.microsoft.com/office/word/2006/wordml" xmlns:wps="http://schemas.microsoft.com/office/word/2010/wordprocessingShape" mc:Ignorable="w14 w15 w16se w16cid wp14">
-  <w16cid:commentId w16cid:paraId="213E6744" w16cid:durableId="22371520"/>
-  <w16cid:commentId w16cid:paraId="60306974" w16cid:durableId="22371535"/>
   <w16cid:commentId w16cid:paraId="09E57C21" w16cid:durableId="22371552"/>
   <w16cid:commentId w16cid:paraId="102BE42E" w16cid:durableId="2237154A"/>
   <w16cid:commentId w16cid:paraId="196AD23E" w16cid:durableId="2237158F"/>
@@ -2828,6 +2806,2703 @@
 </w:styles>
 </file>
 
+<file path=word/diagrams/colors1.xml><?xml version="1.0" encoding="utf-8"?>
+<dgm:colorsDef xmlns:dgm="http://schemas.openxmlformats.org/drawingml/2006/diagram" xmlns:a="http://schemas.openxmlformats.org/drawingml/2006/main" uniqueId="urn:microsoft.com/office/officeart/2005/8/colors/accent1_2">
+  <dgm:title val=""/>
+  <dgm:desc val=""/>
+  <dgm:catLst>
+    <dgm:cat type="accent1" pri="11200"/>
+  </dgm:catLst>
+  <dgm:styleLbl name="node0">
+    <dgm:fillClrLst meth="repeat">
+      <a:schemeClr val="accent1"/>
+    </dgm:fillClrLst>
+    <dgm:linClrLst meth="repeat">
+      <a:schemeClr val="lt1"/>
+    </dgm:linClrLst>
+    <dgm:effectClrLst/>
+    <dgm:txLinClrLst/>
+    <dgm:txFillClrLst/>
+    <dgm:txEffectClrLst/>
+  </dgm:styleLbl>
+  <dgm:styleLbl name="alignNode1">
+    <dgm:fillClrLst meth="repeat">
+      <a:schemeClr val="accent1"/>
+    </dgm:fillClrLst>
+    <dgm:linClrLst meth="repeat">
+      <a:schemeClr val="accent1"/>
+    </dgm:linClrLst>
+    <dgm:effectClrLst/>
+    <dgm:txLinClrLst/>
+    <dgm:txFillClrLst/>
+    <dgm:txEffectClrLst/>
+  </dgm:styleLbl>
+  <dgm:styleLbl name="node1">
+    <dgm:fillClrLst meth="repeat">
+      <a:schemeClr val="accent1"/>
+    </dgm:fillClrLst>
+    <dgm:linClrLst meth="repeat">
+      <a:schemeClr val="lt1"/>
+    </dgm:linClrLst>
+    <dgm:effectClrLst/>
+    <dgm:txLinClrLst/>
+    <dgm:txFillClrLst/>
+    <dgm:txEffectClrLst/>
+  </dgm:styleLbl>
+  <dgm:styleLbl name="lnNode1">
+    <dgm:fillClrLst meth="repeat">
+      <a:schemeClr val="accent1"/>
+    </dgm:fillClrLst>
+    <dgm:linClrLst meth="repeat">
+      <a:schemeClr val="lt1"/>
+    </dgm:linClrLst>
+    <dgm:effectClrLst/>
+    <dgm:txLinClrLst/>
+    <dgm:txFillClrLst/>
+    <dgm:txEffectClrLst/>
+  </dgm:styleLbl>
+  <dgm:styleLbl name="vennNode1">
+    <dgm:fillClrLst meth="repeat">
+      <a:schemeClr val="accent1">
+        <a:alpha val="50000"/>
+      </a:schemeClr>
+    </dgm:fillClrLst>
+    <dgm:linClrLst meth="repeat">
+      <a:schemeClr val="lt1"/>
+    </dgm:linClrLst>
+    <dgm:effectClrLst/>
+    <dgm:txLinClrLst/>
+    <dgm:txFillClrLst/>
+    <dgm:txEffectClrLst/>
+  </dgm:styleLbl>
+  <dgm:styleLbl name="node2">
+    <dgm:fillClrLst meth="repeat">
+      <a:schemeClr val="accent1"/>
+    </dgm:fillClrLst>
+    <dgm:linClrLst meth="repeat">
+      <a:schemeClr val="lt1"/>
+    </dgm:linClrLst>
+    <dgm:effectClrLst/>
+    <dgm:txLinClrLst/>
+    <dgm:txFillClrLst/>
+    <dgm:txEffectClrLst/>
+  </dgm:styleLbl>
+  <dgm:styleLbl name="node3">
+    <dgm:fillClrLst meth="repeat">
+      <a:schemeClr val="accent1"/>
+    </dgm:fillClrLst>
+    <dgm:linClrLst meth="repeat">
+      <a:schemeClr val="lt1"/>
+    </dgm:linClrLst>
+    <dgm:effectClrLst/>
+    <dgm:txLinClrLst/>
+    <dgm:txFillClrLst/>
+    <dgm:txEffectClrLst/>
+  </dgm:styleLbl>
+  <dgm:styleLbl name="node4">
+    <dgm:fillClrLst meth="repeat">
+      <a:schemeClr val="accent1"/>
+    </dgm:fillClrLst>
+    <dgm:linClrLst meth="repeat">
+      <a:schemeClr val="lt1"/>
+    </dgm:linClrLst>
+    <dgm:effectClrLst/>
+    <dgm:txLinClrLst/>
+    <dgm:txFillClrLst/>
+    <dgm:txEffectClrLst/>
+  </dgm:styleLbl>
+  <dgm:styleLbl name="fgImgPlace1">
+    <dgm:fillClrLst meth="repeat">
+      <a:schemeClr val="accent1">
+        <a:tint val="50000"/>
+      </a:schemeClr>
+    </dgm:fillClrLst>
+    <dgm:linClrLst meth="repeat">
+      <a:schemeClr val="lt1"/>
+    </dgm:linClrLst>
+    <dgm:effectClrLst/>
+    <dgm:txLinClrLst/>
+    <dgm:txFillClrLst meth="repeat">
+      <a:schemeClr val="lt1"/>
+    </dgm:txFillClrLst>
+    <dgm:txEffectClrLst/>
+  </dgm:styleLbl>
+  <dgm:styleLbl name="alignImgPlace1">
+    <dgm:fillClrLst meth="repeat">
+      <a:schemeClr val="accent1">
+        <a:tint val="50000"/>
+      </a:schemeClr>
+    </dgm:fillClrLst>
+    <dgm:linClrLst meth="repeat">
+      <a:schemeClr val="lt1"/>
+    </dgm:linClrLst>
+    <dgm:effectClrLst/>
+    <dgm:txLinClrLst/>
+    <dgm:txFillClrLst meth="repeat">
+      <a:schemeClr val="lt1"/>
+    </dgm:txFillClrLst>
+    <dgm:txEffectClrLst/>
+  </dgm:styleLbl>
+  <dgm:styleLbl name="bgImgPlace1">
+    <dgm:fillClrLst meth="repeat">
+      <a:schemeClr val="accent1">
+        <a:tint val="50000"/>
+      </a:schemeClr>
+    </dgm:fillClrLst>
+    <dgm:linClrLst meth="repeat">
+      <a:schemeClr val="lt1"/>
+    </dgm:linClrLst>
+    <dgm:effectClrLst/>
+    <dgm:txLinClrLst/>
+    <dgm:txFillClrLst meth="repeat">
+      <a:schemeClr val="lt1"/>
+    </dgm:txFillClrLst>
+    <dgm:txEffectClrLst/>
+  </dgm:styleLbl>
+  <dgm:styleLbl name="sibTrans2D1">
+    <dgm:fillClrLst meth="repeat">
+      <a:schemeClr val="accent1">
+        <a:tint val="60000"/>
+      </a:schemeClr>
+    </dgm:fillClrLst>
+    <dgm:linClrLst meth="repeat">
+      <a:schemeClr val="accent1">
+        <a:tint val="60000"/>
+      </a:schemeClr>
+    </dgm:linClrLst>
+    <dgm:effectClrLst/>
+    <dgm:txLinClrLst/>
+    <dgm:txFillClrLst/>
+    <dgm:txEffectClrLst/>
+  </dgm:styleLbl>
+  <dgm:styleLbl name="fgSibTrans2D1">
+    <dgm:fillClrLst meth="repeat">
+      <a:schemeClr val="accent1">
+        <a:tint val="60000"/>
+      </a:schemeClr>
+    </dgm:fillClrLst>
+    <dgm:linClrLst meth="repeat">
+      <a:schemeClr val="accent1">
+        <a:tint val="60000"/>
+      </a:schemeClr>
+    </dgm:linClrLst>
+    <dgm:effectClrLst/>
+    <dgm:txLinClrLst/>
+    <dgm:txFillClrLst/>
+    <dgm:txEffectClrLst/>
+  </dgm:styleLbl>
+  <dgm:styleLbl name="bgSibTrans2D1">
+    <dgm:fillClrLst meth="repeat">
+      <a:schemeClr val="accent1">
+        <a:tint val="60000"/>
+      </a:schemeClr>
+    </dgm:fillClrLst>
+    <dgm:linClrLst meth="repeat">
+      <a:schemeClr val="accent1">
+        <a:tint val="60000"/>
+      </a:schemeClr>
+    </dgm:linClrLst>
+    <dgm:effectClrLst/>
+    <dgm:txLinClrLst/>
+    <dgm:txFillClrLst/>
+    <dgm:txEffectClrLst/>
+  </dgm:styleLbl>
+  <dgm:styleLbl name="sibTrans1D1">
+    <dgm:fillClrLst meth="repeat">
+      <a:schemeClr val="accent1"/>
+    </dgm:fillClrLst>
+    <dgm:linClrLst meth="repeat">
+      <a:schemeClr val="accent1"/>
+    </dgm:linClrLst>
+    <dgm:effectClrLst/>
+    <dgm:txLinClrLst/>
+    <dgm:txFillClrLst meth="repeat">
+      <a:schemeClr val="tx1"/>
+    </dgm:txFillClrLst>
+    <dgm:txEffectClrLst/>
+  </dgm:styleLbl>
+  <dgm:styleLbl name="callout">
+    <dgm:fillClrLst meth="repeat">
+      <a:schemeClr val="accent1"/>
+    </dgm:fillClrLst>
+    <dgm:linClrLst meth="repeat">
+      <a:schemeClr val="accent1">
+        <a:tint val="50000"/>
+      </a:schemeClr>
+    </dgm:linClrLst>
+    <dgm:effectClrLst/>
+    <dgm:txLinClrLst/>
+    <dgm:txFillClrLst meth="repeat">
+      <a:schemeClr val="tx1"/>
+    </dgm:txFillClrLst>
+    <dgm:txEffectClrLst/>
+  </dgm:styleLbl>
+  <dgm:styleLbl name="asst0">
+    <dgm:fillClrLst meth="repeat">
+      <a:schemeClr val="accent1"/>
+    </dgm:fillClrLst>
+    <dgm:linClrLst meth="repeat">
+      <a:schemeClr val="lt1"/>
+    </dgm:linClrLst>
+    <dgm:effectClrLst/>
+    <dgm:txLinClrLst/>
+    <dgm:txFillClrLst/>
+    <dgm:txEffectClrLst/>
+  </dgm:styleLbl>
+  <dgm:styleLbl name="asst1">
+    <dgm:fillClrLst meth="repeat">
+      <a:schemeClr val="accent1"/>
+    </dgm:fillClrLst>
+    <dgm:linClrLst meth="repeat">
+      <a:schemeClr val="lt1"/>
+    </dgm:linClrLst>
+    <dgm:effectClrLst/>
+    <dgm:txLinClrLst/>
+    <dgm:txFillClrLst/>
+    <dgm:txEffectClrLst/>
+  </dgm:styleLbl>
+  <dgm:styleLbl name="asst2">
+    <dgm:fillClrLst meth="repeat">
+      <a:schemeClr val="accent1"/>
+    </dgm:fillClrLst>
+    <dgm:linClrLst meth="repeat">
+      <a:schemeClr val="lt1"/>
+    </dgm:linClrLst>
+    <dgm:effectClrLst/>
+    <dgm:txLinClrLst/>
+    <dgm:txFillClrLst/>
+    <dgm:txEffectClrLst/>
+  </dgm:styleLbl>
+  <dgm:styleLbl name="asst3">
+    <dgm:fillClrLst meth="repeat">
+      <a:schemeClr val="accent1"/>
+    </dgm:fillClrLst>
+    <dgm:linClrLst meth="repeat">
+      <a:schemeClr val="lt1"/>
+    </dgm:linClrLst>
+    <dgm:effectClrLst/>
+    <dgm:txLinClrLst/>
+    <dgm:txFillClrLst/>
+    <dgm:txEffectClrLst/>
+  </dgm:styleLbl>
+  <dgm:styleLbl name="asst4">
+    <dgm:fillClrLst meth="repeat">
+      <a:schemeClr val="accent1"/>
+    </dgm:fillClrLst>
+    <dgm:linClrLst meth="repeat">
+      <a:schemeClr val="lt1"/>
+    </dgm:linClrLst>
+    <dgm:effectClrLst/>
+    <dgm:txLinClrLst/>
+    <dgm:txFillClrLst/>
+    <dgm:txEffectClrLst/>
+  </dgm:styleLbl>
+  <dgm:styleLbl name="parChTrans2D1">
+    <dgm:fillClrLst meth="repeat">
+      <a:schemeClr val="accent1">
+        <a:tint val="60000"/>
+      </a:schemeClr>
+    </dgm:fillClrLst>
+    <dgm:linClrLst meth="repeat">
+      <a:schemeClr val="accent1">
+        <a:tint val="60000"/>
+      </a:schemeClr>
+    </dgm:linClrLst>
+    <dgm:effectClrLst/>
+    <dgm:txLinClrLst/>
+    <dgm:txFillClrLst meth="repeat">
+      <a:schemeClr val="lt1"/>
+    </dgm:txFillClrLst>
+    <dgm:txEffectClrLst/>
+  </dgm:styleLbl>
+  <dgm:styleLbl name="parChTrans2D2">
+    <dgm:fillClrLst meth="repeat">
+      <a:schemeClr val="accent1"/>
+    </dgm:fillClrLst>
+    <dgm:linClrLst meth="repeat">
+      <a:schemeClr val="accent1"/>
+    </dgm:linClrLst>
+    <dgm:effectClrLst/>
+    <dgm:txLinClrLst/>
+    <dgm:txFillClrLst meth="repeat">
+      <a:schemeClr val="lt1"/>
+    </dgm:txFillClrLst>
+    <dgm:txEffectClrLst/>
+  </dgm:styleLbl>
+  <dgm:styleLbl name="parChTrans2D3">
+    <dgm:fillClrLst meth="repeat">
+      <a:schemeClr val="accent1"/>
+    </dgm:fillClrLst>
+    <dgm:linClrLst meth="repeat">
+      <a:schemeClr val="accent1"/>
+    </dgm:linClrLst>
+    <dgm:effectClrLst/>
+    <dgm:txLinClrLst/>
+    <dgm:txFillClrLst meth="repeat">
+      <a:schemeClr val="lt1"/>
+    </dgm:txFillClrLst>
+    <dgm:txEffectClrLst/>
+  </dgm:styleLbl>
+  <dgm:styleLbl name="parChTrans2D4">
+    <dgm:fillClrLst meth="repeat">
+      <a:schemeClr val="accent1"/>
+    </dgm:fillClrLst>
+    <dgm:linClrLst meth="repeat">
+      <a:schemeClr val="accent1"/>
+    </dgm:linClrLst>
+    <dgm:effectClrLst/>
+    <dgm:txLinClrLst/>
+    <dgm:txFillClrLst meth="repeat">
+      <a:schemeClr val="lt1"/>
+    </dgm:txFillClrLst>
+    <dgm:txEffectClrLst/>
+  </dgm:styleLbl>
+  <dgm:styleLbl name="parChTrans1D1">
+    <dgm:fillClrLst meth="repeat">
+      <a:schemeClr val="accent1"/>
+    </dgm:fillClrLst>
+    <dgm:linClrLst meth="repeat">
+      <a:schemeClr val="accent1">
+        <a:shade val="60000"/>
+      </a:schemeClr>
+    </dgm:linClrLst>
+    <dgm:effectClrLst/>
+    <dgm:txLinClrLst/>
+    <dgm:txFillClrLst meth="repeat">
+      <a:schemeClr val="tx1"/>
+    </dgm:txFillClrLst>
+    <dgm:txEffectClrLst/>
+  </dgm:styleLbl>
+  <dgm:styleLbl name="parChTrans1D2">
+    <dgm:fillClrLst meth="repeat">
+      <a:schemeClr val="accent1"/>
+    </dgm:fillClrLst>
+    <dgm:linClrLst meth="repeat">
+      <a:schemeClr val="accent1">
+        <a:shade val="60000"/>
+      </a:schemeClr>
+    </dgm:linClrLst>
+    <dgm:effectClrLst/>
+    <dgm:txLinClrLst/>
+    <dgm:txFillClrLst meth="repeat">
+      <a:schemeClr val="tx1"/>
+    </dgm:txFillClrLst>
+    <dgm:txEffectClrLst/>
+  </dgm:styleLbl>
+  <dgm:styleLbl name="parChTrans1D3">
+    <dgm:fillClrLst meth="repeat">
+      <a:schemeClr val="accent1"/>
+    </dgm:fillClrLst>
+    <dgm:linClrLst meth="repeat">
+      <a:schemeClr val="accent1">
+        <a:shade val="80000"/>
+      </a:schemeClr>
+    </dgm:linClrLst>
+    <dgm:effectClrLst/>
+    <dgm:txLinClrLst/>
+    <dgm:txFillClrLst meth="repeat">
+      <a:schemeClr val="tx1"/>
+    </dgm:txFillClrLst>
+    <dgm:txEffectClrLst/>
+  </dgm:styleLbl>
+  <dgm:styleLbl name="parChTrans1D4">
+    <dgm:fillClrLst meth="repeat">
+      <a:schemeClr val="accent1"/>
+    </dgm:fillClrLst>
+    <dgm:linClrLst meth="repeat">
+      <a:schemeClr val="accent1">
+        <a:shade val="80000"/>
+      </a:schemeClr>
+    </dgm:linClrLst>
+    <dgm:effectClrLst/>
+    <dgm:txLinClrLst/>
+    <dgm:txFillClrLst meth="repeat">
+      <a:schemeClr val="tx1"/>
+    </dgm:txFillClrLst>
+    <dgm:txEffectClrLst/>
+  </dgm:styleLbl>
+  <dgm:styleLbl name="fgAcc1">
+    <dgm:fillClrLst meth="repeat">
+      <a:schemeClr val="lt1">
+        <a:alpha val="90000"/>
+      </a:schemeClr>
+    </dgm:fillClrLst>
+    <dgm:linClrLst meth="repeat">
+      <a:schemeClr val="accent1"/>
+    </dgm:linClrLst>
+    <dgm:effectClrLst/>
+    <dgm:txLinClrLst/>
+    <dgm:txFillClrLst meth="repeat">
+      <a:schemeClr val="dk1"/>
+    </dgm:txFillClrLst>
+    <dgm:txEffectClrLst/>
+  </dgm:styleLbl>
+  <dgm:styleLbl name="conFgAcc1">
+    <dgm:fillClrLst meth="repeat">
+      <a:schemeClr val="lt1">
+        <a:alpha val="90000"/>
+      </a:schemeClr>
+    </dgm:fillClrLst>
+    <dgm:linClrLst meth="repeat">
+      <a:schemeClr val="accent1"/>
+    </dgm:linClrLst>
+    <dgm:effectClrLst/>
+    <dgm:txLinClrLst/>
+    <dgm:txFillClrLst meth="repeat">
+      <a:schemeClr val="dk1"/>
+    </dgm:txFillClrLst>
+    <dgm:txEffectClrLst/>
+  </dgm:styleLbl>
+  <dgm:styleLbl name="alignAcc1">
+    <dgm:fillClrLst meth="repeat">
+      <a:schemeClr val="lt1">
+        <a:alpha val="90000"/>
+      </a:schemeClr>
+    </dgm:fillClrLst>
+    <dgm:linClrLst meth="repeat">
+      <a:schemeClr val="accent1"/>
+    </dgm:linClrLst>
+    <dgm:effectClrLst/>
+    <dgm:txLinClrLst/>
+    <dgm:txFillClrLst meth="repeat">
+      <a:schemeClr val="dk1"/>
+    </dgm:txFillClrLst>
+    <dgm:txEffectClrLst/>
+  </dgm:styleLbl>
+  <dgm:styleLbl name="trAlignAcc1">
+    <dgm:fillClrLst meth="repeat">
+      <a:schemeClr val="lt1">
+        <a:alpha val="40000"/>
+      </a:schemeClr>
+    </dgm:fillClrLst>
+    <dgm:linClrLst meth="repeat">
+      <a:schemeClr val="accent1"/>
+    </dgm:linClrLst>
+    <dgm:effectClrLst/>
+    <dgm:txLinClrLst/>
+    <dgm:txFillClrLst meth="repeat">
+      <a:schemeClr val="dk1"/>
+    </dgm:txFillClrLst>
+    <dgm:txEffectClrLst/>
+  </dgm:styleLbl>
+  <dgm:styleLbl name="bgAcc1">
+    <dgm:fillClrLst meth="repeat">
+      <a:schemeClr val="lt1">
+        <a:alpha val="90000"/>
+      </a:schemeClr>
+    </dgm:fillClrLst>
+    <dgm:linClrLst meth="repeat">
+      <a:schemeClr val="accent1"/>
+    </dgm:linClrLst>
+    <dgm:effectClrLst/>
+    <dgm:txLinClrLst/>
+    <dgm:txFillClrLst meth="repeat">
+      <a:schemeClr val="dk1"/>
+    </dgm:txFillClrLst>
+    <dgm:txEffectClrLst/>
+  </dgm:styleLbl>
+  <dgm:styleLbl name="solidFgAcc1">
+    <dgm:fillClrLst meth="repeat">
+      <a:schemeClr val="lt1"/>
+    </dgm:fillClrLst>
+    <dgm:linClrLst meth="repeat">
+      <a:schemeClr val="accent1"/>
+    </dgm:linClrLst>
+    <dgm:effectClrLst/>
+    <dgm:txLinClrLst/>
+    <dgm:txFillClrLst meth="repeat">
+      <a:schemeClr val="dk1"/>
+    </dgm:txFillClrLst>
+    <dgm:txEffectClrLst/>
+  </dgm:styleLbl>
+  <dgm:styleLbl name="solidAlignAcc1">
+    <dgm:fillClrLst meth="repeat">
+      <a:schemeClr val="lt1"/>
+    </dgm:fillClrLst>
+    <dgm:linClrLst meth="repeat">
+      <a:schemeClr val="accent1"/>
+    </dgm:linClrLst>
+    <dgm:effectClrLst/>
+    <dgm:txLinClrLst/>
+    <dgm:txFillClrLst meth="repeat">
+      <a:schemeClr val="dk1"/>
+    </dgm:txFillClrLst>
+    <dgm:txEffectClrLst/>
+  </dgm:styleLbl>
+  <dgm:styleLbl name="solidBgAcc1">
+    <dgm:fillClrLst meth="repeat">
+      <a:schemeClr val="lt1"/>
+    </dgm:fillClrLst>
+    <dgm:linClrLst meth="repeat">
+      <a:schemeClr val="accent1"/>
+    </dgm:linClrLst>
+    <dgm:effectClrLst/>
+    <dgm:txLinClrLst/>
+    <dgm:txFillClrLst meth="repeat">
+      <a:schemeClr val="dk1"/>
+    </dgm:txFillClrLst>
+    <dgm:txEffectClrLst/>
+  </dgm:styleLbl>
+  <dgm:styleLbl name="fgAccFollowNode1">
+    <dgm:fillClrLst meth="repeat">
+      <a:schemeClr val="accent1">
+        <a:alpha val="90000"/>
+        <a:tint val="40000"/>
+      </a:schemeClr>
+    </dgm:fillClrLst>
+    <dgm:linClrLst meth="repeat">
+      <a:schemeClr val="accent1">
+        <a:alpha val="90000"/>
+        <a:tint val="40000"/>
+      </a:schemeClr>
+    </dgm:linClrLst>
+    <dgm:effectClrLst/>
+    <dgm:txLinClrLst/>
+    <dgm:txFillClrLst meth="repeat">
+      <a:schemeClr val="dk1"/>
+    </dgm:txFillClrLst>
+    <dgm:txEffectClrLst/>
+  </dgm:styleLbl>
+  <dgm:styleLbl name="alignAccFollowNode1">
+    <dgm:fillClrLst meth="repeat">
+      <a:schemeClr val="accent1">
+        <a:alpha val="90000"/>
+        <a:tint val="40000"/>
+      </a:schemeClr>
+    </dgm:fillClrLst>
+    <dgm:linClrLst meth="repeat">
+      <a:schemeClr val="accent1">
+        <a:alpha val="90000"/>
+        <a:tint val="40000"/>
+      </a:schemeClr>
+    </dgm:linClrLst>
+    <dgm:effectClrLst/>
+    <dgm:txLinClrLst/>
+    <dgm:txFillClrLst meth="repeat">
+      <a:schemeClr val="dk1"/>
+    </dgm:txFillClrLst>
+    <dgm:txEffectClrLst/>
+  </dgm:styleLbl>
+  <dgm:styleLbl name="bgAccFollowNode1">
+    <dgm:fillClrLst meth="repeat">
+      <a:schemeClr val="accent1">
+        <a:alpha val="90000"/>
+        <a:tint val="40000"/>
+      </a:schemeClr>
+    </dgm:fillClrLst>
+    <dgm:linClrLst meth="repeat">
+      <a:schemeClr val="accent1">
+        <a:alpha val="90000"/>
+        <a:tint val="40000"/>
+      </a:schemeClr>
+    </dgm:linClrLst>
+    <dgm:effectClrLst/>
+    <dgm:txLinClrLst/>
+    <dgm:txFillClrLst meth="repeat">
+      <a:schemeClr val="dk1"/>
+    </dgm:txFillClrLst>
+    <dgm:txEffectClrLst/>
+  </dgm:styleLbl>
+  <dgm:styleLbl name="fgAcc0">
+    <dgm:fillClrLst meth="repeat">
+      <a:schemeClr val="lt1">
+        <a:alpha val="90000"/>
+      </a:schemeClr>
+    </dgm:fillClrLst>
+    <dgm:linClrLst meth="repeat">
+      <a:schemeClr val="accent1"/>
+    </dgm:linClrLst>
+    <dgm:effectClrLst/>
+    <dgm:txLinClrLst/>
+    <dgm:txFillClrLst meth="repeat">
+      <a:schemeClr val="dk1"/>
+    </dgm:txFillClrLst>
+    <dgm:txEffectClrLst/>
+  </dgm:styleLbl>
+  <dgm:styleLbl name="fgAcc2">
+    <dgm:fillClrLst meth="repeat">
+      <a:schemeClr val="lt1">
+        <a:alpha val="90000"/>
+      </a:schemeClr>
+    </dgm:fillClrLst>
+    <dgm:linClrLst meth="repeat">
+      <a:schemeClr val="accent1"/>
+    </dgm:linClrLst>
+    <dgm:effectClrLst/>
+    <dgm:txLinClrLst/>
+    <dgm:txFillClrLst meth="repeat">
+      <a:schemeClr val="dk1"/>
+    </dgm:txFillClrLst>
+    <dgm:txEffectClrLst/>
+  </dgm:styleLbl>
+  <dgm:styleLbl name="fgAcc3">
+    <dgm:fillClrLst meth="repeat">
+      <a:schemeClr val="lt1">
+        <a:alpha val="90000"/>
+      </a:schemeClr>
+    </dgm:fillClrLst>
+    <dgm:linClrLst meth="repeat">
+      <a:schemeClr val="accent1"/>
+    </dgm:linClrLst>
+    <dgm:effectClrLst/>
+    <dgm:txLinClrLst/>
+    <dgm:txFillClrLst meth="repeat">
+      <a:schemeClr val="dk1"/>
+    </dgm:txFillClrLst>
+    <dgm:txEffectClrLst/>
+  </dgm:styleLbl>
+  <dgm:styleLbl name="fgAcc4">
+    <dgm:fillClrLst meth="repeat">
+      <a:schemeClr val="lt1">
+        <a:alpha val="90000"/>
+      </a:schemeClr>
+    </dgm:fillClrLst>
+    <dgm:linClrLst meth="repeat">
+      <a:schemeClr val="accent1"/>
+    </dgm:linClrLst>
+    <dgm:effectClrLst/>
+    <dgm:txLinClrLst/>
+    <dgm:txFillClrLst meth="repeat">
+      <a:schemeClr val="dk1"/>
+    </dgm:txFillClrLst>
+    <dgm:txEffectClrLst/>
+  </dgm:styleLbl>
+  <dgm:styleLbl name="bgShp">
+    <dgm:fillClrLst meth="repeat">
+      <a:schemeClr val="accent1">
+        <a:tint val="40000"/>
+      </a:schemeClr>
+    </dgm:fillClrLst>
+    <dgm:linClrLst meth="repeat">
+      <a:schemeClr val="accent1"/>
+    </dgm:linClrLst>
+    <dgm:effectClrLst/>
+    <dgm:txLinClrLst/>
+    <dgm:txFillClrLst meth="repeat">
+      <a:schemeClr val="dk1"/>
+    </dgm:txFillClrLst>
+    <dgm:txEffectClrLst/>
+  </dgm:styleLbl>
+  <dgm:styleLbl name="dkBgShp">
+    <dgm:fillClrLst meth="repeat">
+      <a:schemeClr val="accent1">
+        <a:shade val="80000"/>
+      </a:schemeClr>
+    </dgm:fillClrLst>
+    <dgm:linClrLst meth="repeat">
+      <a:schemeClr val="accent1"/>
+    </dgm:linClrLst>
+    <dgm:effectClrLst/>
+    <dgm:txLinClrLst/>
+    <dgm:txFillClrLst meth="repeat">
+      <a:schemeClr val="lt1"/>
+    </dgm:txFillClrLst>
+    <dgm:txEffectClrLst/>
+  </dgm:styleLbl>
+  <dgm:styleLbl name="trBgShp">
+    <dgm:fillClrLst meth="repeat">
+      <a:schemeClr val="accent1">
+        <a:tint val="50000"/>
+        <a:alpha val="40000"/>
+      </a:schemeClr>
+    </dgm:fillClrLst>
+    <dgm:linClrLst meth="repeat">
+      <a:schemeClr val="accent1"/>
+    </dgm:linClrLst>
+    <dgm:effectClrLst/>
+    <dgm:txLinClrLst/>
+    <dgm:txFillClrLst meth="repeat">
+      <a:schemeClr val="lt1"/>
+    </dgm:txFillClrLst>
+    <dgm:txEffectClrLst/>
+  </dgm:styleLbl>
+  <dgm:styleLbl name="fgShp">
+    <dgm:fillClrLst meth="repeat">
+      <a:schemeClr val="accent1">
+        <a:tint val="60000"/>
+      </a:schemeClr>
+    </dgm:fillClrLst>
+    <dgm:linClrLst meth="repeat">
+      <a:schemeClr val="lt1"/>
+    </dgm:linClrLst>
+    <dgm:effectClrLst/>
+    <dgm:txLinClrLst/>
+    <dgm:txFillClrLst meth="repeat">
+      <a:schemeClr val="dk1"/>
+    </dgm:txFillClrLst>
+    <dgm:txEffectClrLst/>
+  </dgm:styleLbl>
+  <dgm:styleLbl name="revTx">
+    <dgm:fillClrLst meth="repeat">
+      <a:schemeClr val="lt1">
+        <a:alpha val="0"/>
+      </a:schemeClr>
+    </dgm:fillClrLst>
+    <dgm:linClrLst meth="repeat">
+      <a:schemeClr val="dk1">
+        <a:alpha val="0"/>
+      </a:schemeClr>
+    </dgm:linClrLst>
+    <dgm:effectClrLst/>
+    <dgm:txLinClrLst/>
+    <dgm:txFillClrLst meth="repeat">
+      <a:schemeClr val="tx1"/>
+    </dgm:txFillClrLst>
+    <dgm:txEffectClrLst/>
+  </dgm:styleLbl>
+</dgm:colorsDef>
+</file>
+
+<file path=word/diagrams/data1.xml><?xml version="1.0" encoding="utf-8"?>
+<dgm:dataModel xmlns:dgm="http://schemas.openxmlformats.org/drawingml/2006/diagram" xmlns:a="http://schemas.openxmlformats.org/drawingml/2006/main">
+  <dgm:ptLst>
+    <dgm:pt modelId="{772F9394-418F-4FF7-A7E0-B4F7659DB99B}" type="doc">
+      <dgm:prSet loTypeId="urn:microsoft.com/office/officeart/2005/8/layout/hList1" loCatId="list" qsTypeId="urn:microsoft.com/office/officeart/2005/8/quickstyle/simple1" qsCatId="simple" csTypeId="urn:microsoft.com/office/officeart/2005/8/colors/accent1_2" csCatId="accent1" phldr="1"/>
+      <dgm:spPr/>
+      <dgm:t>
+        <a:bodyPr/>
+        <a:lstStyle/>
+        <a:p>
+          <a:endParaRPr lang="en-CA"/>
+        </a:p>
+      </dgm:t>
+    </dgm:pt>
+    <dgm:pt modelId="{1867ABEF-B44F-46A7-BE33-7EEEC0FEF875}">
+      <dgm:prSet phldrT="[Text]"/>
+      <dgm:spPr/>
+      <dgm:t>
+        <a:bodyPr/>
+        <a:lstStyle/>
+        <a:p>
+          <a:r>
+            <a:rPr lang="en-CA"/>
+            <a:t>Backend</a:t>
+          </a:r>
+        </a:p>
+      </dgm:t>
+    </dgm:pt>
+    <dgm:pt modelId="{139AB8E5-295C-4E71-976E-02BB640F7C9C}" type="parTrans" cxnId="{150C81D8-5BAA-464F-813B-09049AC3DFC3}">
+      <dgm:prSet/>
+      <dgm:spPr/>
+      <dgm:t>
+        <a:bodyPr/>
+        <a:lstStyle/>
+        <a:p>
+          <a:endParaRPr lang="en-CA"/>
+        </a:p>
+      </dgm:t>
+    </dgm:pt>
+    <dgm:pt modelId="{B9D3D07C-84CC-4469-B267-F01065BC4D65}" type="sibTrans" cxnId="{150C81D8-5BAA-464F-813B-09049AC3DFC3}">
+      <dgm:prSet/>
+      <dgm:spPr/>
+      <dgm:t>
+        <a:bodyPr/>
+        <a:lstStyle/>
+        <a:p>
+          <a:endParaRPr lang="en-CA"/>
+        </a:p>
+      </dgm:t>
+    </dgm:pt>
+    <dgm:pt modelId="{FE5C0F0E-F45E-478C-AA3A-4A093432E600}">
+      <dgm:prSet phldrT="[Text]"/>
+      <dgm:spPr/>
+      <dgm:t>
+        <a:bodyPr/>
+        <a:lstStyle/>
+        <a:p>
+          <a:r>
+            <a:rPr lang="en-CA"/>
+            <a:t>Front End</a:t>
+          </a:r>
+        </a:p>
+      </dgm:t>
+    </dgm:pt>
+    <dgm:pt modelId="{FFB6F8D0-B1D6-4283-9FD7-1270A6F508A1}" type="parTrans" cxnId="{212E49EA-B03A-4CBA-8140-BC1D320532B0}">
+      <dgm:prSet/>
+      <dgm:spPr/>
+      <dgm:t>
+        <a:bodyPr/>
+        <a:lstStyle/>
+        <a:p>
+          <a:endParaRPr lang="en-CA"/>
+        </a:p>
+      </dgm:t>
+    </dgm:pt>
+    <dgm:pt modelId="{5BC7FC54-4F24-48E3-938D-F6EA9AAB5B36}" type="sibTrans" cxnId="{212E49EA-B03A-4CBA-8140-BC1D320532B0}">
+      <dgm:prSet/>
+      <dgm:spPr/>
+      <dgm:t>
+        <a:bodyPr/>
+        <a:lstStyle/>
+        <a:p>
+          <a:endParaRPr lang="en-CA"/>
+        </a:p>
+      </dgm:t>
+    </dgm:pt>
+    <dgm:pt modelId="{C7A5D849-164D-4F14-BD75-B7273DD16450}">
+      <dgm:prSet phldrT="[Text]"/>
+      <dgm:spPr/>
+      <dgm:t>
+        <a:bodyPr/>
+        <a:lstStyle/>
+        <a:p>
+          <a:r>
+            <a:rPr lang="en-CA"/>
+            <a:t>Databases</a:t>
+          </a:r>
+        </a:p>
+      </dgm:t>
+    </dgm:pt>
+    <dgm:pt modelId="{40313AE3-D88B-4C9F-820C-D9BDF3BDF19F}" type="parTrans" cxnId="{B98C9516-AB8E-42E2-ABE0-15437DAEC3C1}">
+      <dgm:prSet/>
+      <dgm:spPr/>
+      <dgm:t>
+        <a:bodyPr/>
+        <a:lstStyle/>
+        <a:p>
+          <a:endParaRPr lang="en-CA"/>
+        </a:p>
+      </dgm:t>
+    </dgm:pt>
+    <dgm:pt modelId="{36AF7752-E2DA-48F1-B1FB-8781B197D57A}" type="sibTrans" cxnId="{B98C9516-AB8E-42E2-ABE0-15437DAEC3C1}">
+      <dgm:prSet/>
+      <dgm:spPr/>
+      <dgm:t>
+        <a:bodyPr/>
+        <a:lstStyle/>
+        <a:p>
+          <a:endParaRPr lang="en-CA"/>
+        </a:p>
+      </dgm:t>
+    </dgm:pt>
+    <dgm:pt modelId="{991003F0-124C-4695-80AB-82170FC2063D}">
+      <dgm:prSet phldrT="[Text]"/>
+      <dgm:spPr/>
+      <dgm:t>
+        <a:bodyPr/>
+        <a:lstStyle/>
+        <a:p>
+          <a:r>
+            <a:rPr lang="en-CA"/>
+            <a:t>java</a:t>
+          </a:r>
+        </a:p>
+      </dgm:t>
+    </dgm:pt>
+    <dgm:pt modelId="{F78DEDD5-628C-472B-BEA6-D2696B242CC8}" type="parTrans" cxnId="{1C19E278-77B3-4EBE-8910-E27F70250A49}">
+      <dgm:prSet/>
+      <dgm:spPr/>
+      <dgm:t>
+        <a:bodyPr/>
+        <a:lstStyle/>
+        <a:p>
+          <a:endParaRPr lang="en-CA"/>
+        </a:p>
+      </dgm:t>
+    </dgm:pt>
+    <dgm:pt modelId="{71762814-E999-4797-9704-3048308D49B2}" type="sibTrans" cxnId="{1C19E278-77B3-4EBE-8910-E27F70250A49}">
+      <dgm:prSet/>
+      <dgm:spPr/>
+      <dgm:t>
+        <a:bodyPr/>
+        <a:lstStyle/>
+        <a:p>
+          <a:endParaRPr lang="en-CA"/>
+        </a:p>
+      </dgm:t>
+    </dgm:pt>
+    <dgm:pt modelId="{0F26EB60-97B8-44E7-8F36-A76054CE4D11}" type="pres">
+      <dgm:prSet presAssocID="{772F9394-418F-4FF7-A7E0-B4F7659DB99B}" presName="Name0" presStyleCnt="0">
+        <dgm:presLayoutVars>
+          <dgm:dir/>
+          <dgm:animLvl val="lvl"/>
+          <dgm:resizeHandles val="exact"/>
+        </dgm:presLayoutVars>
+      </dgm:prSet>
+      <dgm:spPr/>
+    </dgm:pt>
+    <dgm:pt modelId="{CFF6D933-C592-45FB-BA5B-E491F045A3A1}" type="pres">
+      <dgm:prSet presAssocID="{1867ABEF-B44F-46A7-BE33-7EEEC0FEF875}" presName="composite" presStyleCnt="0"/>
+      <dgm:spPr/>
+    </dgm:pt>
+    <dgm:pt modelId="{CFE8BF02-E05E-4EAC-8D31-B07EDDDA3988}" type="pres">
+      <dgm:prSet presAssocID="{1867ABEF-B44F-46A7-BE33-7EEEC0FEF875}" presName="parTx" presStyleLbl="alignNode1" presStyleIdx="0" presStyleCnt="3">
+        <dgm:presLayoutVars>
+          <dgm:chMax val="0"/>
+          <dgm:chPref val="0"/>
+          <dgm:bulletEnabled val="1"/>
+        </dgm:presLayoutVars>
+      </dgm:prSet>
+      <dgm:spPr/>
+    </dgm:pt>
+    <dgm:pt modelId="{AE6000F0-D229-4B3A-A063-C7CFDE58678A}" type="pres">
+      <dgm:prSet presAssocID="{1867ABEF-B44F-46A7-BE33-7EEEC0FEF875}" presName="desTx" presStyleLbl="alignAccFollowNode1" presStyleIdx="0" presStyleCnt="3" custScaleX="177156" custScaleY="177156">
+        <dgm:presLayoutVars>
+          <dgm:bulletEnabled val="1"/>
+        </dgm:presLayoutVars>
+      </dgm:prSet>
+      <dgm:spPr/>
+    </dgm:pt>
+    <dgm:pt modelId="{D1B851C3-B872-4C5F-9CCE-C1F54AC0F38D}" type="pres">
+      <dgm:prSet presAssocID="{B9D3D07C-84CC-4469-B267-F01065BC4D65}" presName="space" presStyleCnt="0"/>
+      <dgm:spPr/>
+    </dgm:pt>
+    <dgm:pt modelId="{2F96F757-16AB-4E94-8D3F-26A1D1D5A3C0}" type="pres">
+      <dgm:prSet presAssocID="{FE5C0F0E-F45E-478C-AA3A-4A093432E600}" presName="composite" presStyleCnt="0"/>
+      <dgm:spPr/>
+    </dgm:pt>
+    <dgm:pt modelId="{282C9FA8-35F2-4EDE-8034-2BA06B7C3432}" type="pres">
+      <dgm:prSet presAssocID="{FE5C0F0E-F45E-478C-AA3A-4A093432E600}" presName="parTx" presStyleLbl="alignNode1" presStyleIdx="1" presStyleCnt="3">
+        <dgm:presLayoutVars>
+          <dgm:chMax val="0"/>
+          <dgm:chPref val="0"/>
+          <dgm:bulletEnabled val="1"/>
+        </dgm:presLayoutVars>
+      </dgm:prSet>
+      <dgm:spPr/>
+    </dgm:pt>
+    <dgm:pt modelId="{8F749B32-EB1B-4841-8BB0-C3AA36722AF6}" type="pres">
+      <dgm:prSet presAssocID="{FE5C0F0E-F45E-478C-AA3A-4A093432E600}" presName="desTx" presStyleLbl="alignAccFollowNode1" presStyleIdx="1" presStyleCnt="3">
+        <dgm:presLayoutVars>
+          <dgm:bulletEnabled val="1"/>
+        </dgm:presLayoutVars>
+      </dgm:prSet>
+      <dgm:spPr/>
+    </dgm:pt>
+    <dgm:pt modelId="{EA6EEB91-4722-48B7-93D4-E99A93216454}" type="pres">
+      <dgm:prSet presAssocID="{5BC7FC54-4F24-48E3-938D-F6EA9AAB5B36}" presName="space" presStyleCnt="0"/>
+      <dgm:spPr/>
+    </dgm:pt>
+    <dgm:pt modelId="{406267C1-0A6A-4F34-93D0-D50DB2A3499F}" type="pres">
+      <dgm:prSet presAssocID="{C7A5D849-164D-4F14-BD75-B7273DD16450}" presName="composite" presStyleCnt="0"/>
+      <dgm:spPr/>
+    </dgm:pt>
+    <dgm:pt modelId="{15DF7B27-0E20-4606-942C-157DF33CFCE3}" type="pres">
+      <dgm:prSet presAssocID="{C7A5D849-164D-4F14-BD75-B7273DD16450}" presName="parTx" presStyleLbl="alignNode1" presStyleIdx="2" presStyleCnt="3">
+        <dgm:presLayoutVars>
+          <dgm:chMax val="0"/>
+          <dgm:chPref val="0"/>
+          <dgm:bulletEnabled val="1"/>
+        </dgm:presLayoutVars>
+      </dgm:prSet>
+      <dgm:spPr/>
+    </dgm:pt>
+    <dgm:pt modelId="{78724E11-AE04-47BF-9F6C-FC00BFEC6076}" type="pres">
+      <dgm:prSet presAssocID="{C7A5D849-164D-4F14-BD75-B7273DD16450}" presName="desTx" presStyleLbl="alignAccFollowNode1" presStyleIdx="2" presStyleCnt="3">
+        <dgm:presLayoutVars>
+          <dgm:bulletEnabled val="1"/>
+        </dgm:presLayoutVars>
+      </dgm:prSet>
+      <dgm:spPr/>
+    </dgm:pt>
+  </dgm:ptLst>
+  <dgm:cxnLst>
+    <dgm:cxn modelId="{B98C9516-AB8E-42E2-ABE0-15437DAEC3C1}" srcId="{772F9394-418F-4FF7-A7E0-B4F7659DB99B}" destId="{C7A5D849-164D-4F14-BD75-B7273DD16450}" srcOrd="2" destOrd="0" parTransId="{40313AE3-D88B-4C9F-820C-D9BDF3BDF19F}" sibTransId="{36AF7752-E2DA-48F1-B1FB-8781B197D57A}"/>
+    <dgm:cxn modelId="{3755B76A-5F80-422D-939D-5F98097C704D}" type="presOf" srcId="{FE5C0F0E-F45E-478C-AA3A-4A093432E600}" destId="{282C9FA8-35F2-4EDE-8034-2BA06B7C3432}" srcOrd="0" destOrd="0" presId="urn:microsoft.com/office/officeart/2005/8/layout/hList1"/>
+    <dgm:cxn modelId="{1C19E278-77B3-4EBE-8910-E27F70250A49}" srcId="{1867ABEF-B44F-46A7-BE33-7EEEC0FEF875}" destId="{991003F0-124C-4695-80AB-82170FC2063D}" srcOrd="0" destOrd="0" parTransId="{F78DEDD5-628C-472B-BEA6-D2696B242CC8}" sibTransId="{71762814-E999-4797-9704-3048308D49B2}"/>
+    <dgm:cxn modelId="{7C4F9195-3AED-4E5B-845F-C657431A391E}" type="presOf" srcId="{C7A5D849-164D-4F14-BD75-B7273DD16450}" destId="{15DF7B27-0E20-4606-942C-157DF33CFCE3}" srcOrd="0" destOrd="0" presId="urn:microsoft.com/office/officeart/2005/8/layout/hList1"/>
+    <dgm:cxn modelId="{6DE5D0B0-498B-4068-AD25-1AFC9EFED5DA}" type="presOf" srcId="{772F9394-418F-4FF7-A7E0-B4F7659DB99B}" destId="{0F26EB60-97B8-44E7-8F36-A76054CE4D11}" srcOrd="0" destOrd="0" presId="urn:microsoft.com/office/officeart/2005/8/layout/hList1"/>
+    <dgm:cxn modelId="{8E0F43D7-D2C3-424B-BCD6-02DDAA0C84E8}" type="presOf" srcId="{1867ABEF-B44F-46A7-BE33-7EEEC0FEF875}" destId="{CFE8BF02-E05E-4EAC-8D31-B07EDDDA3988}" srcOrd="0" destOrd="0" presId="urn:microsoft.com/office/officeart/2005/8/layout/hList1"/>
+    <dgm:cxn modelId="{150C81D8-5BAA-464F-813B-09049AC3DFC3}" srcId="{772F9394-418F-4FF7-A7E0-B4F7659DB99B}" destId="{1867ABEF-B44F-46A7-BE33-7EEEC0FEF875}" srcOrd="0" destOrd="0" parTransId="{139AB8E5-295C-4E71-976E-02BB640F7C9C}" sibTransId="{B9D3D07C-84CC-4469-B267-F01065BC4D65}"/>
+    <dgm:cxn modelId="{212E49EA-B03A-4CBA-8140-BC1D320532B0}" srcId="{772F9394-418F-4FF7-A7E0-B4F7659DB99B}" destId="{FE5C0F0E-F45E-478C-AA3A-4A093432E600}" srcOrd="1" destOrd="0" parTransId="{FFB6F8D0-B1D6-4283-9FD7-1270A6F508A1}" sibTransId="{5BC7FC54-4F24-48E3-938D-F6EA9AAB5B36}"/>
+    <dgm:cxn modelId="{0962E3EF-E61C-4655-89C6-A229FA27EAFF}" type="presOf" srcId="{991003F0-124C-4695-80AB-82170FC2063D}" destId="{AE6000F0-D229-4B3A-A063-C7CFDE58678A}" srcOrd="0" destOrd="0" presId="urn:microsoft.com/office/officeart/2005/8/layout/hList1"/>
+    <dgm:cxn modelId="{C4EDEF90-5475-4C34-864C-3756B2D335CE}" type="presParOf" srcId="{0F26EB60-97B8-44E7-8F36-A76054CE4D11}" destId="{CFF6D933-C592-45FB-BA5B-E491F045A3A1}" srcOrd="0" destOrd="0" presId="urn:microsoft.com/office/officeart/2005/8/layout/hList1"/>
+    <dgm:cxn modelId="{07D7E3D7-0200-4C2B-8B4A-786D11D5AC84}" type="presParOf" srcId="{CFF6D933-C592-45FB-BA5B-E491F045A3A1}" destId="{CFE8BF02-E05E-4EAC-8D31-B07EDDDA3988}" srcOrd="0" destOrd="0" presId="urn:microsoft.com/office/officeart/2005/8/layout/hList1"/>
+    <dgm:cxn modelId="{9AB6B466-BC05-4C63-8E37-4114FD81B268}" type="presParOf" srcId="{CFF6D933-C592-45FB-BA5B-E491F045A3A1}" destId="{AE6000F0-D229-4B3A-A063-C7CFDE58678A}" srcOrd="1" destOrd="0" presId="urn:microsoft.com/office/officeart/2005/8/layout/hList1"/>
+    <dgm:cxn modelId="{C8654590-9640-4252-BBC9-BE6134B64C2B}" type="presParOf" srcId="{0F26EB60-97B8-44E7-8F36-A76054CE4D11}" destId="{D1B851C3-B872-4C5F-9CCE-C1F54AC0F38D}" srcOrd="1" destOrd="0" presId="urn:microsoft.com/office/officeart/2005/8/layout/hList1"/>
+    <dgm:cxn modelId="{52D7FA8F-D123-4CA5-987B-22B93D4548B8}" type="presParOf" srcId="{0F26EB60-97B8-44E7-8F36-A76054CE4D11}" destId="{2F96F757-16AB-4E94-8D3F-26A1D1D5A3C0}" srcOrd="2" destOrd="0" presId="urn:microsoft.com/office/officeart/2005/8/layout/hList1"/>
+    <dgm:cxn modelId="{A73190C0-3510-455A-9AAE-8BE60DF4B944}" type="presParOf" srcId="{2F96F757-16AB-4E94-8D3F-26A1D1D5A3C0}" destId="{282C9FA8-35F2-4EDE-8034-2BA06B7C3432}" srcOrd="0" destOrd="0" presId="urn:microsoft.com/office/officeart/2005/8/layout/hList1"/>
+    <dgm:cxn modelId="{E4DBB8F0-0F17-4C83-BFFF-D35EA9462A26}" type="presParOf" srcId="{2F96F757-16AB-4E94-8D3F-26A1D1D5A3C0}" destId="{8F749B32-EB1B-4841-8BB0-C3AA36722AF6}" srcOrd="1" destOrd="0" presId="urn:microsoft.com/office/officeart/2005/8/layout/hList1"/>
+    <dgm:cxn modelId="{067EB0BA-3006-494D-9551-0C0F94D8016F}" type="presParOf" srcId="{0F26EB60-97B8-44E7-8F36-A76054CE4D11}" destId="{EA6EEB91-4722-48B7-93D4-E99A93216454}" srcOrd="3" destOrd="0" presId="urn:microsoft.com/office/officeart/2005/8/layout/hList1"/>
+    <dgm:cxn modelId="{8F621559-D73F-4FDE-BB20-905C003CABD0}" type="presParOf" srcId="{0F26EB60-97B8-44E7-8F36-A76054CE4D11}" destId="{406267C1-0A6A-4F34-93D0-D50DB2A3499F}" srcOrd="4" destOrd="0" presId="urn:microsoft.com/office/officeart/2005/8/layout/hList1"/>
+    <dgm:cxn modelId="{24666A5C-6FFA-41DA-8E09-1F89A8671E91}" type="presParOf" srcId="{406267C1-0A6A-4F34-93D0-D50DB2A3499F}" destId="{15DF7B27-0E20-4606-942C-157DF33CFCE3}" srcOrd="0" destOrd="0" presId="urn:microsoft.com/office/officeart/2005/8/layout/hList1"/>
+    <dgm:cxn modelId="{24260BF5-B55F-4209-B7A5-D7D205B8DBC6}" type="presParOf" srcId="{406267C1-0A6A-4F34-93D0-D50DB2A3499F}" destId="{78724E11-AE04-47BF-9F6C-FC00BFEC6076}" srcOrd="1" destOrd="0" presId="urn:microsoft.com/office/officeart/2005/8/layout/hList1"/>
+  </dgm:cxnLst>
+  <dgm:bg/>
+  <dgm:whole/>
+  <dgm:extLst>
+    <a:ext uri="http://schemas.microsoft.com/office/drawing/2008/diagram">
+      <dsp:dataModelExt xmlns:dsp="http://schemas.microsoft.com/office/drawing/2008/diagram" relId="rId14" minVer="http://schemas.openxmlformats.org/drawingml/2006/diagram"/>
+    </a:ext>
+  </dgm:extLst>
+</dgm:dataModel>
+</file>
+
+<file path=word/diagrams/drawing1.xml><?xml version="1.0" encoding="utf-8"?>
+<dsp:drawing xmlns:dgm="http://schemas.openxmlformats.org/drawingml/2006/diagram" xmlns:dsp="http://schemas.microsoft.com/office/drawing/2008/diagram" xmlns:a="http://schemas.openxmlformats.org/drawingml/2006/main">
+  <dsp:spTree>
+    <dsp:nvGrpSpPr>
+      <dsp:cNvPr id="0" name=""/>
+      <dsp:cNvGrpSpPr/>
+    </dsp:nvGrpSpPr>
+    <dsp:grpSpPr/>
+    <dsp:sp modelId="{CFE8BF02-E05E-4EAC-8D31-B07EDDDA3988}">
+      <dsp:nvSpPr>
+        <dsp:cNvPr id="0" name=""/>
+        <dsp:cNvSpPr/>
+      </dsp:nvSpPr>
+      <dsp:spPr>
+        <a:xfrm>
+          <a:off x="655666" y="-175094"/>
+          <a:ext cx="1677676" cy="447675"/>
+        </a:xfrm>
+        <a:prstGeom prst="rect">
+          <a:avLst/>
+        </a:prstGeom>
+        <a:solidFill>
+          <a:schemeClr val="accent1">
+            <a:hueOff val="0"/>
+            <a:satOff val="0"/>
+            <a:lumOff val="0"/>
+            <a:alphaOff val="0"/>
+          </a:schemeClr>
+        </a:solidFill>
+        <a:ln w="25400" cap="flat" cmpd="sng" algn="ctr">
+          <a:solidFill>
+            <a:schemeClr val="accent1">
+              <a:hueOff val="0"/>
+              <a:satOff val="0"/>
+              <a:lumOff val="0"/>
+              <a:alphaOff val="0"/>
+            </a:schemeClr>
+          </a:solidFill>
+          <a:prstDash val="solid"/>
+        </a:ln>
+        <a:effectLst/>
+      </dsp:spPr>
+      <dsp:style>
+        <a:lnRef idx="2">
+          <a:scrgbClr r="0" g="0" b="0"/>
+        </a:lnRef>
+        <a:fillRef idx="1">
+          <a:scrgbClr r="0" g="0" b="0"/>
+        </a:fillRef>
+        <a:effectRef idx="0">
+          <a:scrgbClr r="0" g="0" b="0"/>
+        </a:effectRef>
+        <a:fontRef idx="minor">
+          <a:schemeClr val="lt1"/>
+        </a:fontRef>
+      </dsp:style>
+      <dsp:txBody>
+        <a:bodyPr spcFirstLastPara="0" vert="horz" wrap="square" lIns="35560" tIns="20320" rIns="35560" bIns="20320" numCol="1" spcCol="1270" anchor="ctr" anchorCtr="0">
+          <a:noAutofit/>
+        </a:bodyPr>
+        <a:lstStyle/>
+        <a:p>
+          <a:pPr marL="0" lvl="0" indent="0" algn="ctr" defTabSz="222250">
+            <a:lnSpc>
+              <a:spcPct val="90000"/>
+            </a:lnSpc>
+            <a:spcBef>
+              <a:spcPct val="0"/>
+            </a:spcBef>
+            <a:spcAft>
+              <a:spcPct val="35000"/>
+            </a:spcAft>
+            <a:buNone/>
+          </a:pPr>
+          <a:r>
+            <a:rPr lang="en-CA" sz="500" kern="1200"/>
+            <a:t>Backend</a:t>
+          </a:r>
+        </a:p>
+      </dsp:txBody>
+      <dsp:txXfrm>
+        <a:off x="655666" y="-175094"/>
+        <a:ext cx="1677676" cy="447675"/>
+      </dsp:txXfrm>
+    </dsp:sp>
+    <dsp:sp modelId="{AE6000F0-D229-4B3A-A063-C7CFDE58678A}">
+      <dsp:nvSpPr>
+        <dsp:cNvPr id="0" name=""/>
+        <dsp:cNvSpPr/>
+      </dsp:nvSpPr>
+      <dsp:spPr>
+        <a:xfrm>
+          <a:off x="8452" y="175094"/>
+          <a:ext cx="2972103" cy="447675"/>
+        </a:xfrm>
+        <a:prstGeom prst="rect">
+          <a:avLst/>
+        </a:prstGeom>
+        <a:solidFill>
+          <a:schemeClr val="accent1">
+            <a:alpha val="90000"/>
+            <a:tint val="40000"/>
+            <a:hueOff val="0"/>
+            <a:satOff val="0"/>
+            <a:lumOff val="0"/>
+            <a:alphaOff val="0"/>
+          </a:schemeClr>
+        </a:solidFill>
+        <a:ln w="25400" cap="flat" cmpd="sng" algn="ctr">
+          <a:solidFill>
+            <a:schemeClr val="accent1">
+              <a:alpha val="90000"/>
+              <a:tint val="40000"/>
+              <a:hueOff val="0"/>
+              <a:satOff val="0"/>
+              <a:lumOff val="0"/>
+              <a:alphaOff val="0"/>
+            </a:schemeClr>
+          </a:solidFill>
+          <a:prstDash val="solid"/>
+        </a:ln>
+        <a:effectLst/>
+      </dsp:spPr>
+      <dsp:style>
+        <a:lnRef idx="2">
+          <a:scrgbClr r="0" g="0" b="0"/>
+        </a:lnRef>
+        <a:fillRef idx="1">
+          <a:scrgbClr r="0" g="0" b="0"/>
+        </a:fillRef>
+        <a:effectRef idx="0">
+          <a:scrgbClr r="0" g="0" b="0"/>
+        </a:effectRef>
+        <a:fontRef idx="minor"/>
+      </dsp:style>
+      <dsp:txBody>
+        <a:bodyPr spcFirstLastPara="0" vert="horz" wrap="square" lIns="26670" tIns="26670" rIns="35560" bIns="40005" numCol="1" spcCol="1270" anchor="t" anchorCtr="0">
+          <a:noAutofit/>
+        </a:bodyPr>
+        <a:lstStyle/>
+        <a:p>
+          <a:pPr marL="57150" lvl="1" indent="-57150" algn="l" defTabSz="222250">
+            <a:lnSpc>
+              <a:spcPct val="90000"/>
+            </a:lnSpc>
+            <a:spcBef>
+              <a:spcPct val="0"/>
+            </a:spcBef>
+            <a:spcAft>
+              <a:spcPct val="15000"/>
+            </a:spcAft>
+            <a:buChar char="•"/>
+          </a:pPr>
+          <a:r>
+            <a:rPr lang="en-CA" sz="500" kern="1200"/>
+            <a:t>java</a:t>
+          </a:r>
+        </a:p>
+      </dsp:txBody>
+      <dsp:txXfrm>
+        <a:off x="8452" y="175094"/>
+        <a:ext cx="2972103" cy="447675"/>
+      </dsp:txXfrm>
+    </dsp:sp>
+    <dsp:sp modelId="{282C9FA8-35F2-4EDE-8034-2BA06B7C3432}">
+      <dsp:nvSpPr>
+        <dsp:cNvPr id="0" name=""/>
+        <dsp:cNvSpPr/>
+      </dsp:nvSpPr>
+      <dsp:spPr>
+        <a:xfrm>
+          <a:off x="3215201" y="0"/>
+          <a:ext cx="1676037" cy="447675"/>
+        </a:xfrm>
+        <a:prstGeom prst="rect">
+          <a:avLst/>
+        </a:prstGeom>
+        <a:solidFill>
+          <a:schemeClr val="accent1">
+            <a:hueOff val="0"/>
+            <a:satOff val="0"/>
+            <a:lumOff val="0"/>
+            <a:alphaOff val="0"/>
+          </a:schemeClr>
+        </a:solidFill>
+        <a:ln w="25400" cap="flat" cmpd="sng" algn="ctr">
+          <a:solidFill>
+            <a:schemeClr val="accent1">
+              <a:hueOff val="0"/>
+              <a:satOff val="0"/>
+              <a:lumOff val="0"/>
+              <a:alphaOff val="0"/>
+            </a:schemeClr>
+          </a:solidFill>
+          <a:prstDash val="solid"/>
+        </a:ln>
+        <a:effectLst/>
+      </dsp:spPr>
+      <dsp:style>
+        <a:lnRef idx="2">
+          <a:scrgbClr r="0" g="0" b="0"/>
+        </a:lnRef>
+        <a:fillRef idx="1">
+          <a:scrgbClr r="0" g="0" b="0"/>
+        </a:fillRef>
+        <a:effectRef idx="0">
+          <a:scrgbClr r="0" g="0" b="0"/>
+        </a:effectRef>
+        <a:fontRef idx="minor">
+          <a:schemeClr val="lt1"/>
+        </a:fontRef>
+      </dsp:style>
+      <dsp:txBody>
+        <a:bodyPr spcFirstLastPara="0" vert="horz" wrap="square" lIns="35560" tIns="20320" rIns="35560" bIns="20320" numCol="1" spcCol="1270" anchor="ctr" anchorCtr="0">
+          <a:noAutofit/>
+        </a:bodyPr>
+        <a:lstStyle/>
+        <a:p>
+          <a:pPr marL="0" lvl="0" indent="0" algn="ctr" defTabSz="222250">
+            <a:lnSpc>
+              <a:spcPct val="90000"/>
+            </a:lnSpc>
+            <a:spcBef>
+              <a:spcPct val="0"/>
+            </a:spcBef>
+            <a:spcAft>
+              <a:spcPct val="35000"/>
+            </a:spcAft>
+            <a:buNone/>
+          </a:pPr>
+          <a:r>
+            <a:rPr lang="en-CA" sz="500" kern="1200"/>
+            <a:t>Front End</a:t>
+          </a:r>
+        </a:p>
+      </dsp:txBody>
+      <dsp:txXfrm>
+        <a:off x="3215201" y="0"/>
+        <a:ext cx="1676037" cy="447675"/>
+      </dsp:txXfrm>
+    </dsp:sp>
+    <dsp:sp modelId="{8F749B32-EB1B-4841-8BB0-C3AA36722AF6}">
+      <dsp:nvSpPr>
+        <dsp:cNvPr id="0" name=""/>
+        <dsp:cNvSpPr/>
+      </dsp:nvSpPr>
+      <dsp:spPr>
+        <a:xfrm>
+          <a:off x="3215201" y="447675"/>
+          <a:ext cx="1676037" cy="0"/>
+        </a:xfrm>
+        <a:prstGeom prst="rect">
+          <a:avLst/>
+        </a:prstGeom>
+        <a:solidFill>
+          <a:schemeClr val="accent1">
+            <a:alpha val="90000"/>
+            <a:tint val="40000"/>
+            <a:hueOff val="0"/>
+            <a:satOff val="0"/>
+            <a:lumOff val="0"/>
+            <a:alphaOff val="0"/>
+          </a:schemeClr>
+        </a:solidFill>
+        <a:ln w="25400" cap="flat" cmpd="sng" algn="ctr">
+          <a:solidFill>
+            <a:schemeClr val="accent1">
+              <a:alpha val="90000"/>
+              <a:tint val="40000"/>
+              <a:hueOff val="0"/>
+              <a:satOff val="0"/>
+              <a:lumOff val="0"/>
+              <a:alphaOff val="0"/>
+            </a:schemeClr>
+          </a:solidFill>
+          <a:prstDash val="solid"/>
+        </a:ln>
+        <a:effectLst/>
+      </dsp:spPr>
+      <dsp:style>
+        <a:lnRef idx="2">
+          <a:scrgbClr r="0" g="0" b="0"/>
+        </a:lnRef>
+        <a:fillRef idx="1">
+          <a:scrgbClr r="0" g="0" b="0"/>
+        </a:fillRef>
+        <a:effectRef idx="0">
+          <a:scrgbClr r="0" g="0" b="0"/>
+        </a:effectRef>
+        <a:fontRef idx="minor"/>
+      </dsp:style>
+    </dsp:sp>
+    <dsp:sp modelId="{15DF7B27-0E20-4606-942C-157DF33CFCE3}">
+      <dsp:nvSpPr>
+        <dsp:cNvPr id="0" name=""/>
+        <dsp:cNvSpPr/>
+      </dsp:nvSpPr>
+      <dsp:spPr>
+        <a:xfrm>
+          <a:off x="5125884" y="0"/>
+          <a:ext cx="1676037" cy="447675"/>
+        </a:xfrm>
+        <a:prstGeom prst="rect">
+          <a:avLst/>
+        </a:prstGeom>
+        <a:solidFill>
+          <a:schemeClr val="accent1">
+            <a:hueOff val="0"/>
+            <a:satOff val="0"/>
+            <a:lumOff val="0"/>
+            <a:alphaOff val="0"/>
+          </a:schemeClr>
+        </a:solidFill>
+        <a:ln w="25400" cap="flat" cmpd="sng" algn="ctr">
+          <a:solidFill>
+            <a:schemeClr val="accent1">
+              <a:hueOff val="0"/>
+              <a:satOff val="0"/>
+              <a:lumOff val="0"/>
+              <a:alphaOff val="0"/>
+            </a:schemeClr>
+          </a:solidFill>
+          <a:prstDash val="solid"/>
+        </a:ln>
+        <a:effectLst/>
+      </dsp:spPr>
+      <dsp:style>
+        <a:lnRef idx="2">
+          <a:scrgbClr r="0" g="0" b="0"/>
+        </a:lnRef>
+        <a:fillRef idx="1">
+          <a:scrgbClr r="0" g="0" b="0"/>
+        </a:fillRef>
+        <a:effectRef idx="0">
+          <a:scrgbClr r="0" g="0" b="0"/>
+        </a:effectRef>
+        <a:fontRef idx="minor">
+          <a:schemeClr val="lt1"/>
+        </a:fontRef>
+      </dsp:style>
+      <dsp:txBody>
+        <a:bodyPr spcFirstLastPara="0" vert="horz" wrap="square" lIns="35560" tIns="20320" rIns="35560" bIns="20320" numCol="1" spcCol="1270" anchor="ctr" anchorCtr="0">
+          <a:noAutofit/>
+        </a:bodyPr>
+        <a:lstStyle/>
+        <a:p>
+          <a:pPr marL="0" lvl="0" indent="0" algn="ctr" defTabSz="222250">
+            <a:lnSpc>
+              <a:spcPct val="90000"/>
+            </a:lnSpc>
+            <a:spcBef>
+              <a:spcPct val="0"/>
+            </a:spcBef>
+            <a:spcAft>
+              <a:spcPct val="35000"/>
+            </a:spcAft>
+            <a:buNone/>
+          </a:pPr>
+          <a:r>
+            <a:rPr lang="en-CA" sz="500" kern="1200"/>
+            <a:t>Databases</a:t>
+          </a:r>
+        </a:p>
+      </dsp:txBody>
+      <dsp:txXfrm>
+        <a:off x="5125884" y="0"/>
+        <a:ext cx="1676037" cy="447675"/>
+      </dsp:txXfrm>
+    </dsp:sp>
+    <dsp:sp modelId="{78724E11-AE04-47BF-9F6C-FC00BFEC6076}">
+      <dsp:nvSpPr>
+        <dsp:cNvPr id="0" name=""/>
+        <dsp:cNvSpPr/>
+      </dsp:nvSpPr>
+      <dsp:spPr>
+        <a:xfrm>
+          <a:off x="5125884" y="447675"/>
+          <a:ext cx="1676037" cy="0"/>
+        </a:xfrm>
+        <a:prstGeom prst="rect">
+          <a:avLst/>
+        </a:prstGeom>
+        <a:solidFill>
+          <a:schemeClr val="accent1">
+            <a:alpha val="90000"/>
+            <a:tint val="40000"/>
+            <a:hueOff val="0"/>
+            <a:satOff val="0"/>
+            <a:lumOff val="0"/>
+            <a:alphaOff val="0"/>
+          </a:schemeClr>
+        </a:solidFill>
+        <a:ln w="25400" cap="flat" cmpd="sng" algn="ctr">
+          <a:solidFill>
+            <a:schemeClr val="accent1">
+              <a:alpha val="90000"/>
+              <a:tint val="40000"/>
+              <a:hueOff val="0"/>
+              <a:satOff val="0"/>
+              <a:lumOff val="0"/>
+              <a:alphaOff val="0"/>
+            </a:schemeClr>
+          </a:solidFill>
+          <a:prstDash val="solid"/>
+        </a:ln>
+        <a:effectLst/>
+      </dsp:spPr>
+      <dsp:style>
+        <a:lnRef idx="2">
+          <a:scrgbClr r="0" g="0" b="0"/>
+        </a:lnRef>
+        <a:fillRef idx="1">
+          <a:scrgbClr r="0" g="0" b="0"/>
+        </a:fillRef>
+        <a:effectRef idx="0">
+          <a:scrgbClr r="0" g="0" b="0"/>
+        </a:effectRef>
+        <a:fontRef idx="minor"/>
+      </dsp:style>
+    </dsp:sp>
+  </dsp:spTree>
+</dsp:drawing>
+</file>
+
+<file path=word/diagrams/layout1.xml><?xml version="1.0" encoding="utf-8"?>
+<dgm:layoutDef xmlns:dgm="http://schemas.openxmlformats.org/drawingml/2006/diagram" xmlns:a="http://schemas.openxmlformats.org/drawingml/2006/main" uniqueId="urn:microsoft.com/office/officeart/2005/8/layout/hList1">
+  <dgm:title val=""/>
+  <dgm:desc val=""/>
+  <dgm:catLst>
+    <dgm:cat type="list" pri="5000"/>
+    <dgm:cat type="convert" pri="5000"/>
+  </dgm:catLst>
+  <dgm:sampData>
+    <dgm:dataModel>
+      <dgm:ptLst>
+        <dgm:pt modelId="0" type="doc"/>
+        <dgm:pt modelId="1">
+          <dgm:prSet phldr="1"/>
+        </dgm:pt>
+        <dgm:pt modelId="11">
+          <dgm:prSet phldr="1"/>
+        </dgm:pt>
+        <dgm:pt modelId="12">
+          <dgm:prSet phldr="1"/>
+        </dgm:pt>
+        <dgm:pt modelId="2">
+          <dgm:prSet phldr="1"/>
+        </dgm:pt>
+        <dgm:pt modelId="21">
+          <dgm:prSet phldr="1"/>
+        </dgm:pt>
+        <dgm:pt modelId="22">
+          <dgm:prSet phldr="1"/>
+        </dgm:pt>
+        <dgm:pt modelId="3">
+          <dgm:prSet phldr="1"/>
+        </dgm:pt>
+        <dgm:pt modelId="31">
+          <dgm:prSet phldr="1"/>
+        </dgm:pt>
+        <dgm:pt modelId="32">
+          <dgm:prSet phldr="1"/>
+        </dgm:pt>
+      </dgm:ptLst>
+      <dgm:cxnLst>
+        <dgm:cxn modelId="4" srcId="0" destId="1" srcOrd="0" destOrd="0"/>
+        <dgm:cxn modelId="5" srcId="0" destId="2" srcOrd="1" destOrd="0"/>
+        <dgm:cxn modelId="6" srcId="0" destId="3" srcOrd="2" destOrd="0"/>
+        <dgm:cxn modelId="13" srcId="1" destId="11" srcOrd="0" destOrd="0"/>
+        <dgm:cxn modelId="14" srcId="1" destId="12" srcOrd="1" destOrd="0"/>
+        <dgm:cxn modelId="23" srcId="2" destId="21" srcOrd="0" destOrd="0"/>
+        <dgm:cxn modelId="24" srcId="2" destId="22" srcOrd="1" destOrd="0"/>
+        <dgm:cxn modelId="33" srcId="3" destId="31" srcOrd="0" destOrd="0"/>
+        <dgm:cxn modelId="34" srcId="3" destId="32" srcOrd="1" destOrd="0"/>
+      </dgm:cxnLst>
+      <dgm:bg/>
+      <dgm:whole/>
+    </dgm:dataModel>
+  </dgm:sampData>
+  <dgm:styleData>
+    <dgm:dataModel>
+      <dgm:ptLst>
+        <dgm:pt modelId="0" type="doc"/>
+        <dgm:pt modelId="1">
+          <dgm:prSet phldr="1"/>
+        </dgm:pt>
+        <dgm:pt modelId="2">
+          <dgm:prSet phldr="1"/>
+        </dgm:pt>
+      </dgm:ptLst>
+      <dgm:cxnLst>
+        <dgm:cxn modelId="3" srcId="0" destId="1" srcOrd="0" destOrd="0"/>
+        <dgm:cxn modelId="4" srcId="0" destId="2" srcOrd="1" destOrd="0"/>
+      </dgm:cxnLst>
+      <dgm:bg/>
+      <dgm:whole/>
+    </dgm:dataModel>
+  </dgm:styleData>
+  <dgm:clrData>
+    <dgm:dataModel>
+      <dgm:ptLst>
+        <dgm:pt modelId="0" type="doc"/>
+        <dgm:pt modelId="1">
+          <dgm:prSet phldr="1"/>
+        </dgm:pt>
+        <dgm:pt modelId="2">
+          <dgm:prSet phldr="1"/>
+        </dgm:pt>
+        <dgm:pt modelId="3">
+          <dgm:prSet phldr="1"/>
+        </dgm:pt>
+        <dgm:pt modelId="4">
+          <dgm:prSet phldr="1"/>
+        </dgm:pt>
+      </dgm:ptLst>
+      <dgm:cxnLst>
+        <dgm:cxn modelId="5" srcId="0" destId="1" srcOrd="0" destOrd="0"/>
+        <dgm:cxn modelId="6" srcId="0" destId="2" srcOrd="1" destOrd="0"/>
+        <dgm:cxn modelId="7" srcId="0" destId="3" srcOrd="2" destOrd="0"/>
+        <dgm:cxn modelId="8" srcId="0" destId="4" srcOrd="3" destOrd="0"/>
+      </dgm:cxnLst>
+      <dgm:bg/>
+      <dgm:whole/>
+    </dgm:dataModel>
+  </dgm:clrData>
+  <dgm:layoutNode name="Name0">
+    <dgm:varLst>
+      <dgm:dir/>
+      <dgm:animLvl val="lvl"/>
+      <dgm:resizeHandles val="exact"/>
+    </dgm:varLst>
+    <dgm:choose name="Name1">
+      <dgm:if name="Name2" func="var" arg="dir" op="equ" val="norm">
+        <dgm:alg type="lin"/>
+      </dgm:if>
+      <dgm:else name="Name3">
+        <dgm:alg type="lin">
+          <dgm:param type="linDir" val="fromR"/>
+        </dgm:alg>
+      </dgm:else>
+    </dgm:choose>
+    <dgm:shape xmlns:r="http://schemas.openxmlformats.org/officeDocument/2006/relationships" r:blip="">
+      <dgm:adjLst/>
+    </dgm:shape>
+    <dgm:presOf/>
+    <dgm:constrLst>
+      <dgm:constr type="h" for="ch" forName="composite" refType="h"/>
+      <dgm:constr type="w" for="ch" forName="composite" refType="w"/>
+      <dgm:constr type="w" for="des" forName="parTx"/>
+      <dgm:constr type="h" for="des" forName="parTx" op="equ"/>
+      <dgm:constr type="w" for="des" forName="desTx"/>
+      <dgm:constr type="h" for="des" forName="desTx" op="equ"/>
+      <dgm:constr type="primFontSz" for="des" forName="parTx" val="65"/>
+      <dgm:constr type="secFontSz" for="des" forName="desTx" refType="primFontSz" refFor="des" refForName="parTx" op="equ"/>
+      <dgm:constr type="h" for="des" forName="parTx" refType="primFontSz" refFor="des" refForName="parTx" fact="0.8"/>
+      <dgm:constr type="h" for="des" forName="desTx" refType="primFontSz" refFor="des" refForName="parTx" fact="1.22"/>
+      <dgm:constr type="w" for="ch" forName="space" refType="w" refFor="ch" refForName="composite" op="equ" fact="0.14"/>
+    </dgm:constrLst>
+    <dgm:ruleLst>
+      <dgm:rule type="w" for="ch" forName="composite" val="0" fact="NaN" max="NaN"/>
+      <dgm:rule type="primFontSz" for="des" forName="parTx" val="5" fact="NaN" max="NaN"/>
+    </dgm:ruleLst>
+    <dgm:forEach name="Name4" axis="ch" ptType="node">
+      <dgm:layoutNode name="composite">
+        <dgm:alg type="composite"/>
+        <dgm:shape xmlns:r="http://schemas.openxmlformats.org/officeDocument/2006/relationships" r:blip="">
+          <dgm:adjLst/>
+        </dgm:shape>
+        <dgm:presOf/>
+        <dgm:constrLst>
+          <dgm:constr type="l" for="ch" forName="parTx"/>
+          <dgm:constr type="w" for="ch" forName="parTx" refType="w"/>
+          <dgm:constr type="t" for="ch" forName="parTx"/>
+          <dgm:constr type="l" for="ch" forName="desTx"/>
+          <dgm:constr type="w" for="ch" forName="desTx" refType="w" refFor="ch" refForName="parTx"/>
+          <dgm:constr type="t" for="ch" forName="desTx" refType="h" refFor="ch" refForName="parTx"/>
+        </dgm:constrLst>
+        <dgm:ruleLst>
+          <dgm:rule type="h" val="INF" fact="NaN" max="NaN"/>
+        </dgm:ruleLst>
+        <dgm:layoutNode name="parTx" styleLbl="alignNode1">
+          <dgm:varLst>
+            <dgm:chMax val="0"/>
+            <dgm:chPref val="0"/>
+            <dgm:bulletEnabled val="1"/>
+          </dgm:varLst>
+          <dgm:alg type="tx"/>
+          <dgm:shape xmlns:r="http://schemas.openxmlformats.org/officeDocument/2006/relationships" type="rect" r:blip="">
+            <dgm:adjLst/>
+          </dgm:shape>
+          <dgm:presOf axis="self" ptType="node"/>
+          <dgm:constrLst>
+            <dgm:constr type="h" refType="w" op="lte" fact="0.4"/>
+            <dgm:constr type="h"/>
+            <dgm:constr type="tMarg" refType="primFontSz" fact="0.32"/>
+            <dgm:constr type="bMarg" refType="primFontSz" fact="0.32"/>
+          </dgm:constrLst>
+          <dgm:ruleLst>
+            <dgm:rule type="h" val="INF" fact="NaN" max="NaN"/>
+          </dgm:ruleLst>
+        </dgm:layoutNode>
+        <dgm:layoutNode name="desTx" styleLbl="alignAccFollowNode1">
+          <dgm:varLst>
+            <dgm:bulletEnabled val="1"/>
+          </dgm:varLst>
+          <dgm:alg type="tx">
+            <dgm:param type="stBulletLvl" val="1"/>
+          </dgm:alg>
+          <dgm:shape xmlns:r="http://schemas.openxmlformats.org/officeDocument/2006/relationships" type="rect" r:blip="">
+            <dgm:adjLst/>
+          </dgm:shape>
+          <dgm:presOf axis="des" ptType="node"/>
+          <dgm:constrLst>
+            <dgm:constr type="secFontSz" val="65"/>
+            <dgm:constr type="primFontSz" refType="secFontSz"/>
+            <dgm:constr type="h"/>
+            <dgm:constr type="lMarg" refType="primFontSz" fact="0.42"/>
+            <dgm:constr type="tMarg" refType="primFontSz" fact="0.42"/>
+            <dgm:constr type="bMarg" refType="primFontSz" fact="0.63"/>
+          </dgm:constrLst>
+          <dgm:ruleLst>
+            <dgm:rule type="h" val="INF" fact="NaN" max="NaN"/>
+          </dgm:ruleLst>
+        </dgm:layoutNode>
+      </dgm:layoutNode>
+      <dgm:forEach name="Name5" axis="followSib" ptType="sibTrans" cnt="1">
+        <dgm:layoutNode name="space">
+          <dgm:alg type="sp"/>
+          <dgm:shape xmlns:r="http://schemas.openxmlformats.org/officeDocument/2006/relationships" r:blip="">
+            <dgm:adjLst/>
+          </dgm:shape>
+          <dgm:presOf/>
+          <dgm:constrLst/>
+          <dgm:ruleLst/>
+        </dgm:layoutNode>
+      </dgm:forEach>
+    </dgm:forEach>
+  </dgm:layoutNode>
+</dgm:layoutDef>
+</file>
+
+<file path=word/diagrams/quickStyle1.xml><?xml version="1.0" encoding="utf-8"?>
+<dgm:styleDef xmlns:dgm="http://schemas.openxmlformats.org/drawingml/2006/diagram" xmlns:a="http://schemas.openxmlformats.org/drawingml/2006/main" uniqueId="urn:microsoft.com/office/officeart/2005/8/quickstyle/simple1">
+  <dgm:title val=""/>
+  <dgm:desc val=""/>
+  <dgm:catLst>
+    <dgm:cat type="simple" pri="10100"/>
+  </dgm:catLst>
+  <dgm:scene3d>
+    <a:camera prst="orthographicFront"/>
+    <a:lightRig rig="threePt" dir="t"/>
+  </dgm:scene3d>
+  <dgm:styleLbl name="node0">
+    <dgm:scene3d>
+      <a:camera prst="orthographicFront"/>
+      <a:lightRig rig="threePt" dir="t"/>
+    </dgm:scene3d>
+    <dgm:sp3d/>
+    <dgm:txPr/>
+    <dgm:style>
+      <a:lnRef idx="2">
+        <a:scrgbClr r="0" g="0" b="0"/>
+      </a:lnRef>
+      <a:fillRef idx="1">
+        <a:scrgbClr r="0" g="0" b="0"/>
+      </a:fillRef>
+      <a:effectRef idx="0">
+        <a:scrgbClr r="0" g="0" b="0"/>
+      </a:effectRef>
+      <a:fontRef idx="minor">
+        <a:schemeClr val="lt1"/>
+      </a:fontRef>
+    </dgm:style>
+  </dgm:styleLbl>
+  <dgm:styleLbl name="lnNode1">
+    <dgm:scene3d>
+      <a:camera prst="orthographicFront"/>
+      <a:lightRig rig="threePt" dir="t"/>
+    </dgm:scene3d>
+    <dgm:sp3d/>
+    <dgm:txPr/>
+    <dgm:style>
+      <a:lnRef idx="2">
+        <a:scrgbClr r="0" g="0" b="0"/>
+      </a:lnRef>
+      <a:fillRef idx="1">
+        <a:scrgbClr r="0" g="0" b="0"/>
+      </a:fillRef>
+      <a:effectRef idx="0">
+        <a:scrgbClr r="0" g="0" b="0"/>
+      </a:effectRef>
+      <a:fontRef idx="minor">
+        <a:schemeClr val="lt1"/>
+      </a:fontRef>
+    </dgm:style>
+  </dgm:styleLbl>
+  <dgm:styleLbl name="vennNode1">
+    <dgm:scene3d>
+      <a:camera prst="orthographicFront"/>
+      <a:lightRig rig="threePt" dir="t"/>
+    </dgm:scene3d>
+    <dgm:sp3d/>
+    <dgm:txPr/>
+    <dgm:style>
+      <a:lnRef idx="2">
+        <a:scrgbClr r="0" g="0" b="0"/>
+      </a:lnRef>
+      <a:fillRef idx="1">
+        <a:scrgbClr r="0" g="0" b="0"/>
+      </a:fillRef>
+      <a:effectRef idx="0">
+        <a:scrgbClr r="0" g="0" b="0"/>
+      </a:effectRef>
+      <a:fontRef idx="minor">
+        <a:schemeClr val="tx1"/>
+      </a:fontRef>
+    </dgm:style>
+  </dgm:styleLbl>
+  <dgm:styleLbl name="alignNode1">
+    <dgm:scene3d>
+      <a:camera prst="orthographicFront"/>
+      <a:lightRig rig="threePt" dir="t"/>
+    </dgm:scene3d>
+    <dgm:sp3d/>
+    <dgm:txPr/>
+    <dgm:style>
+      <a:lnRef idx="2">
+        <a:scrgbClr r="0" g="0" b="0"/>
+      </a:lnRef>
+      <a:fillRef idx="1">
+        <a:scrgbClr r="0" g="0" b="0"/>
+      </a:fillRef>
+      <a:effectRef idx="0">
+        <a:scrgbClr r="0" g="0" b="0"/>
+      </a:effectRef>
+      <a:fontRef idx="minor">
+        <a:schemeClr val="lt1"/>
+      </a:fontRef>
+    </dgm:style>
+  </dgm:styleLbl>
+  <dgm:styleLbl name="node1">
+    <dgm:scene3d>
+      <a:camera prst="orthographicFront"/>
+      <a:lightRig rig="threePt" dir="t"/>
+    </dgm:scene3d>
+    <dgm:sp3d/>
+    <dgm:txPr/>
+    <dgm:style>
+      <a:lnRef idx="2">
+        <a:scrgbClr r="0" g="0" b="0"/>
+      </a:lnRef>
+      <a:fillRef idx="1">
+        <a:scrgbClr r="0" g="0" b="0"/>
+      </a:fillRef>
+      <a:effectRef idx="0">
+        <a:scrgbClr r="0" g="0" b="0"/>
+      </a:effectRef>
+      <a:fontRef idx="minor">
+        <a:schemeClr val="lt1"/>
+      </a:fontRef>
+    </dgm:style>
+  </dgm:styleLbl>
+  <dgm:styleLbl name="node2">
+    <dgm:scene3d>
+      <a:camera prst="orthographicFront"/>
+      <a:lightRig rig="threePt" dir="t"/>
+    </dgm:scene3d>
+    <dgm:sp3d/>
+    <dgm:txPr/>
+    <dgm:style>
+      <a:lnRef idx="2">
+        <a:scrgbClr r="0" g="0" b="0"/>
+      </a:lnRef>
+      <a:fillRef idx="1">
+        <a:scrgbClr r="0" g="0" b="0"/>
+      </a:fillRef>
+      <a:effectRef idx="0">
+        <a:scrgbClr r="0" g="0" b="0"/>
+      </a:effectRef>
+      <a:fontRef idx="minor">
+        <a:schemeClr val="lt1"/>
+      </a:fontRef>
+    </dgm:style>
+  </dgm:styleLbl>
+  <dgm:styleLbl name="node3">
+    <dgm:scene3d>
+      <a:camera prst="orthographicFront"/>
+      <a:lightRig rig="threePt" dir="t"/>
+    </dgm:scene3d>
+    <dgm:sp3d/>
+    <dgm:txPr/>
+    <dgm:style>
+      <a:lnRef idx="2">
+        <a:scrgbClr r="0" g="0" b="0"/>
+      </a:lnRef>
+      <a:fillRef idx="1">
+        <a:scrgbClr r="0" g="0" b="0"/>
+      </a:fillRef>
+      <a:effectRef idx="0">
+        <a:scrgbClr r="0" g="0" b="0"/>
+      </a:effectRef>
+      <a:fontRef idx="minor">
+        <a:schemeClr val="lt1"/>
+      </a:fontRef>
+    </dgm:style>
+  </dgm:styleLbl>
+  <dgm:styleLbl name="node4">
+    <dgm:scene3d>
+      <a:camera prst="orthographicFront"/>
+      <a:lightRig rig="threePt" dir="t"/>
+    </dgm:scene3d>
+    <dgm:sp3d/>
+    <dgm:txPr/>
+    <dgm:style>
+      <a:lnRef idx="2">
+        <a:scrgbClr r="0" g="0" b="0"/>
+      </a:lnRef>
+      <a:fillRef idx="1">
+        <a:scrgbClr r="0" g="0" b="0"/>
+      </a:fillRef>
+      <a:effectRef idx="0">
+        <a:scrgbClr r="0" g="0" b="0"/>
+      </a:effectRef>
+      <a:fontRef idx="minor">
+        <a:schemeClr val="lt1"/>
+      </a:fontRef>
+    </dgm:style>
+  </dgm:styleLbl>
+  <dgm:styleLbl name="fgImgPlace1">
+    <dgm:scene3d>
+      <a:camera prst="orthographicFront"/>
+      <a:lightRig rig="threePt" dir="t"/>
+    </dgm:scene3d>
+    <dgm:sp3d/>
+    <dgm:txPr/>
+    <dgm:style>
+      <a:lnRef idx="2">
+        <a:scrgbClr r="0" g="0" b="0"/>
+      </a:lnRef>
+      <a:fillRef idx="1">
+        <a:scrgbClr r="0" g="0" b="0"/>
+      </a:fillRef>
+      <a:effectRef idx="0">
+        <a:scrgbClr r="0" g="0" b="0"/>
+      </a:effectRef>
+      <a:fontRef idx="minor"/>
+    </dgm:style>
+  </dgm:styleLbl>
+  <dgm:styleLbl name="alignImgPlace1">
+    <dgm:scene3d>
+      <a:camera prst="orthographicFront"/>
+      <a:lightRig rig="threePt" dir="t"/>
+    </dgm:scene3d>
+    <dgm:sp3d/>
+    <dgm:txPr/>
+    <dgm:style>
+      <a:lnRef idx="2">
+        <a:scrgbClr r="0" g="0" b="0"/>
+      </a:lnRef>
+      <a:fillRef idx="1">
+        <a:scrgbClr r="0" g="0" b="0"/>
+      </a:fillRef>
+      <a:effectRef idx="0">
+        <a:scrgbClr r="0" g="0" b="0"/>
+      </a:effectRef>
+      <a:fontRef idx="minor"/>
+    </dgm:style>
+  </dgm:styleLbl>
+  <dgm:styleLbl name="bgImgPlace1">
+    <dgm:scene3d>
+      <a:camera prst="orthographicFront"/>
+      <a:lightRig rig="threePt" dir="t"/>
+    </dgm:scene3d>
+    <dgm:sp3d/>
+    <dgm:txPr/>
+    <dgm:style>
+      <a:lnRef idx="2">
+        <a:scrgbClr r="0" g="0" b="0"/>
+      </a:lnRef>
+      <a:fillRef idx="1">
+        <a:scrgbClr r="0" g="0" b="0"/>
+      </a:fillRef>
+      <a:effectRef idx="0">
+        <a:scrgbClr r="0" g="0" b="0"/>
+      </a:effectRef>
+      <a:fontRef idx="minor"/>
+    </dgm:style>
+  </dgm:styleLbl>
+  <dgm:styleLbl name="sibTrans2D1">
+    <dgm:scene3d>
+      <a:camera prst="orthographicFront"/>
+      <a:lightRig rig="threePt" dir="t"/>
+    </dgm:scene3d>
+    <dgm:sp3d/>
+    <dgm:txPr/>
+    <dgm:style>
+      <a:lnRef idx="0">
+        <a:scrgbClr r="0" g="0" b="0"/>
+      </a:lnRef>
+      <a:fillRef idx="1">
+        <a:scrgbClr r="0" g="0" b="0"/>
+      </a:fillRef>
+      <a:effectRef idx="0">
+        <a:scrgbClr r="0" g="0" b="0"/>
+      </a:effectRef>
+      <a:fontRef idx="minor">
+        <a:schemeClr val="lt1"/>
+      </a:fontRef>
+    </dgm:style>
+  </dgm:styleLbl>
+  <dgm:styleLbl name="fgSibTrans2D1">
+    <dgm:scene3d>
+      <a:camera prst="orthographicFront"/>
+      <a:lightRig rig="threePt" dir="t"/>
+    </dgm:scene3d>
+    <dgm:sp3d/>
+    <dgm:txPr/>
+    <dgm:style>
+      <a:lnRef idx="0">
+        <a:scrgbClr r="0" g="0" b="0"/>
+      </a:lnRef>
+      <a:fillRef idx="1">
+        <a:scrgbClr r="0" g="0" b="0"/>
+      </a:fillRef>
+      <a:effectRef idx="0">
+        <a:scrgbClr r="0" g="0" b="0"/>
+      </a:effectRef>
+      <a:fontRef idx="minor">
+        <a:schemeClr val="lt1"/>
+      </a:fontRef>
+    </dgm:style>
+  </dgm:styleLbl>
+  <dgm:styleLbl name="bgSibTrans2D1">
+    <dgm:scene3d>
+      <a:camera prst="orthographicFront"/>
+      <a:lightRig rig="threePt" dir="t"/>
+    </dgm:scene3d>
+    <dgm:sp3d/>
+    <dgm:txPr/>
+    <dgm:style>
+      <a:lnRef idx="0">
+        <a:scrgbClr r="0" g="0" b="0"/>
+      </a:lnRef>
+      <a:fillRef idx="1">
+        <a:scrgbClr r="0" g="0" b="0"/>
+      </a:fillRef>
+      <a:effectRef idx="0">
+        <a:scrgbClr r="0" g="0" b="0"/>
+      </a:effectRef>
+      <a:fontRef idx="minor">
+        <a:schemeClr val="lt1"/>
+      </a:fontRef>
+    </dgm:style>
+  </dgm:styleLbl>
+  <dgm:styleLbl name="sibTrans1D1">
+    <dgm:scene3d>
+      <a:camera prst="orthographicFront"/>
+      <a:lightRig rig="threePt" dir="t"/>
+    </dgm:scene3d>
+    <dgm:sp3d/>
+    <dgm:txPr/>
+    <dgm:style>
+      <a:lnRef idx="1">
+        <a:scrgbClr r="0" g="0" b="0"/>
+      </a:lnRef>
+      <a:fillRef idx="0">
+        <a:scrgbClr r="0" g="0" b="0"/>
+      </a:fillRef>
+      <a:effectRef idx="0">
+        <a:scrgbClr r="0" g="0" b="0"/>
+      </a:effectRef>
+      <a:fontRef idx="minor"/>
+    </dgm:style>
+  </dgm:styleLbl>
+  <dgm:styleLbl name="callout">
+    <dgm:scene3d>
+      <a:camera prst="orthographicFront"/>
+      <a:lightRig rig="threePt" dir="t"/>
+    </dgm:scene3d>
+    <dgm:sp3d/>
+    <dgm:txPr/>
+    <dgm:style>
+      <a:lnRef idx="2">
+        <a:scrgbClr r="0" g="0" b="0"/>
+      </a:lnRef>
+      <a:fillRef idx="1">
+        <a:scrgbClr r="0" g="0" b="0"/>
+      </a:fillRef>
+      <a:effectRef idx="0">
+        <a:scrgbClr r="0" g="0" b="0"/>
+      </a:effectRef>
+      <a:fontRef idx="minor"/>
+    </dgm:style>
+  </dgm:styleLbl>
+  <dgm:styleLbl name="asst0">
+    <dgm:scene3d>
+      <a:camera prst="orthographicFront"/>
+      <a:lightRig rig="threePt" dir="t"/>
+    </dgm:scene3d>
+    <dgm:sp3d/>
+    <dgm:txPr/>
+    <dgm:style>
+      <a:lnRef idx="2">
+        <a:scrgbClr r="0" g="0" b="0"/>
+      </a:lnRef>
+      <a:fillRef idx="1">
+        <a:scrgbClr r="0" g="0" b="0"/>
+      </a:fillRef>
+      <a:effectRef idx="0">
+        <a:scrgbClr r="0" g="0" b="0"/>
+      </a:effectRef>
+      <a:fontRef idx="minor">
+        <a:schemeClr val="lt1"/>
+      </a:fontRef>
+    </dgm:style>
+  </dgm:styleLbl>
+  <dgm:styleLbl name="asst1">
+    <dgm:scene3d>
+      <a:camera prst="orthographicFront"/>
+      <a:lightRig rig="threePt" dir="t"/>
+    </dgm:scene3d>
+    <dgm:sp3d/>
+    <dgm:txPr/>
+    <dgm:style>
+      <a:lnRef idx="2">
+        <a:scrgbClr r="0" g="0" b="0"/>
+      </a:lnRef>
+      <a:fillRef idx="1">
+        <a:scrgbClr r="0" g="0" b="0"/>
+      </a:fillRef>
+      <a:effectRef idx="0">
+        <a:scrgbClr r="0" g="0" b="0"/>
+      </a:effectRef>
+      <a:fontRef idx="minor">
+        <a:schemeClr val="lt1"/>
+      </a:fontRef>
+    </dgm:style>
+  </dgm:styleLbl>
+  <dgm:styleLbl name="asst2">
+    <dgm:scene3d>
+      <a:camera prst="orthographicFront"/>
+      <a:lightRig rig="threePt" dir="t"/>
+    </dgm:scene3d>
+    <dgm:sp3d/>
+    <dgm:txPr/>
+    <dgm:style>
+      <a:lnRef idx="2">
+        <a:scrgbClr r="0" g="0" b="0"/>
+      </a:lnRef>
+      <a:fillRef idx="1">
+        <a:scrgbClr r="0" g="0" b="0"/>
+      </a:fillRef>
+      <a:effectRef idx="0">
+        <a:scrgbClr r="0" g="0" b="0"/>
+      </a:effectRef>
+      <a:fontRef idx="minor">
+        <a:schemeClr val="lt1"/>
+      </a:fontRef>
+    </dgm:style>
+  </dgm:styleLbl>
+  <dgm:styleLbl name="asst3">
+    <dgm:scene3d>
+      <a:camera prst="orthographicFront"/>
+      <a:lightRig rig="threePt" dir="t"/>
+    </dgm:scene3d>
+    <dgm:sp3d/>
+    <dgm:txPr/>
+    <dgm:style>
+      <a:lnRef idx="2">
+        <a:scrgbClr r="0" g="0" b="0"/>
+      </a:lnRef>
+      <a:fillRef idx="1">
+        <a:scrgbClr r="0" g="0" b="0"/>
+      </a:fillRef>
+      <a:effectRef idx="0">
+        <a:scrgbClr r="0" g="0" b="0"/>
+      </a:effectRef>
+      <a:fontRef idx="minor">
+        <a:schemeClr val="lt1"/>
+      </a:fontRef>
+    </dgm:style>
+  </dgm:styleLbl>
+  <dgm:styleLbl name="asst4">
+    <dgm:scene3d>
+      <a:camera prst="orthographicFront"/>
+      <a:lightRig rig="threePt" dir="t"/>
+    </dgm:scene3d>
+    <dgm:sp3d/>
+    <dgm:txPr/>
+    <dgm:style>
+      <a:lnRef idx="2">
+        <a:scrgbClr r="0" g="0" b="0"/>
+      </a:lnRef>
+      <a:fillRef idx="1">
+        <a:scrgbClr r="0" g="0" b="0"/>
+      </a:fillRef>
+      <a:effectRef idx="0">
+        <a:scrgbClr r="0" g="0" b="0"/>
+      </a:effectRef>
+      <a:fontRef idx="minor">
+        <a:schemeClr val="lt1"/>
+      </a:fontRef>
+    </dgm:style>
+  </dgm:styleLbl>
+  <dgm:styleLbl name="parChTrans2D1">
+    <dgm:scene3d>
+      <a:camera prst="orthographicFront"/>
+      <a:lightRig rig="threePt" dir="t"/>
+    </dgm:scene3d>
+    <dgm:sp3d/>
+    <dgm:txPr/>
+    <dgm:style>
+      <a:lnRef idx="2">
+        <a:scrgbClr r="0" g="0" b="0"/>
+      </a:lnRef>
+      <a:fillRef idx="1">
+        <a:scrgbClr r="0" g="0" b="0"/>
+      </a:fillRef>
+      <a:effectRef idx="0">
+        <a:scrgbClr r="0" g="0" b="0"/>
+      </a:effectRef>
+      <a:fontRef idx="minor">
+        <a:schemeClr val="lt1"/>
+      </a:fontRef>
+    </dgm:style>
+  </dgm:styleLbl>
+  <dgm:styleLbl name="parChTrans2D2">
+    <dgm:scene3d>
+      <a:camera prst="orthographicFront"/>
+      <a:lightRig rig="threePt" dir="t"/>
+    </dgm:scene3d>
+    <dgm:sp3d/>
+    <dgm:txPr/>
+    <dgm:style>
+      <a:lnRef idx="2">
+        <a:scrgbClr r="0" g="0" b="0"/>
+      </a:lnRef>
+      <a:fillRef idx="1">
+        <a:scrgbClr r="0" g="0" b="0"/>
+      </a:fillRef>
+      <a:effectRef idx="0">
+        <a:scrgbClr r="0" g="0" b="0"/>
+      </a:effectRef>
+      <a:fontRef idx="minor">
+        <a:schemeClr val="lt1"/>
+      </a:fontRef>
+    </dgm:style>
+  </dgm:styleLbl>
+  <dgm:styleLbl name="parChTrans2D3">
+    <dgm:scene3d>
+      <a:camera prst="orthographicFront"/>
+      <a:lightRig rig="threePt" dir="t"/>
+    </dgm:scene3d>
+    <dgm:sp3d/>
+    <dgm:txPr/>
+    <dgm:style>
+      <a:lnRef idx="2">
+        <a:scrgbClr r="0" g="0" b="0"/>
+      </a:lnRef>
+      <a:fillRef idx="1">
+        <a:scrgbClr r="0" g="0" b="0"/>
+      </a:fillRef>
+      <a:effectRef idx="0">
+        <a:scrgbClr r="0" g="0" b="0"/>
+      </a:effectRef>
+      <a:fontRef idx="minor">
+        <a:schemeClr val="lt1"/>
+      </a:fontRef>
+    </dgm:style>
+  </dgm:styleLbl>
+  <dgm:styleLbl name="parChTrans2D4">
+    <dgm:scene3d>
+      <a:camera prst="orthographicFront"/>
+      <a:lightRig rig="threePt" dir="t"/>
+    </dgm:scene3d>
+    <dgm:sp3d/>
+    <dgm:txPr/>
+    <dgm:style>
+      <a:lnRef idx="2">
+        <a:scrgbClr r="0" g="0" b="0"/>
+      </a:lnRef>
+      <a:fillRef idx="1">
+        <a:scrgbClr r="0" g="0" b="0"/>
+      </a:fillRef>
+      <a:effectRef idx="0">
+        <a:scrgbClr r="0" g="0" b="0"/>
+      </a:effectRef>
+      <a:fontRef idx="minor">
+        <a:schemeClr val="lt1"/>
+      </a:fontRef>
+    </dgm:style>
+  </dgm:styleLbl>
+  <dgm:styleLbl name="parChTrans1D1">
+    <dgm:scene3d>
+      <a:camera prst="orthographicFront"/>
+      <a:lightRig rig="threePt" dir="t"/>
+    </dgm:scene3d>
+    <dgm:sp3d/>
+    <dgm:txPr/>
+    <dgm:style>
+      <a:lnRef idx="2">
+        <a:scrgbClr r="0" g="0" b="0"/>
+      </a:lnRef>
+      <a:fillRef idx="0">
+        <a:scrgbClr r="0" g="0" b="0"/>
+      </a:fillRef>
+      <a:effectRef idx="0">
+        <a:scrgbClr r="0" g="0" b="0"/>
+      </a:effectRef>
+      <a:fontRef idx="minor"/>
+    </dgm:style>
+  </dgm:styleLbl>
+  <dgm:styleLbl name="parChTrans1D2">
+    <dgm:scene3d>
+      <a:camera prst="orthographicFront"/>
+      <a:lightRig rig="threePt" dir="t"/>
+    </dgm:scene3d>
+    <dgm:sp3d/>
+    <dgm:txPr/>
+    <dgm:style>
+      <a:lnRef idx="2">
+        <a:scrgbClr r="0" g="0" b="0"/>
+      </a:lnRef>
+      <a:fillRef idx="0">
+        <a:scrgbClr r="0" g="0" b="0"/>
+      </a:fillRef>
+      <a:effectRef idx="0">
+        <a:scrgbClr r="0" g="0" b="0"/>
+      </a:effectRef>
+      <a:fontRef idx="minor"/>
+    </dgm:style>
+  </dgm:styleLbl>
+  <dgm:styleLbl name="parChTrans1D3">
+    <dgm:scene3d>
+      <a:camera prst="orthographicFront"/>
+      <a:lightRig rig="threePt" dir="t"/>
+    </dgm:scene3d>
+    <dgm:sp3d/>
+    <dgm:txPr/>
+    <dgm:style>
+      <a:lnRef idx="2">
+        <a:scrgbClr r="0" g="0" b="0"/>
+      </a:lnRef>
+      <a:fillRef idx="0">
+        <a:scrgbClr r="0" g="0" b="0"/>
+      </a:fillRef>
+      <a:effectRef idx="0">
+        <a:scrgbClr r="0" g="0" b="0"/>
+      </a:effectRef>
+      <a:fontRef idx="minor"/>
+    </dgm:style>
+  </dgm:styleLbl>
+  <dgm:styleLbl name="parChTrans1D4">
+    <dgm:scene3d>
+      <a:camera prst="orthographicFront"/>
+      <a:lightRig rig="threePt" dir="t"/>
+    </dgm:scene3d>
+    <dgm:sp3d/>
+    <dgm:txPr/>
+    <dgm:style>
+      <a:lnRef idx="2">
+        <a:scrgbClr r="0" g="0" b="0"/>
+      </a:lnRef>
+      <a:fillRef idx="0">
+        <a:scrgbClr r="0" g="0" b="0"/>
+      </a:fillRef>
+      <a:effectRef idx="0">
+        <a:scrgbClr r="0" g="0" b="0"/>
+      </a:effectRef>
+      <a:fontRef idx="minor"/>
+    </dgm:style>
+  </dgm:styleLbl>
+  <dgm:styleLbl name="fgAcc1">
+    <dgm:scene3d>
+      <a:camera prst="orthographicFront"/>
+      <a:lightRig rig="threePt" dir="t"/>
+    </dgm:scene3d>
+    <dgm:sp3d/>
+    <dgm:txPr/>
+    <dgm:style>
+      <a:lnRef idx="2">
+        <a:scrgbClr r="0" g="0" b="0"/>
+      </a:lnRef>
+      <a:fillRef idx="1">
+        <a:scrgbClr r="0" g="0" b="0"/>
+      </a:fillRef>
+      <a:effectRef idx="0">
+        <a:scrgbClr r="0" g="0" b="0"/>
+      </a:effectRef>
+      <a:fontRef idx="minor"/>
+    </dgm:style>
+  </dgm:styleLbl>
+  <dgm:styleLbl name="conFgAcc1">
+    <dgm:scene3d>
+      <a:camera prst="orthographicFront"/>
+      <a:lightRig rig="threePt" dir="t"/>
+    </dgm:scene3d>
+    <dgm:sp3d/>
+    <dgm:txPr/>
+    <dgm:style>
+      <a:lnRef idx="2">
+        <a:scrgbClr r="0" g="0" b="0"/>
+      </a:lnRef>
+      <a:fillRef idx="1">
+        <a:scrgbClr r="0" g="0" b="0"/>
+      </a:fillRef>
+      <a:effectRef idx="0">
+        <a:scrgbClr r="0" g="0" b="0"/>
+      </a:effectRef>
+      <a:fontRef idx="minor"/>
+    </dgm:style>
+  </dgm:styleLbl>
+  <dgm:styleLbl name="alignAcc1">
+    <dgm:scene3d>
+      <a:camera prst="orthographicFront"/>
+      <a:lightRig rig="threePt" dir="t"/>
+    </dgm:scene3d>
+    <dgm:sp3d/>
+    <dgm:txPr/>
+    <dgm:style>
+      <a:lnRef idx="2">
+        <a:scrgbClr r="0" g="0" b="0"/>
+      </a:lnRef>
+      <a:fillRef idx="1">
+        <a:scrgbClr r="0" g="0" b="0"/>
+      </a:fillRef>
+      <a:effectRef idx="0">
+        <a:scrgbClr r="0" g="0" b="0"/>
+      </a:effectRef>
+      <a:fontRef idx="minor"/>
+    </dgm:style>
+  </dgm:styleLbl>
+  <dgm:styleLbl name="trAlignAcc1">
+    <dgm:scene3d>
+      <a:camera prst="orthographicFront"/>
+      <a:lightRig rig="threePt" dir="t"/>
+    </dgm:scene3d>
+    <dgm:sp3d/>
+    <dgm:txPr/>
+    <dgm:style>
+      <a:lnRef idx="1">
+        <a:scrgbClr r="0" g="0" b="0"/>
+      </a:lnRef>
+      <a:fillRef idx="1">
+        <a:scrgbClr r="0" g="0" b="0"/>
+      </a:fillRef>
+      <a:effectRef idx="0">
+        <a:scrgbClr r="0" g="0" b="0"/>
+      </a:effectRef>
+      <a:fontRef idx="minor"/>
+    </dgm:style>
+  </dgm:styleLbl>
+  <dgm:styleLbl name="bgAcc1">
+    <dgm:scene3d>
+      <a:camera prst="orthographicFront"/>
+      <a:lightRig rig="threePt" dir="t"/>
+    </dgm:scene3d>
+    <dgm:sp3d/>
+    <dgm:txPr/>
+    <dgm:style>
+      <a:lnRef idx="2">
+        <a:scrgbClr r="0" g="0" b="0"/>
+      </a:lnRef>
+      <a:fillRef idx="1">
+        <a:scrgbClr r="0" g="0" b="0"/>
+      </a:fillRef>
+      <a:effectRef idx="0">
+        <a:scrgbClr r="0" g="0" b="0"/>
+      </a:effectRef>
+      <a:fontRef idx="minor"/>
+    </dgm:style>
+  </dgm:styleLbl>
+  <dgm:styleLbl name="solidFgAcc1">
+    <dgm:scene3d>
+      <a:camera prst="orthographicFront"/>
+      <a:lightRig rig="threePt" dir="t"/>
+    </dgm:scene3d>
+    <dgm:sp3d/>
+    <dgm:txPr/>
+    <dgm:style>
+      <a:lnRef idx="2">
+        <a:scrgbClr r="0" g="0" b="0"/>
+      </a:lnRef>
+      <a:fillRef idx="1">
+        <a:scrgbClr r="0" g="0" b="0"/>
+      </a:fillRef>
+      <a:effectRef idx="0">
+        <a:scrgbClr r="0" g="0" b="0"/>
+      </a:effectRef>
+      <a:fontRef idx="minor"/>
+    </dgm:style>
+  </dgm:styleLbl>
+  <dgm:styleLbl name="solidAlignAcc1">
+    <dgm:scene3d>
+      <a:camera prst="orthographicFront"/>
+      <a:lightRig rig="threePt" dir="t"/>
+    </dgm:scene3d>
+    <dgm:sp3d/>
+    <dgm:txPr/>
+    <dgm:style>
+      <a:lnRef idx="2">
+        <a:scrgbClr r="0" g="0" b="0"/>
+      </a:lnRef>
+      <a:fillRef idx="1">
+        <a:scrgbClr r="0" g="0" b="0"/>
+      </a:fillRef>
+      <a:effectRef idx="0">
+        <a:scrgbClr r="0" g="0" b="0"/>
+      </a:effectRef>
+      <a:fontRef idx="minor"/>
+    </dgm:style>
+  </dgm:styleLbl>
+  <dgm:styleLbl name="solidBgAcc1">
+    <dgm:scene3d>
+      <a:camera prst="orthographicFront"/>
+      <a:lightRig rig="threePt" dir="t"/>
+    </dgm:scene3d>
+    <dgm:sp3d/>
+    <dgm:txPr/>
+    <dgm:style>
+      <a:lnRef idx="2">
+        <a:scrgbClr r="0" g="0" b="0"/>
+      </a:lnRef>
+      <a:fillRef idx="1">
+        <a:scrgbClr r="0" g="0" b="0"/>
+      </a:fillRef>
+      <a:effectRef idx="0">
+        <a:scrgbClr r="0" g="0" b="0"/>
+      </a:effectRef>
+      <a:fontRef idx="minor"/>
+    </dgm:style>
+  </dgm:styleLbl>
+  <dgm:styleLbl name="fgAccFollowNode1">
+    <dgm:scene3d>
+      <a:camera prst="orthographicFront"/>
+      <a:lightRig rig="threePt" dir="t"/>
+    </dgm:scene3d>
+    <dgm:sp3d/>
+    <dgm:txPr/>
+    <dgm:style>
+      <a:lnRef idx="2">
+        <a:scrgbClr r="0" g="0" b="0"/>
+      </a:lnRef>
+      <a:fillRef idx="1">
+        <a:scrgbClr r="0" g="0" b="0"/>
+      </a:fillRef>
+      <a:effectRef idx="0">
+        <a:scrgbClr r="0" g="0" b="0"/>
+      </a:effectRef>
+      <a:fontRef idx="minor"/>
+    </dgm:style>
+  </dgm:styleLbl>
+  <dgm:styleLbl name="alignAccFollowNode1">
+    <dgm:scene3d>
+      <a:camera prst="orthographicFront"/>
+      <a:lightRig rig="threePt" dir="t"/>
+    </dgm:scene3d>
+    <dgm:sp3d/>
+    <dgm:txPr/>
+    <dgm:style>
+      <a:lnRef idx="2">
+        <a:scrgbClr r="0" g="0" b="0"/>
+      </a:lnRef>
+      <a:fillRef idx="1">
+        <a:scrgbClr r="0" g="0" b="0"/>
+      </a:fillRef>
+      <a:effectRef idx="0">
+        <a:scrgbClr r="0" g="0" b="0"/>
+      </a:effectRef>
+      <a:fontRef idx="minor"/>
+    </dgm:style>
+  </dgm:styleLbl>
+  <dgm:styleLbl name="bgAccFollowNode1">
+    <dgm:scene3d>
+      <a:camera prst="orthographicFront"/>
+      <a:lightRig rig="threePt" dir="t"/>
+    </dgm:scene3d>
+    <dgm:sp3d/>
+    <dgm:txPr/>
+    <dgm:style>
+      <a:lnRef idx="2">
+        <a:scrgbClr r="0" g="0" b="0"/>
+      </a:lnRef>
+      <a:fillRef idx="1">
+        <a:scrgbClr r="0" g="0" b="0"/>
+      </a:fillRef>
+      <a:effectRef idx="0">
+        <a:scrgbClr r="0" g="0" b="0"/>
+      </a:effectRef>
+      <a:fontRef idx="minor"/>
+    </dgm:style>
+  </dgm:styleLbl>
+  <dgm:styleLbl name="fgAcc0">
+    <dgm:scene3d>
+      <a:camera prst="orthographicFront"/>
+      <a:lightRig rig="threePt" dir="t"/>
+    </dgm:scene3d>
+    <dgm:sp3d/>
+    <dgm:txPr/>
+    <dgm:style>
+      <a:lnRef idx="2">
+        <a:scrgbClr r="0" g="0" b="0"/>
+      </a:lnRef>
+      <a:fillRef idx="1">
+        <a:scrgbClr r="0" g="0" b="0"/>
+      </a:fillRef>
+      <a:effectRef idx="0">
+        <a:scrgbClr r="0" g="0" b="0"/>
+      </a:effectRef>
+      <a:fontRef idx="minor"/>
+    </dgm:style>
+  </dgm:styleLbl>
+  <dgm:styleLbl name="fgAcc2">
+    <dgm:scene3d>
+      <a:camera prst="orthographicFront"/>
+      <a:lightRig rig="threePt" dir="t"/>
+    </dgm:scene3d>
+    <dgm:sp3d/>
+    <dgm:txPr/>
+    <dgm:style>
+      <a:lnRef idx="2">
+        <a:scrgbClr r="0" g="0" b="0"/>
+      </a:lnRef>
+      <a:fillRef idx="1">
+        <a:scrgbClr r="0" g="0" b="0"/>
+      </a:fillRef>
+      <a:effectRef idx="0">
+        <a:scrgbClr r="0" g="0" b="0"/>
+      </a:effectRef>
+      <a:fontRef idx="minor"/>
+    </dgm:style>
+  </dgm:styleLbl>
+  <dgm:styleLbl name="fgAcc3">
+    <dgm:scene3d>
+      <a:camera prst="orthographicFront"/>
+      <a:lightRig rig="threePt" dir="t"/>
+    </dgm:scene3d>
+    <dgm:sp3d/>
+    <dgm:txPr/>
+    <dgm:style>
+      <a:lnRef idx="2">
+        <a:scrgbClr r="0" g="0" b="0"/>
+      </a:lnRef>
+      <a:fillRef idx="1">
+        <a:scrgbClr r="0" g="0" b="0"/>
+      </a:fillRef>
+      <a:effectRef idx="0">
+        <a:scrgbClr r="0" g="0" b="0"/>
+      </a:effectRef>
+      <a:fontRef idx="minor"/>
+    </dgm:style>
+  </dgm:styleLbl>
+  <dgm:styleLbl name="fgAcc4">
+    <dgm:scene3d>
+      <a:camera prst="orthographicFront"/>
+      <a:lightRig rig="threePt" dir="t"/>
+    </dgm:scene3d>
+    <dgm:sp3d/>
+    <dgm:txPr/>
+    <dgm:style>
+      <a:lnRef idx="2">
+        <a:scrgbClr r="0" g="0" b="0"/>
+      </a:lnRef>
+      <a:fillRef idx="1">
+        <a:scrgbClr r="0" g="0" b="0"/>
+      </a:fillRef>
+      <a:effectRef idx="0">
+        <a:scrgbClr r="0" g="0" b="0"/>
+      </a:effectRef>
+      <a:fontRef idx="minor"/>
+    </dgm:style>
+  </dgm:styleLbl>
+  <dgm:styleLbl name="bgShp">
+    <dgm:scene3d>
+      <a:camera prst="orthographicFront"/>
+      <a:lightRig rig="threePt" dir="t"/>
+    </dgm:scene3d>
+    <dgm:sp3d/>
+    <dgm:txPr/>
+    <dgm:style>
+      <a:lnRef idx="0">
+        <a:scrgbClr r="0" g="0" b="0"/>
+      </a:lnRef>
+      <a:fillRef idx="1">
+        <a:scrgbClr r="0" g="0" b="0"/>
+      </a:fillRef>
+      <a:effectRef idx="0">
+        <a:scrgbClr r="0" g="0" b="0"/>
+      </a:effectRef>
+      <a:fontRef idx="minor"/>
+    </dgm:style>
+  </dgm:styleLbl>
+  <dgm:styleLbl name="dkBgShp">
+    <dgm:scene3d>
+      <a:camera prst="orthographicFront"/>
+      <a:lightRig rig="threePt" dir="t"/>
+    </dgm:scene3d>
+    <dgm:sp3d/>
+    <dgm:txPr/>
+    <dgm:style>
+      <a:lnRef idx="0">
+        <a:scrgbClr r="0" g="0" b="0"/>
+      </a:lnRef>
+      <a:fillRef idx="1">
+        <a:scrgbClr r="0" g="0" b="0"/>
+      </a:fillRef>
+      <a:effectRef idx="0">
+        <a:scrgbClr r="0" g="0" b="0"/>
+      </a:effectRef>
+      <a:fontRef idx="minor"/>
+    </dgm:style>
+  </dgm:styleLbl>
+  <dgm:styleLbl name="trBgShp">
+    <dgm:scene3d>
+      <a:camera prst="orthographicFront"/>
+      <a:lightRig rig="threePt" dir="t"/>
+    </dgm:scene3d>
+    <dgm:sp3d/>
+    <dgm:txPr/>
+    <dgm:style>
+      <a:lnRef idx="0">
+        <a:scrgbClr r="0" g="0" b="0"/>
+      </a:lnRef>
+      <a:fillRef idx="1">
+        <a:scrgbClr r="0" g="0" b="0"/>
+      </a:fillRef>
+      <a:effectRef idx="0">
+        <a:scrgbClr r="0" g="0" b="0"/>
+      </a:effectRef>
+      <a:fontRef idx="minor"/>
+    </dgm:style>
+  </dgm:styleLbl>
+  <dgm:styleLbl name="fgShp">
+    <dgm:scene3d>
+      <a:camera prst="orthographicFront"/>
+      <a:lightRig rig="threePt" dir="t"/>
+    </dgm:scene3d>
+    <dgm:sp3d/>
+    <dgm:txPr/>
+    <dgm:style>
+      <a:lnRef idx="2">
+        <a:scrgbClr r="0" g="0" b="0"/>
+      </a:lnRef>
+      <a:fillRef idx="1">
+        <a:scrgbClr r="0" g="0" b="0"/>
+      </a:fillRef>
+      <a:effectRef idx="0">
+        <a:scrgbClr r="0" g="0" b="0"/>
+      </a:effectRef>
+      <a:fontRef idx="minor"/>
+    </dgm:style>
+  </dgm:styleLbl>
+  <dgm:styleLbl name="revTx">
+    <dgm:scene3d>
+      <a:camera prst="orthographicFront"/>
+      <a:lightRig rig="threePt" dir="t"/>
+    </dgm:scene3d>
+    <dgm:sp3d/>
+    <dgm:txPr/>
+    <dgm:style>
+      <a:lnRef idx="0">
+        <a:scrgbClr r="0" g="0" b="0"/>
+      </a:lnRef>
+      <a:fillRef idx="0">
+        <a:scrgbClr r="0" g="0" b="0"/>
+      </a:fillRef>
+      <a:effectRef idx="0">
+        <a:scrgbClr r="0" g="0" b="0"/>
+      </a:effectRef>
+      <a:fontRef idx="minor"/>
+    </dgm:style>
+  </dgm:styleLbl>
+</dgm:styleDef>
+</file>
+
 <file path=word/theme/theme1.xml><?xml version="1.0" encoding="utf-8"?>
 <a:theme xmlns:a="http://schemas.openxmlformats.org/drawingml/2006/main" name="Office Theme">
   <a:themeElements>

</xml_diff>

<commit_message>
Updated to remove comments from resume
</commit_message>
<xml_diff>
--- a/Resume/TylerNobleResume.docx
+++ b/Resume/TylerNobleResume.docx
@@ -186,12 +186,14 @@
         <w:t xml:space="preserve"> </w:t>
       </w:r>
       <w:hyperlink r:id="rId9">
+        <w:proofErr w:type="spellStart"/>
         <w:r>
           <w:rPr>
             <w:b/>
           </w:rPr>
           <w:t>NobleTyler</w:t>
         </w:r>
+        <w:proofErr w:type="spellEnd"/>
       </w:hyperlink>
     </w:p>
     <w:p>
@@ -496,7 +498,26 @@
         <w:rPr>
           <w:b w:val="0"/>
         </w:rPr>
-        <w:t xml:space="preserve">       </w:t>
+        <w:t xml:space="preserve">      </w:t>
+      </w:r>
+      <w:r>
+        <w:rPr>
+          <w:b w:val="0"/>
+        </w:rPr>
+        <w:tab/>
+      </w:r>
+      <w:r>
+        <w:rPr>
+          <w:b w:val="0"/>
+        </w:rPr>
+        <w:tab/>
+        <w:t xml:space="preserve">     </w:t>
+      </w:r>
+      <w:r>
+        <w:rPr>
+          <w:b w:val="0"/>
+        </w:rPr>
+        <w:t xml:space="preserve"> </w:t>
       </w:r>
       <w:r>
         <w:rPr>
@@ -535,30 +556,66 @@
           <w:ilvl w:val="0"/>
           <w:numId w:val="2"/>
         </w:numPr>
+        <w:rPr>
+          <w:sz w:val="22"/>
+          <w:szCs w:val="22"/>
+        </w:rPr>
       </w:pPr>
       <w:commentRangeStart w:id="3"/>
       <w:r>
+        <w:rPr>
+          <w:sz w:val="22"/>
+          <w:szCs w:val="22"/>
+        </w:rPr>
         <w:t>Architect</w:t>
       </w:r>
       <w:r>
+        <w:rPr>
+          <w:sz w:val="22"/>
+          <w:szCs w:val="22"/>
+        </w:rPr>
         <w:t>ed</w:t>
       </w:r>
       <w:r>
+        <w:rPr>
+          <w:sz w:val="22"/>
+          <w:szCs w:val="22"/>
+        </w:rPr>
         <w:t xml:space="preserve"> and design</w:t>
       </w:r>
       <w:r>
+        <w:rPr>
+          <w:sz w:val="22"/>
+          <w:szCs w:val="22"/>
+        </w:rPr>
         <w:t>ed</w:t>
       </w:r>
       <w:r>
+        <w:rPr>
+          <w:sz w:val="22"/>
+          <w:szCs w:val="22"/>
+        </w:rPr>
         <w:t xml:space="preserve"> </w:t>
       </w:r>
       <w:r>
+        <w:rPr>
+          <w:sz w:val="22"/>
+          <w:szCs w:val="22"/>
+        </w:rPr>
         <w:t>system for facilitation of supply chain management solution</w:t>
       </w:r>
       <w:r>
+        <w:rPr>
+          <w:sz w:val="22"/>
+          <w:szCs w:val="22"/>
+        </w:rPr>
         <w:t>s</w:t>
       </w:r>
       <w:r>
+        <w:rPr>
+          <w:sz w:val="22"/>
+          <w:szCs w:val="22"/>
+        </w:rPr>
         <w:t xml:space="preserve">  </w:t>
       </w:r>
     </w:p>
@@ -568,44 +625,87 @@
           <w:ilvl w:val="0"/>
           <w:numId w:val="2"/>
         </w:numPr>
-      </w:pPr>
-      <w:r>
+        <w:rPr>
+          <w:sz w:val="22"/>
+          <w:szCs w:val="22"/>
+        </w:rPr>
+      </w:pPr>
+      <w:r>
+        <w:rPr>
+          <w:sz w:val="22"/>
+          <w:szCs w:val="22"/>
+        </w:rPr>
         <w:t>Design</w:t>
       </w:r>
       <w:r>
+        <w:rPr>
+          <w:sz w:val="22"/>
+          <w:szCs w:val="22"/>
+        </w:rPr>
         <w:t>ed</w:t>
       </w:r>
       <w:r>
-        <w:t xml:space="preserve"> and </w:t>
-      </w:r>
-      <w:r>
-        <w:t>implement</w:t>
-      </w:r>
-      <w:r>
+        <w:rPr>
+          <w:sz w:val="22"/>
+          <w:szCs w:val="22"/>
+        </w:rPr>
+        <w:t xml:space="preserve"> and implement</w:t>
+      </w:r>
+      <w:r>
+        <w:rPr>
+          <w:sz w:val="22"/>
+          <w:szCs w:val="22"/>
+        </w:rPr>
         <w:t>ed</w:t>
       </w:r>
       <w:r>
+        <w:rPr>
+          <w:sz w:val="22"/>
+          <w:szCs w:val="22"/>
+        </w:rPr>
         <w:t xml:space="preserve"> </w:t>
       </w:r>
       <w:r>
+        <w:rPr>
+          <w:sz w:val="22"/>
+          <w:szCs w:val="22"/>
+        </w:rPr>
         <w:t xml:space="preserve">a </w:t>
       </w:r>
       <w:r>
+        <w:rPr>
+          <w:sz w:val="22"/>
+          <w:szCs w:val="22"/>
+        </w:rPr>
         <w:t>knowledge base system</w:t>
       </w:r>
       <w:r>
+        <w:rPr>
+          <w:sz w:val="22"/>
+          <w:szCs w:val="22"/>
+        </w:rPr>
         <w:t xml:space="preserve"> for </w:t>
       </w:r>
       <w:r>
+        <w:rPr>
+          <w:sz w:val="22"/>
+          <w:szCs w:val="22"/>
+        </w:rPr>
         <w:t xml:space="preserve">standardized </w:t>
       </w:r>
       <w:r>
+        <w:rPr>
+          <w:sz w:val="22"/>
+          <w:szCs w:val="22"/>
+        </w:rPr>
         <w:t xml:space="preserve">documentation </w:t>
       </w:r>
       <w:commentRangeEnd w:id="3"/>
       <w:r>
         <w:rPr>
           <w:rStyle w:val="CommentReference"/>
+          <w:sz w:val="18"/>
+          <w:szCs w:val="18"/>
         </w:rPr>
         <w:commentReference w:id="3"/>
       </w:r>
@@ -616,14 +716,17 @@
           <w:ilvl w:val="0"/>
           <w:numId w:val="2"/>
         </w:numPr>
-      </w:pPr>
-      <w:r>
-        <w:t>Performed fixes on database systems used in logistical and financial</w:t>
-      </w:r>
-      <w:bookmarkStart w:id="4" w:name="_GoBack"/>
-      <w:bookmarkEnd w:id="4"/>
-      <w:r>
-        <w:t xml:space="preserve"> reporting</w:t>
+        <w:rPr>
+          <w:sz w:val="22"/>
+          <w:szCs w:val="22"/>
+        </w:rPr>
+      </w:pPr>
+      <w:r>
+        <w:rPr>
+          <w:sz w:val="22"/>
+          <w:szCs w:val="22"/>
+        </w:rPr>
+        <w:t>Performed fixes on database systems used in logistical and financial reporting</w:t>
       </w:r>
     </w:p>
     <w:p>
@@ -632,9 +735,46 @@
           <w:ilvl w:val="0"/>
           <w:numId w:val="2"/>
         </w:numPr>
-      </w:pPr>
-      <w:r>
+        <w:rPr>
+          <w:sz w:val="22"/>
+          <w:szCs w:val="22"/>
+        </w:rPr>
+      </w:pPr>
+      <w:r>
+        <w:rPr>
+          <w:sz w:val="22"/>
+          <w:szCs w:val="22"/>
+        </w:rPr>
         <w:t>Worked on data analysis for the client using robust and responsive spreadsheets</w:t>
+      </w:r>
+    </w:p>
+    <w:p>
+      <w:pPr>
+        <w:ind w:firstLine="0"/>
+      </w:pPr>
+      <w:r>
+        <w:rPr>
+          <w:b/>
+        </w:rPr>
+        <w:t>Used: Microsoft Excel,</w:t>
+      </w:r>
+      <w:r>
+        <w:rPr>
+          <w:b/>
+        </w:rPr>
+        <w:t xml:space="preserve"> MS Access,</w:t>
+      </w:r>
+      <w:r>
+        <w:rPr>
+          <w:b/>
+        </w:rPr>
+        <w:t xml:space="preserve"> </w:t>
+      </w:r>
+      <w:r>
+        <w:rPr>
+          <w:b/>
+        </w:rPr>
+        <w:t>Microsoft Teams, SharePoint, VBA</w:t>
       </w:r>
     </w:p>
     <w:p>
@@ -717,15 +857,29 @@
         </w:numPr>
         <w:rPr>
           <w:rFonts w:ascii="Merriweather" w:eastAsia="Merriweather" w:hAnsi="Merriweather" w:cs="Merriweather"/>
-        </w:rPr>
-      </w:pPr>
-      <w:r>
+          <w:sz w:val="22"/>
+          <w:szCs w:val="22"/>
+        </w:rPr>
+      </w:pPr>
+      <w:r>
+        <w:rPr>
+          <w:sz w:val="22"/>
+          <w:szCs w:val="22"/>
+        </w:rPr>
         <w:t xml:space="preserve">Implemented software </w:t>
       </w:r>
       <w:r>
+        <w:rPr>
+          <w:sz w:val="22"/>
+          <w:szCs w:val="22"/>
+        </w:rPr>
         <w:t>solutions to</w:t>
       </w:r>
       <w:r>
+        <w:rPr>
+          <w:sz w:val="22"/>
+          <w:szCs w:val="22"/>
+        </w:rPr>
         <w:t xml:space="preserve"> better improve the performance of analytics software</w:t>
       </w:r>
     </w:p>
@@ -737,9 +891,15 @@
         </w:numPr>
         <w:rPr>
           <w:rFonts w:ascii="Merriweather" w:eastAsia="Merriweather" w:hAnsi="Merriweather" w:cs="Merriweather"/>
-        </w:rPr>
-      </w:pPr>
-      <w:r>
+          <w:sz w:val="22"/>
+          <w:szCs w:val="22"/>
+        </w:rPr>
+      </w:pPr>
+      <w:r>
+        <w:rPr>
+          <w:sz w:val="22"/>
+          <w:szCs w:val="22"/>
+        </w:rPr>
         <w:t>Created user friendly dashboards in Spotfire that were used in procurement</w:t>
       </w:r>
     </w:p>
@@ -751,10 +911,30 @@
         </w:numPr>
         <w:rPr>
           <w:rFonts w:ascii="Merriweather" w:eastAsia="Merriweather" w:hAnsi="Merriweather" w:cs="Merriweather"/>
-        </w:rPr>
-      </w:pPr>
-      <w:r>
-        <w:t>Worked towards implementing new bank programs with a group of interns</w:t>
+          <w:sz w:val="22"/>
+          <w:szCs w:val="22"/>
+        </w:rPr>
+      </w:pPr>
+      <w:r>
+        <w:rPr>
+          <w:sz w:val="22"/>
+          <w:szCs w:val="22"/>
+        </w:rPr>
+        <w:t xml:space="preserve">Worked towards implementing new bank programs with </w:t>
+      </w:r>
+      <w:r>
+        <w:rPr>
+          <w:sz w:val="22"/>
+          <w:szCs w:val="22"/>
+        </w:rPr>
+        <w:t>other</w:t>
+      </w:r>
+      <w:r>
+        <w:rPr>
+          <w:sz w:val="22"/>
+          <w:szCs w:val="22"/>
+        </w:rPr>
+        <w:t xml:space="preserve"> interns</w:t>
       </w:r>
     </w:p>
     <w:p>
@@ -765,6 +945,10 @@
         </w:numPr>
       </w:pPr>
       <w:r>
+        <w:rPr>
+          <w:sz w:val="22"/>
+          <w:szCs w:val="22"/>
+        </w:rPr>
         <w:t>Executed data cleaning procedures to ensure data quality of customer information and procurement operations</w:t>
       </w:r>
       <w:r>
@@ -783,8 +967,8 @@
         <w:pStyle w:val="Heading2"/>
         <w:spacing w:before="0"/>
       </w:pPr>
-      <w:bookmarkStart w:id="5" w:name="_777yav3jgwst" w:colFirst="0" w:colLast="0"/>
-      <w:bookmarkEnd w:id="5"/>
+      <w:bookmarkStart w:id="4" w:name="_777yav3jgwst" w:colFirst="0" w:colLast="0"/>
+      <w:bookmarkEnd w:id="4"/>
       <w:r>
         <w:rPr>
           <w:sz w:val="22"/>
@@ -880,17 +1064,37 @@
           <w:ilvl w:val="0"/>
           <w:numId w:val="1"/>
         </w:numPr>
-      </w:pPr>
-      <w:r>
+        <w:rPr>
+          <w:sz w:val="22"/>
+          <w:szCs w:val="22"/>
+        </w:rPr>
+      </w:pPr>
+      <w:r>
+        <w:rPr>
+          <w:sz w:val="22"/>
+          <w:szCs w:val="22"/>
+        </w:rPr>
         <w:t>Conducted usability tests to</w:t>
       </w:r>
       <w:r>
+        <w:rPr>
+          <w:sz w:val="22"/>
+          <w:szCs w:val="22"/>
+        </w:rPr>
         <w:t xml:space="preserve"> gather</w:t>
       </w:r>
       <w:r>
+        <w:rPr>
+          <w:sz w:val="22"/>
+          <w:szCs w:val="22"/>
+        </w:rPr>
         <w:t xml:space="preserve"> feedback and</w:t>
       </w:r>
       <w:r>
+        <w:rPr>
+          <w:sz w:val="22"/>
+          <w:szCs w:val="22"/>
+        </w:rPr>
         <w:t xml:space="preserve"> improve mobile user experience</w:t>
       </w:r>
     </w:p>
@@ -900,14 +1104,30 @@
           <w:ilvl w:val="0"/>
           <w:numId w:val="1"/>
         </w:numPr>
-      </w:pPr>
-      <w:r>
+        <w:rPr>
+          <w:sz w:val="22"/>
+          <w:szCs w:val="22"/>
+        </w:rPr>
+      </w:pPr>
+      <w:r>
+        <w:rPr>
+          <w:sz w:val="22"/>
+          <w:szCs w:val="22"/>
+        </w:rPr>
         <w:t>Gathered and compiled c</w:t>
       </w:r>
       <w:r>
+        <w:rPr>
+          <w:sz w:val="22"/>
+          <w:szCs w:val="22"/>
+        </w:rPr>
         <w:t>ompetitive analysis and research</w:t>
       </w:r>
       <w:r>
+        <w:rPr>
+          <w:sz w:val="22"/>
+          <w:szCs w:val="22"/>
+        </w:rPr>
         <w:t xml:space="preserve"> </w:t>
       </w:r>
     </w:p>
@@ -917,8 +1137,16 @@
           <w:ilvl w:val="0"/>
           <w:numId w:val="1"/>
         </w:numPr>
-      </w:pPr>
-      <w:r>
+        <w:rPr>
+          <w:sz w:val="22"/>
+          <w:szCs w:val="22"/>
+        </w:rPr>
+      </w:pPr>
+      <w:r>
+        <w:rPr>
+          <w:sz w:val="22"/>
+          <w:szCs w:val="22"/>
+        </w:rPr>
         <w:t>Created and developed wireframes for a new app, Mockfolio, as part of an Agile team</w:t>
       </w:r>
     </w:p>
@@ -962,10 +1190,20 @@
           <w:szCs w:val="24"/>
         </w:rPr>
       </w:pPr>
-      <w:bookmarkStart w:id="6" w:name="_1stknmt494xx" w:colFirst="0" w:colLast="0"/>
-      <w:bookmarkStart w:id="7" w:name="_7gdmgcujgcw7" w:colFirst="0" w:colLast="0"/>
+      <w:bookmarkStart w:id="5" w:name="_1stknmt494xx" w:colFirst="0" w:colLast="0"/>
+      <w:bookmarkStart w:id="6" w:name="_7gdmgcujgcw7" w:colFirst="0" w:colLast="0"/>
+      <w:bookmarkEnd w:id="5"/>
       <w:bookmarkEnd w:id="6"/>
-      <w:bookmarkEnd w:id="7"/>
+      <w:r>
+        <w:rPr>
+          <w:b w:val="0"/>
+          <w:color w:val="666666"/>
+          <w:sz w:val="20"/>
+          <w:szCs w:val="20"/>
+        </w:rPr>
+        <w:t xml:space="preserve"> </w:t>
+      </w:r>
+      <w:commentRangeStart w:id="7"/>
       <w:commentRangeStart w:id="8"/>
       <w:r>
         <w:rPr>
@@ -974,6 +1212,15 @@
         </w:rPr>
         <w:t>PROJECTS &amp; EXTRA CURRICULAR</w:t>
       </w:r>
+      <w:commentRangeEnd w:id="7"/>
+      <w:r>
+        <w:rPr>
+          <w:rStyle w:val="CommentReference"/>
+          <w:b w:val="0"/>
+          <w:color w:val="666666"/>
+        </w:rPr>
+        <w:commentReference w:id="7"/>
+      </w:r>
       <w:commentRangeEnd w:id="8"/>
       <w:r>
         <w:rPr>
@@ -1060,12 +1307,21 @@
           <w:szCs w:val="22"/>
         </w:rPr>
       </w:pPr>
-      <w:r>
-        <w:rPr>
-          <w:sz w:val="22"/>
-          <w:szCs w:val="22"/>
-        </w:rPr>
-        <w:t xml:space="preserve">ReBurgaBuilder </w:t>
+      <w:proofErr w:type="spellStart"/>
+      <w:r>
+        <w:rPr>
+          <w:sz w:val="22"/>
+          <w:szCs w:val="22"/>
+        </w:rPr>
+        <w:t>ReBurgaBuilder</w:t>
+      </w:r>
+      <w:proofErr w:type="spellEnd"/>
+      <w:r>
+        <w:rPr>
+          <w:sz w:val="22"/>
+          <w:szCs w:val="22"/>
+        </w:rPr>
+        <w:t xml:space="preserve"> </w:t>
       </w:r>
       <w:r>
         <w:rPr>
@@ -1453,6 +1709,12 @@
         <w:rPr>
           <w:b/>
         </w:rPr>
+        <w:t xml:space="preserve"> </w:t>
+      </w:r>
+      <w:r>
+        <w:rPr>
+          <w:b/>
+        </w:rPr>
         <w:t>GIT,</w:t>
       </w:r>
       <w:r>
@@ -1497,8 +1759,13 @@
       </w:pPr>
       <w:bookmarkStart w:id="15" w:name="_k8ji3tsrcf33" w:colFirst="0" w:colLast="0"/>
       <w:bookmarkEnd w:id="15"/>
-      <w:r>
-        <w:t xml:space="preserve">Honours BA Computer Science, </w:t>
+      <w:proofErr w:type="spellStart"/>
+      <w:r>
+        <w:t>Honours</w:t>
+      </w:r>
+      <w:proofErr w:type="spellEnd"/>
+      <w:r>
+        <w:t xml:space="preserve"> BA Computer Science, </w:t>
       </w:r>
       <w:r>
         <w:rPr>
@@ -1561,7 +1828,7 @@
       </w:r>
     </w:p>
   </w:comment>
-  <w:comment w:id="8" w:author="Tyler Noble" w:date="2020-04-07T15:06:00Z" w:initials="TN">
+  <w:comment w:id="7" w:author="Tyler Noble" w:date="2020-04-07T15:06:00Z" w:initials="TN">
     <w:p>
       <w:pPr>
         <w:pStyle w:val="CommentText"/>
@@ -1574,6 +1841,19 @@
       </w:r>
       <w:r>
         <w:t>Shrink this</w:t>
+      </w:r>
+    </w:p>
+  </w:comment>
+  <w:comment w:id="8" w:author="Tyler Noble" w:date="2020-04-14T14:33:00Z" w:initials="TN">
+    <w:p>
+      <w:pPr>
+        <w:pStyle w:val="CommentText"/>
+      </w:pPr>
+      <w:r>
+        <w:rPr>
+          <w:rStyle w:val="CommentReference"/>
+        </w:rPr>
+        <w:annotationRef/>
       </w:r>
     </w:p>
   </w:comment>
@@ -1582,8 +1862,9 @@
 
 <file path=word/commentsExtended.xml><?xml version="1.0" encoding="utf-8"?>
 <w15:commentsEx xmlns:wpc="http://schemas.microsoft.com/office/word/2010/wordprocessingCanvas" xmlns:cx="http://schemas.microsoft.com/office/drawing/2014/chartex" xmlns:cx1="http://schemas.microsoft.com/office/drawing/2015/9/8/chartex" xmlns:cx2="http://schemas.microsoft.com/office/drawing/2015/10/21/chartex" xmlns:cx3="http://schemas.microsoft.com/office/drawing/2016/5/9/chartex" xmlns:cx4="http://schemas.microsoft.com/office/drawing/2016/5/10/chartex" xmlns:cx5="http://schemas.microsoft.com/office/drawing/2016/5/11/chartex" xmlns:cx6="http://schemas.microsoft.com/office/drawing/2016/5/12/chartex" xmlns:cx7="http://schemas.microsoft.com/office/drawing/2016/5/13/chartex" xmlns:cx8="http://schemas.microsoft.com/office/drawing/2016/5/14/chartex" xmlns:mc="http://schemas.openxmlformats.org/markup-compatibility/2006" xmlns:aink="http://schemas.microsoft.com/office/drawing/2016/ink" xmlns:am3d="http://schemas.microsoft.com/office/drawing/2017/model3d" xmlns:o="urn:schemas-microsoft-com:office:office" xmlns:r="http://schemas.openxmlformats.org/officeDocument/2006/relationships" xmlns:m="http://schemas.openxmlformats.org/officeDocument/2006/math" xmlns:v="urn:schemas-microsoft-com:vml" xmlns:wp14="http://schemas.microsoft.com/office/word/2010/wordprocessingDrawing" xmlns:wp="http://schemas.openxmlformats.org/drawingml/2006/wordprocessingDrawing" xmlns:w10="urn:schemas-microsoft-com:office:word" xmlns:w="http://schemas.openxmlformats.org/wordprocessingml/2006/main" xmlns:w14="http://schemas.microsoft.com/office/word/2010/wordml" xmlns:w15="http://schemas.microsoft.com/office/word/2012/wordml" xmlns:w16cid="http://schemas.microsoft.com/office/word/2016/wordml/cid" xmlns:w16se="http://schemas.microsoft.com/office/word/2015/wordml/symex" xmlns:wpg="http://schemas.microsoft.com/office/word/2010/wordprocessingGroup" xmlns:wpi="http://schemas.microsoft.com/office/word/2010/wordprocessingInk" xmlns:wne="http://schemas.microsoft.com/office/word/2006/wordml" xmlns:wps="http://schemas.microsoft.com/office/word/2010/wordprocessingShape" mc:Ignorable="w14 w15 w16se w16cid wp14">
-  <w15:commentEx w15:paraId="09E57C21" w15:done="0"/>
+  <w15:commentEx w15:paraId="09E57C21" w15:done="1"/>
   <w15:commentEx w15:paraId="196AD23E" w15:done="0"/>
+  <w15:commentEx w15:paraId="0EFDA496" w15:paraIdParent="196AD23E" w15:done="0"/>
 </w15:commentsEx>
 </file>
 
@@ -1591,6 +1872,7 @@
 <w16cid:commentsIds xmlns:wpc="http://schemas.microsoft.com/office/word/2010/wordprocessingCanvas" xmlns:cx="http://schemas.microsoft.com/office/drawing/2014/chartex" xmlns:cx1="http://schemas.microsoft.com/office/drawing/2015/9/8/chartex" xmlns:cx2="http://schemas.microsoft.com/office/drawing/2015/10/21/chartex" xmlns:cx3="http://schemas.microsoft.com/office/drawing/2016/5/9/chartex" xmlns:cx4="http://schemas.microsoft.com/office/drawing/2016/5/10/chartex" xmlns:cx5="http://schemas.microsoft.com/office/drawing/2016/5/11/chartex" xmlns:cx6="http://schemas.microsoft.com/office/drawing/2016/5/12/chartex" xmlns:cx7="http://schemas.microsoft.com/office/drawing/2016/5/13/chartex" xmlns:cx8="http://schemas.microsoft.com/office/drawing/2016/5/14/chartex" xmlns:mc="http://schemas.openxmlformats.org/markup-compatibility/2006" xmlns:aink="http://schemas.microsoft.com/office/drawing/2016/ink" xmlns:am3d="http://schemas.microsoft.com/office/drawing/2017/model3d" xmlns:o="urn:schemas-microsoft-com:office:office" xmlns:r="http://schemas.openxmlformats.org/officeDocument/2006/relationships" xmlns:m="http://schemas.openxmlformats.org/officeDocument/2006/math" xmlns:v="urn:schemas-microsoft-com:vml" xmlns:wp14="http://schemas.microsoft.com/office/word/2010/wordprocessingDrawing" xmlns:wp="http://schemas.openxmlformats.org/drawingml/2006/wordprocessingDrawing" xmlns:w10="urn:schemas-microsoft-com:office:word" xmlns:w="http://schemas.openxmlformats.org/wordprocessingml/2006/main" xmlns:w14="http://schemas.microsoft.com/office/word/2010/wordml" xmlns:w15="http://schemas.microsoft.com/office/word/2012/wordml" xmlns:w16cid="http://schemas.microsoft.com/office/word/2016/wordml/cid" xmlns:w16se="http://schemas.microsoft.com/office/word/2015/wordml/symex" xmlns:wpg="http://schemas.microsoft.com/office/word/2010/wordprocessingGroup" xmlns:wpi="http://schemas.microsoft.com/office/word/2010/wordprocessingInk" xmlns:wne="http://schemas.microsoft.com/office/word/2006/wordml" xmlns:wps="http://schemas.microsoft.com/office/word/2010/wordprocessingShape" mc:Ignorable="w14 w15 w16se w16cid wp14">
   <w16cid:commentId w16cid:paraId="09E57C21" w16cid:durableId="22371552"/>
   <w16cid:commentId w16cid:paraId="196AD23E" w16cid:durableId="2237158F"/>
+  <w16cid:commentId w16cid:paraId="0EFDA496" w16cid:durableId="2240483F"/>
 </w16cid:commentsIds>
 </file>
 
@@ -2356,6 +2638,7 @@
   </w:latentStyles>
   <w:style w:type="paragraph" w:default="1" w:styleId="Normal">
     <w:name w:val="Normal"/>
+    <w:rsid w:val="00836EC9"/>
   </w:style>
   <w:style w:type="paragraph" w:styleId="Heading1">
     <w:name w:val="heading 1"/>

</xml_diff>

<commit_message>
Changed up resume according to Kristyana Kern
- You're missing a space between Super Logistical role and Bank of Montreal role
- Add a bullet point before you list the tech you used
- Delete extra bullet point before your LinkedIn
- Add a space between education and your degree so structure is consistent
</commit_message>
<xml_diff>
--- a/Resume/TylerNobleResume.docx
+++ b/Resume/TylerNobleResume.docx
@@ -51,11 +51,7 @@
     </w:p>
     <w:p>
       <w:pPr>
-        <w:numPr>
-          <w:ilvl w:val="0"/>
-          <w:numId w:val="3"/>
-        </w:numPr>
-        <w:jc w:val="center"/>
+        <w:ind w:left="2160" w:firstLine="720"/>
         <w:rPr>
           <w:sz w:val="18"/>
         </w:rPr>
@@ -445,6 +441,9 @@
     <w:p>
       <w:pPr>
         <w:pStyle w:val="Heading2"/>
+        <w:tabs>
+          <w:tab w:val="left" w:pos="2475"/>
+        </w:tabs>
         <w:spacing w:before="0"/>
         <w:ind w:left="714" w:right="301" w:hanging="357"/>
         <w:rPr>
@@ -454,6 +453,20 @@
       </w:pPr>
       <w:bookmarkStart w:id="2" w:name="_f10guox53uzh" w:colFirst="0" w:colLast="0"/>
       <w:bookmarkEnd w:id="2"/>
+      <w:r>
+        <w:rPr>
+          <w:sz w:val="22"/>
+          <w:szCs w:val="22"/>
+        </w:rPr>
+        <w:tab/>
+      </w:r>
+      <w:r>
+        <w:rPr>
+          <w:sz w:val="22"/>
+          <w:szCs w:val="22"/>
+        </w:rPr>
+        <w:tab/>
+      </w:r>
     </w:p>
     <w:p>
       <w:pPr>
@@ -751,11 +764,14 @@
     <w:p>
       <w:pPr>
         <w:ind w:firstLine="0"/>
-      </w:pPr>
-      <w:r>
         <w:rPr>
           <w:b/>
         </w:rPr>
+      </w:pPr>
+      <w:r>
+        <w:rPr>
+          <w:b/>
+        </w:rPr>
         <w:t>Used: Microsoft Excel,</w:t>
       </w:r>
       <w:r>
@@ -776,6 +792,11 @@
         </w:rPr>
         <w:t>Microsoft Teams, SharePoint, VBA</w:t>
       </w:r>
+    </w:p>
+    <w:p>
+      <w:pPr>
+        <w:ind w:firstLine="0"/>
+      </w:pPr>
     </w:p>
     <w:p>
       <w:pPr>
@@ -1752,13 +1773,19 @@
       <w:pPr>
         <w:pStyle w:val="Heading2"/>
         <w:spacing w:before="0"/>
-        <w:rPr>
-          <w:b w:val="0"/>
-          <w:i/>
-        </w:rPr>
       </w:pPr>
       <w:bookmarkStart w:id="15" w:name="_k8ji3tsrcf33" w:colFirst="0" w:colLast="0"/>
       <w:bookmarkEnd w:id="15"/>
+    </w:p>
+    <w:p>
+      <w:pPr>
+        <w:pStyle w:val="Heading2"/>
+        <w:spacing w:before="0"/>
+        <w:rPr>
+          <w:b w:val="0"/>
+          <w:i/>
+        </w:rPr>
+      </w:pPr>
       <w:proofErr w:type="spellStart"/>
       <w:r>
         <w:t>Honours</w:t>

</xml_diff>

<commit_message>
Changed up resume a bit
</commit_message>
<xml_diff>
--- a/Resume/TylerNobleResume.docx
+++ b/Resume/TylerNobleResume.docx
@@ -8,13 +8,13 @@
         <w:jc w:val="center"/>
         <w:rPr>
           <w:sz w:val="32"/>
-          <w:szCs w:val="60"/>
+          <w:szCs w:val="32"/>
         </w:rPr>
       </w:pPr>
       <w:r>
         <w:rPr>
           <w:sz w:val="40"/>
-          <w:szCs w:val="60"/>
+          <w:szCs w:val="40"/>
         </w:rPr>
         <w:t>Tyler Noble</w:t>
       </w:r>
@@ -25,12 +25,14 @@
         <w:rPr>
           <w:b/>
           <w:sz w:val="24"/>
+          <w:szCs w:val="24"/>
         </w:rPr>
       </w:pPr>
       <w:r>
         <w:rPr>
           <w:b/>
           <w:sz w:val="24"/>
+          <w:szCs w:val="24"/>
         </w:rPr>
         <w:t>Software Developer</w:t>
       </w:r>
@@ -54,19 +56,19 @@
         <w:ind w:left="2160" w:firstLine="720"/>
         <w:rPr>
           <w:sz w:val="18"/>
+          <w:szCs w:val="18"/>
         </w:rPr>
       </w:pPr>
       <w:r>
         <w:rPr>
           <w:b/>
           <w:noProof/>
-          <w:lang w:val="en-CA"/>
         </w:rPr>
         <w:drawing>
-          <wp:inline distT="114300" distB="114300" distL="114300" distR="114300" wp14:anchorId="633A0772" wp14:editId="0376C553">
+          <wp:inline distT="114300" distB="114300" distL="114300" distR="114300" wp14:anchorId="1A408A5C" wp14:editId="3908B0A8">
             <wp:extent cx="190500" cy="190500"/>
             <wp:effectExtent l="0" t="0" r="0" b="0"/>
-            <wp:docPr id="3" name="image1.png"/>
+            <wp:docPr id="4" name="image1.png"/>
             <wp:cNvGraphicFramePr/>
             <a:graphic xmlns:a="http://schemas.openxmlformats.org/drawingml/2006/main">
               <a:graphicData uri="http://schemas.openxmlformats.org/drawingml/2006/picture">
@@ -76,7 +78,7 @@
                     <pic:cNvPicPr preferRelativeResize="0"/>
                   </pic:nvPicPr>
                   <pic:blipFill>
-                    <a:blip r:embed="rId5"/>
+                    <a:blip r:embed="rId6"/>
                     <a:srcRect/>
                     <a:stretch>
                       <a:fillRect/>
@@ -104,7 +106,7 @@
         </w:rPr>
         <w:t xml:space="preserve">  </w:t>
       </w:r>
-      <w:hyperlink r:id="rId6">
+      <w:hyperlink r:id="rId7">
         <w:r>
           <w:rPr>
             <w:b/>
@@ -116,17 +118,64 @@
         <w:rPr>
           <w:b/>
         </w:rPr>
-        <w:t xml:space="preserve">  • 💼</w:t>
-      </w:r>
-      <w:hyperlink r:id="rId7" w:history="1">
+        <w:t xml:space="preserve">  •</w:t>
+      </w:r>
+      <w:r>
+        <w:rPr>
+          <w:b/>
+          <w:color w:val="595959" w:themeColor="text1" w:themeTint="A6"/>
+        </w:rPr>
+        <w:t xml:space="preserve"> </w:t>
+      </w:r>
+      <w:sdt>
+        <w:sdtPr>
+          <w:rPr>
+            <w:color w:val="595959" w:themeColor="text1" w:themeTint="A6"/>
+          </w:rPr>
+          <w:tag w:val="goog_rdk_0"/>
+          <w:id w:val="-974607617"/>
+        </w:sdtPr>
+        <w:sdtEndPr/>
+        <w:sdtContent>
+          <w:commentRangeStart w:id="0"/>
+          <w:commentRangeStart w:id="1"/>
+          <w:commentRangeStart w:id="2"/>
+        </w:sdtContent>
+      </w:sdt>
+      <w:r>
+        <w:rPr>
+          <w:b/>
+          <w:color w:val="595959" w:themeColor="text1" w:themeTint="A6"/>
+        </w:rPr>
+        <w:t>💼</w:t>
+      </w:r>
+      <w:hyperlink r:id="rId8">
         <w:r>
           <w:rPr>
-            <w:rStyle w:val="Hyperlink"/>
             <w:b/>
+            <w:color w:val="595959" w:themeColor="text1" w:themeTint="A6"/>
           </w:rPr>
           <w:t xml:space="preserve">NobleTyler.github.io </w:t>
         </w:r>
       </w:hyperlink>
+      <w:commentRangeEnd w:id="2"/>
+      <w:r>
+        <w:commentReference w:id="2"/>
+      </w:r>
+      <w:commentRangeEnd w:id="1"/>
+      <w:r>
+        <w:rPr>
+          <w:rStyle w:val="CommentReference"/>
+        </w:rPr>
+        <w:commentReference w:id="1"/>
+      </w:r>
+      <w:commentRangeEnd w:id="0"/>
+      <w:r>
+        <w:rPr>
+          <w:rStyle w:val="CommentReference"/>
+        </w:rPr>
+        <w:commentReference w:id="0"/>
+      </w:r>
       <w:r>
         <w:rPr>
           <w:b/>
@@ -137,13 +186,12 @@
         <w:rPr>
           <w:b/>
           <w:noProof/>
-          <w:lang w:val="en-CA"/>
         </w:rPr>
         <w:drawing>
-          <wp:inline distT="114300" distB="114300" distL="114300" distR="114300" wp14:anchorId="63E50AD6" wp14:editId="64DDAAE0">
+          <wp:inline distT="114300" distB="114300" distL="114300" distR="114300" wp14:anchorId="1D6DF094" wp14:editId="1DB3258D">
             <wp:extent cx="190500" cy="190500"/>
             <wp:effectExtent l="0" t="0" r="0" b="0"/>
-            <wp:docPr id="2" name="image2.png"/>
+            <wp:docPr id="5" name="image2.png"/>
             <wp:cNvGraphicFramePr/>
             <a:graphic xmlns:a="http://schemas.openxmlformats.org/drawingml/2006/main">
               <a:graphicData uri="http://schemas.openxmlformats.org/drawingml/2006/picture">
@@ -153,7 +201,7 @@
                     <pic:cNvPicPr preferRelativeResize="0"/>
                   </pic:nvPicPr>
                   <pic:blipFill>
-                    <a:blip r:embed="rId8"/>
+                    <a:blip r:embed="rId12"/>
                     <a:srcRect/>
                     <a:stretch>
                       <a:fillRect/>
@@ -181,7 +229,7 @@
         </w:rPr>
         <w:t xml:space="preserve"> </w:t>
       </w:r>
-      <w:hyperlink r:id="rId9">
+      <w:hyperlink r:id="rId13">
         <w:proofErr w:type="spellStart"/>
         <w:r>
           <w:rPr>
@@ -192,19 +240,30 @@
         <w:proofErr w:type="spellEnd"/>
       </w:hyperlink>
     </w:p>
+    <w:bookmarkStart w:id="3" w:name="_heading=h.gjdgxs" w:colFirst="0" w:colLast="0"/>
+    <w:bookmarkEnd w:id="3"/>
     <w:p>
       <w:pPr>
         <w:pStyle w:val="Heading1"/>
         <w:pBdr>
-          <w:bottom w:val="single" w:sz="4" w:space="1" w:color="auto"/>
+          <w:bottom w:val="single" w:sz="4" w:space="1" w:color="000000"/>
         </w:pBdr>
         <w:rPr>
           <w:sz w:val="24"/>
           <w:szCs w:val="24"/>
         </w:rPr>
       </w:pPr>
-      <w:bookmarkStart w:id="0" w:name="_c0rghulzkw3a" w:colFirst="0" w:colLast="0"/>
-      <w:bookmarkEnd w:id="0"/>
+      <w:sdt>
+        <w:sdtPr>
+          <w:tag w:val="goog_rdk_1"/>
+          <w:id w:val="1348146978"/>
+        </w:sdtPr>
+        <w:sdtEndPr/>
+        <w:sdtContent>
+          <w:commentRangeStart w:id="4"/>
+          <w:commentRangeStart w:id="5"/>
+        </w:sdtContent>
+      </w:sdt>
       <w:r>
         <w:rPr>
           <w:sz w:val="24"/>
@@ -212,12 +271,34 @@
         </w:rPr>
         <w:t>TECHNICAL SKILLS</w:t>
       </w:r>
+      <w:commentRangeEnd w:id="5"/>
+      <w:r>
+        <w:commentReference w:id="5"/>
+      </w:r>
+      <w:commentRangeEnd w:id="4"/>
+      <w:r>
+        <w:rPr>
+          <w:rStyle w:val="CommentReference"/>
+          <w:b w:val="0"/>
+          <w:color w:val="666666"/>
+        </w:rPr>
+        <w:commentReference w:id="4"/>
+      </w:r>
     </w:p>
     <w:tbl>
       <w:tblPr>
-        <w:tblStyle w:val="PlainTable1"/>
-        <w:tblW w:w="10200" w:type="dxa"/>
+        <w:tblStyle w:val="a1"/>
+        <w:tblW w:w="9951" w:type="dxa"/>
         <w:tblInd w:w="534" w:type="dxa"/>
+        <w:tblBorders>
+          <w:top w:val="single" w:sz="4" w:space="0" w:color="7F7F7F"/>
+          <w:left w:val="single" w:sz="4" w:space="0" w:color="BFBFBF"/>
+          <w:bottom w:val="single" w:sz="4" w:space="0" w:color="7F7F7F"/>
+          <w:right w:val="single" w:sz="4" w:space="0" w:color="BFBFBF"/>
+          <w:insideH w:val="single" w:sz="4" w:space="0" w:color="BFBFBF"/>
+          <w:insideV w:val="single" w:sz="4" w:space="0" w:color="BFBFBF"/>
+        </w:tblBorders>
+        <w:tblLayout w:type="fixed"/>
         <w:tblLook w:val="0200" w:firstRow="0" w:lastRow="0" w:firstColumn="0" w:lastColumn="0" w:noHBand="1" w:noVBand="0"/>
       </w:tblPr>
       <w:tblGrid>
@@ -225,7 +306,7 @@
         <w:gridCol w:w="2281"/>
         <w:gridCol w:w="2281"/>
         <w:gridCol w:w="2281"/>
-        <w:gridCol w:w="1624"/>
+        <w:gridCol w:w="1375"/>
       </w:tblGrid>
       <w:tr>
         <w:trPr>
@@ -236,15 +317,15 @@
             <w:cnfStyle w:val="000010000000" w:firstRow="0" w:lastRow="0" w:firstColumn="0" w:lastColumn="0" w:oddVBand="1" w:evenVBand="0" w:oddHBand="0" w:evenHBand="0" w:firstRowFirstColumn="0" w:firstRowLastColumn="0" w:lastRowFirstColumn="0" w:lastRowLastColumn="0"/>
             <w:tcW w:w="1733" w:type="dxa"/>
             <w:tcBorders>
-              <w:bottom w:val="single" w:sz="2" w:space="0" w:color="auto"/>
+              <w:bottom w:val="single" w:sz="4" w:space="0" w:color="000000"/>
             </w:tcBorders>
           </w:tcPr>
           <w:p>
             <w:pPr>
               <w:ind w:left="0" w:firstLine="0"/>
             </w:pPr>
-            <w:bookmarkStart w:id="1" w:name="_mduttf3ljmet" w:colFirst="0" w:colLast="0"/>
-            <w:bookmarkEnd w:id="1"/>
+            <w:bookmarkStart w:id="6" w:name="_heading=h.30j0zll" w:colFirst="0" w:colLast="0"/>
+            <w:bookmarkEnd w:id="6"/>
             <w:r>
               <w:t>Java</w:t>
             </w:r>
@@ -254,7 +335,7 @@
           <w:tcPr>
             <w:tcW w:w="2281" w:type="dxa"/>
             <w:tcBorders>
-              <w:bottom w:val="single" w:sz="2" w:space="0" w:color="auto"/>
+              <w:bottom w:val="single" w:sz="4" w:space="0" w:color="000000"/>
             </w:tcBorders>
           </w:tcPr>
           <w:p>
@@ -272,7 +353,7 @@
             <w:cnfStyle w:val="000010000000" w:firstRow="0" w:lastRow="0" w:firstColumn="0" w:lastColumn="0" w:oddVBand="1" w:evenVBand="0" w:oddHBand="0" w:evenHBand="0" w:firstRowFirstColumn="0" w:firstRowLastColumn="0" w:lastRowFirstColumn="0" w:lastRowLastColumn="0"/>
             <w:tcW w:w="2281" w:type="dxa"/>
             <w:tcBorders>
-              <w:bottom w:val="single" w:sz="2" w:space="0" w:color="auto"/>
+              <w:bottom w:val="single" w:sz="4" w:space="0" w:color="000000"/>
             </w:tcBorders>
           </w:tcPr>
           <w:p>
@@ -288,7 +369,7 @@
           <w:tcPr>
             <w:tcW w:w="2281" w:type="dxa"/>
             <w:tcBorders>
-              <w:bottom w:val="single" w:sz="2" w:space="0" w:color="auto"/>
+              <w:bottom w:val="single" w:sz="4" w:space="0" w:color="000000"/>
             </w:tcBorders>
           </w:tcPr>
           <w:p>
@@ -304,9 +385,9 @@
         <w:tc>
           <w:tcPr>
             <w:cnfStyle w:val="000010000000" w:firstRow="0" w:lastRow="0" w:firstColumn="0" w:lastColumn="0" w:oddVBand="1" w:evenVBand="0" w:oddHBand="0" w:evenHBand="0" w:firstRowFirstColumn="0" w:firstRowLastColumn="0" w:lastRowFirstColumn="0" w:lastRowLastColumn="0"/>
-            <w:tcW w:w="1624" w:type="dxa"/>
+            <w:tcW w:w="1375" w:type="dxa"/>
             <w:tcBorders>
-              <w:bottom w:val="single" w:sz="2" w:space="0" w:color="auto"/>
+              <w:bottom w:val="single" w:sz="4" w:space="0" w:color="000000"/>
             </w:tcBorders>
           </w:tcPr>
           <w:p>
@@ -321,14 +402,14 @@
       </w:tr>
       <w:tr>
         <w:trPr>
-          <w:trHeight w:val="318"/>
+          <w:trHeight w:val="284"/>
         </w:trPr>
         <w:tc>
           <w:tcPr>
             <w:cnfStyle w:val="000010000000" w:firstRow="0" w:lastRow="0" w:firstColumn="0" w:lastColumn="0" w:oddVBand="1" w:evenVBand="0" w:oddHBand="0" w:evenHBand="0" w:firstRowFirstColumn="0" w:firstRowLastColumn="0" w:lastRowFirstColumn="0" w:lastRowLastColumn="0"/>
             <w:tcW w:w="1733" w:type="dxa"/>
             <w:tcBorders>
-              <w:top w:val="single" w:sz="2" w:space="0" w:color="auto"/>
+              <w:top w:val="single" w:sz="4" w:space="0" w:color="000000"/>
             </w:tcBorders>
           </w:tcPr>
           <w:p>
@@ -344,7 +425,7 @@
           <w:tcPr>
             <w:tcW w:w="2281" w:type="dxa"/>
             <w:tcBorders>
-              <w:top w:val="single" w:sz="2" w:space="0" w:color="auto"/>
+              <w:top w:val="single" w:sz="4" w:space="0" w:color="000000"/>
             </w:tcBorders>
           </w:tcPr>
           <w:p>
@@ -362,7 +443,7 @@
             <w:cnfStyle w:val="000010000000" w:firstRow="0" w:lastRow="0" w:firstColumn="0" w:lastColumn="0" w:oddVBand="1" w:evenVBand="0" w:oddHBand="0" w:evenHBand="0" w:firstRowFirstColumn="0" w:firstRowLastColumn="0" w:lastRowFirstColumn="0" w:lastRowLastColumn="0"/>
             <w:tcW w:w="2281" w:type="dxa"/>
             <w:tcBorders>
-              <w:top w:val="single" w:sz="2" w:space="0" w:color="auto"/>
+              <w:top w:val="single" w:sz="4" w:space="0" w:color="000000"/>
             </w:tcBorders>
           </w:tcPr>
           <w:p>
@@ -378,7 +459,7 @@
           <w:tcPr>
             <w:tcW w:w="2281" w:type="dxa"/>
             <w:tcBorders>
-              <w:top w:val="single" w:sz="2" w:space="0" w:color="auto"/>
+              <w:top w:val="single" w:sz="4" w:space="0" w:color="000000"/>
             </w:tcBorders>
           </w:tcPr>
           <w:p>
@@ -394,9 +475,9 @@
         <w:tc>
           <w:tcPr>
             <w:cnfStyle w:val="000010000000" w:firstRow="0" w:lastRow="0" w:firstColumn="0" w:lastColumn="0" w:oddVBand="1" w:evenVBand="0" w:oddHBand="0" w:evenHBand="0" w:firstRowFirstColumn="0" w:firstRowLastColumn="0" w:lastRowFirstColumn="0" w:lastRowLastColumn="0"/>
-            <w:tcW w:w="1624" w:type="dxa"/>
+            <w:tcW w:w="1375" w:type="dxa"/>
             <w:tcBorders>
-              <w:top w:val="single" w:sz="2" w:space="0" w:color="auto"/>
+              <w:top w:val="single" w:sz="4" w:space="0" w:color="000000"/>
             </w:tcBorders>
           </w:tcPr>
           <w:p>
@@ -404,7 +485,7 @@
               <w:ind w:left="0" w:firstLine="0"/>
             </w:pPr>
             <w:r>
-              <w:t>CSS3/HTML5</w:t>
+              <w:t>CSS/HTML</w:t>
             </w:r>
           </w:p>
         </w:tc>
@@ -414,7 +495,7 @@
       <w:pPr>
         <w:pStyle w:val="Heading1"/>
         <w:pBdr>
-          <w:bottom w:val="single" w:sz="4" w:space="1" w:color="auto"/>
+          <w:bottom w:val="single" w:sz="4" w:space="1" w:color="000000"/>
         </w:pBdr>
         <w:rPr>
           <w:sz w:val="24"/>
@@ -451,8 +532,8 @@
           <w:szCs w:val="22"/>
         </w:rPr>
       </w:pPr>
-      <w:bookmarkStart w:id="2" w:name="_f10guox53uzh" w:colFirst="0" w:colLast="0"/>
-      <w:bookmarkEnd w:id="2"/>
+      <w:bookmarkStart w:id="7" w:name="_heading=h.1fob9te" w:colFirst="0" w:colLast="0"/>
+      <w:bookmarkEnd w:id="7"/>
       <w:r>
         <w:rPr>
           <w:sz w:val="22"/>
@@ -505,44 +586,20 @@
         <w:rPr>
           <w:b w:val="0"/>
         </w:rPr>
-        <w:t xml:space="preserve">                               </w:t>
+        <w:t xml:space="preserve">                                     </w:t>
       </w:r>
       <w:r>
         <w:rPr>
           <w:b w:val="0"/>
         </w:rPr>
-        <w:t xml:space="preserve">      </w:t>
+        <w:tab/>
       </w:r>
       <w:r>
         <w:rPr>
           <w:b w:val="0"/>
         </w:rPr>
         <w:tab/>
-      </w:r>
-      <w:r>
-        <w:rPr>
-          <w:b w:val="0"/>
-        </w:rPr>
-        <w:tab/>
-        <w:t xml:space="preserve">     </w:t>
-      </w:r>
-      <w:r>
-        <w:rPr>
-          <w:b w:val="0"/>
-        </w:rPr>
-        <w:t xml:space="preserve"> </w:t>
-      </w:r>
-      <w:r>
-        <w:rPr>
-          <w:b w:val="0"/>
-        </w:rPr>
-        <w:t xml:space="preserve">    </w:t>
-      </w:r>
-      <w:r>
-        <w:rPr>
-          <w:b w:val="0"/>
-        </w:rPr>
-        <w:t xml:space="preserve"> </w:t>
+        <w:t xml:space="preserve">           </w:t>
       </w:r>
       <w:r>
         <w:rPr>
@@ -551,16 +608,7 @@
           <w:sz w:val="22"/>
           <w:szCs w:val="22"/>
         </w:rPr>
-        <w:t xml:space="preserve">September 2019 – </w:t>
-      </w:r>
-      <w:r>
-        <w:rPr>
-          <w:b w:val="0"/>
-          <w:color w:val="666666"/>
-          <w:sz w:val="22"/>
-          <w:szCs w:val="22"/>
-        </w:rPr>
-        <w:t>March 2020</w:t>
+        <w:t>September 2019 – March 2020</w:t>
       </w:r>
     </w:p>
     <w:p>
@@ -574,62 +622,20 @@
           <w:szCs w:val="22"/>
         </w:rPr>
       </w:pPr>
-      <w:commentRangeStart w:id="3"/>
-      <w:r>
-        <w:rPr>
-          <w:sz w:val="22"/>
-          <w:szCs w:val="22"/>
-        </w:rPr>
-        <w:t>Architect</w:t>
-      </w:r>
-      <w:r>
-        <w:rPr>
-          <w:sz w:val="22"/>
-          <w:szCs w:val="22"/>
-        </w:rPr>
-        <w:t>ed</w:t>
-      </w:r>
-      <w:r>
-        <w:rPr>
-          <w:sz w:val="22"/>
-          <w:szCs w:val="22"/>
-        </w:rPr>
-        <w:t xml:space="preserve"> and design</w:t>
-      </w:r>
-      <w:r>
-        <w:rPr>
-          <w:sz w:val="22"/>
-          <w:szCs w:val="22"/>
-        </w:rPr>
-        <w:t>ed</w:t>
-      </w:r>
-      <w:r>
-        <w:rPr>
-          <w:sz w:val="22"/>
-          <w:szCs w:val="22"/>
-        </w:rPr>
-        <w:t xml:space="preserve"> </w:t>
-      </w:r>
-      <w:r>
-        <w:rPr>
-          <w:sz w:val="22"/>
-          <w:szCs w:val="22"/>
-        </w:rPr>
-        <w:t>system for facilitation of supply chain management solution</w:t>
-      </w:r>
-      <w:r>
-        <w:rPr>
-          <w:sz w:val="22"/>
-          <w:szCs w:val="22"/>
-        </w:rPr>
-        <w:t>s</w:t>
-      </w:r>
-      <w:r>
-        <w:rPr>
-          <w:sz w:val="22"/>
-          <w:szCs w:val="22"/>
-        </w:rPr>
-        <w:t xml:space="preserve">  </w:t>
+      <w:sdt>
+        <w:sdtPr>
+          <w:tag w:val="goog_rdk_2"/>
+          <w:id w:val="222111090"/>
+        </w:sdtPr>
+        <w:sdtEndPr/>
+        <w:sdtContent/>
+      </w:sdt>
+      <w:r>
+        <w:rPr>
+          <w:sz w:val="22"/>
+          <w:szCs w:val="22"/>
+        </w:rPr>
+        <w:t xml:space="preserve">Architected and designed system for facilitation of supply chain management solutions  </w:t>
       </w:r>
     </w:p>
     <w:p>
@@ -648,79 +654,7 @@
           <w:sz w:val="22"/>
           <w:szCs w:val="22"/>
         </w:rPr>
-        <w:t>Design</w:t>
-      </w:r>
-      <w:r>
-        <w:rPr>
-          <w:sz w:val="22"/>
-          <w:szCs w:val="22"/>
-        </w:rPr>
-        <w:t>ed</w:t>
-      </w:r>
-      <w:r>
-        <w:rPr>
-          <w:sz w:val="22"/>
-          <w:szCs w:val="22"/>
-        </w:rPr>
-        <w:t xml:space="preserve"> and implement</w:t>
-      </w:r>
-      <w:r>
-        <w:rPr>
-          <w:sz w:val="22"/>
-          <w:szCs w:val="22"/>
-        </w:rPr>
-        <w:t>ed</w:t>
-      </w:r>
-      <w:r>
-        <w:rPr>
-          <w:sz w:val="22"/>
-          <w:szCs w:val="22"/>
-        </w:rPr>
-        <w:t xml:space="preserve"> </w:t>
-      </w:r>
-      <w:r>
-        <w:rPr>
-          <w:sz w:val="22"/>
-          <w:szCs w:val="22"/>
-        </w:rPr>
-        <w:t xml:space="preserve">a </w:t>
-      </w:r>
-      <w:r>
-        <w:rPr>
-          <w:sz w:val="22"/>
-          <w:szCs w:val="22"/>
-        </w:rPr>
-        <w:t>knowledge base system</w:t>
-      </w:r>
-      <w:r>
-        <w:rPr>
-          <w:sz w:val="22"/>
-          <w:szCs w:val="22"/>
-        </w:rPr>
-        <w:t xml:space="preserve"> for </w:t>
-      </w:r>
-      <w:r>
-        <w:rPr>
-          <w:sz w:val="22"/>
-          <w:szCs w:val="22"/>
-        </w:rPr>
-        <w:t xml:space="preserve">standardized </w:t>
-      </w:r>
-      <w:r>
-        <w:rPr>
-          <w:sz w:val="22"/>
-          <w:szCs w:val="22"/>
-        </w:rPr>
-        <w:t xml:space="preserve">documentation </w:t>
-      </w:r>
-      <w:commentRangeEnd w:id="3"/>
-      <w:r>
-        <w:rPr>
-          <w:rStyle w:val="CommentReference"/>
-          <w:sz w:val="18"/>
-          <w:szCs w:val="18"/>
-        </w:rPr>
-        <w:commentReference w:id="3"/>
+        <w:t xml:space="preserve">Designed and implemented a knowledge base system for standardized documentation </w:t>
       </w:r>
     </w:p>
     <w:p>
@@ -768,29 +702,29 @@
           <w:b/>
         </w:rPr>
       </w:pPr>
+      <w:sdt>
+        <w:sdtPr>
+          <w:tag w:val="goog_rdk_3"/>
+          <w:id w:val="767809911"/>
+          <w:showingPlcHdr/>
+        </w:sdtPr>
+        <w:sdtEndPr/>
+        <w:sdtContent>
+          <w:r>
+            <w:t xml:space="preserve">     </w:t>
+          </w:r>
+          <w:commentRangeStart w:id="8"/>
+        </w:sdtContent>
+      </w:sdt>
       <w:r>
         <w:rPr>
           <w:b/>
         </w:rPr>
-        <w:t>Used: Microsoft Excel,</w:t>
-      </w:r>
-      <w:r>
-        <w:rPr>
-          <w:b/>
-        </w:rPr>
-        <w:t xml:space="preserve"> MS Access,</w:t>
-      </w:r>
-      <w:r>
-        <w:rPr>
-          <w:b/>
-        </w:rPr>
-        <w:t xml:space="preserve"> </w:t>
-      </w:r>
-      <w:r>
-        <w:rPr>
-          <w:b/>
-        </w:rPr>
-        <w:t>Microsoft Teams, SharePoint, VBA</w:t>
+        <w:t>Used: Microsoft Excel, MS Access, Microsoft Teams, SharePoint, VBA</w:t>
+      </w:r>
+      <w:commentRangeEnd w:id="8"/>
+      <w:r>
+        <w:commentReference w:id="8"/>
       </w:r>
     </w:p>
     <w:p>
@@ -831,43 +765,7 @@
           <w:sz w:val="22"/>
           <w:szCs w:val="22"/>
         </w:rPr>
-        <w:t xml:space="preserve"> </w:t>
-      </w:r>
-      <w:r>
-        <w:rPr>
-          <w:b w:val="0"/>
-          <w:color w:val="666666"/>
-          <w:sz w:val="22"/>
-          <w:szCs w:val="22"/>
-        </w:rPr>
-        <w:t xml:space="preserve">  </w:t>
-      </w:r>
-      <w:r>
-        <w:rPr>
-          <w:b w:val="0"/>
-          <w:color w:val="666666"/>
-          <w:sz w:val="22"/>
-          <w:szCs w:val="22"/>
-        </w:rPr>
-        <w:t xml:space="preserve">                                                                            </w:t>
-      </w:r>
-      <w:r>
-        <w:rPr>
-          <w:b w:val="0"/>
-          <w:color w:val="666666"/>
-          <w:sz w:val="22"/>
-          <w:szCs w:val="22"/>
-        </w:rPr>
-        <w:t xml:space="preserve">       </w:t>
-      </w:r>
-      <w:r>
-        <w:rPr>
-          <w:b w:val="0"/>
-          <w:color w:val="666666"/>
-          <w:sz w:val="22"/>
-          <w:szCs w:val="22"/>
-        </w:rPr>
-        <w:t xml:space="preserve">   May 2018 – August 2018</w:t>
+        <w:t xml:space="preserve">                                                                                         May 2018 – August 2018</w:t>
       </w:r>
     </w:p>
     <w:p>
@@ -887,21 +785,7 @@
           <w:sz w:val="22"/>
           <w:szCs w:val="22"/>
         </w:rPr>
-        <w:t xml:space="preserve">Implemented software </w:t>
-      </w:r>
-      <w:r>
-        <w:rPr>
-          <w:sz w:val="22"/>
-          <w:szCs w:val="22"/>
-        </w:rPr>
-        <w:t>solutions to</w:t>
-      </w:r>
-      <w:r>
-        <w:rPr>
-          <w:sz w:val="22"/>
-          <w:szCs w:val="22"/>
-        </w:rPr>
-        <w:t xml:space="preserve"> better improve the performance of analytics software</w:t>
+        <w:t>Implemented software solutions to better improve the performance of analytics software</w:t>
       </w:r>
     </w:p>
     <w:p>
@@ -941,21 +825,7 @@
           <w:sz w:val="22"/>
           <w:szCs w:val="22"/>
         </w:rPr>
-        <w:t xml:space="preserve">Worked towards implementing new bank programs with </w:t>
-      </w:r>
-      <w:r>
-        <w:rPr>
-          <w:sz w:val="22"/>
-          <w:szCs w:val="22"/>
-        </w:rPr>
-        <w:t>other</w:t>
-      </w:r>
-      <w:r>
-        <w:rPr>
-          <w:sz w:val="22"/>
-          <w:szCs w:val="22"/>
-        </w:rPr>
-        <w:t xml:space="preserve"> interns</w:t>
+        <w:t>Worked towards implementing new bank programs with other interns</w:t>
       </w:r>
     </w:p>
     <w:p>
@@ -965,21 +835,67 @@
           <w:numId w:val="1"/>
         </w:numPr>
       </w:pPr>
-      <w:r>
-        <w:rPr>
-          <w:sz w:val="22"/>
-          <w:szCs w:val="22"/>
-        </w:rPr>
-        <w:t>Executed data cleaning procedures to ensure data quality of customer information and procurement operations</w:t>
-      </w:r>
-      <w:r>
+      <w:commentRangeStart w:id="9"/>
+      <w:r>
+        <w:rPr>
+          <w:rFonts w:asciiTheme="majorHAnsi" w:hAnsiTheme="majorHAnsi" w:cstheme="majorHAnsi"/>
+          <w:sz w:val="22"/>
+          <w:szCs w:val="22"/>
+        </w:rPr>
+        <w:t>Executed</w:t>
+      </w:r>
+      <w:commentRangeEnd w:id="9"/>
+      <w:r>
+        <w:rPr>
+          <w:rFonts w:asciiTheme="majorHAnsi" w:hAnsiTheme="majorHAnsi" w:cstheme="majorHAnsi"/>
+        </w:rPr>
+        <w:commentReference w:id="9"/>
+      </w:r>
+      <w:r>
+        <w:rPr>
+          <w:rFonts w:asciiTheme="majorHAnsi" w:hAnsiTheme="majorHAnsi" w:cstheme="majorHAnsi"/>
+          <w:sz w:val="22"/>
+          <w:szCs w:val="22"/>
+        </w:rPr>
+        <w:t xml:space="preserve"> data cleaning procedures to ensure data quality of customer information and procurement operations</w:t>
+      </w:r>
+      <w:r>
+        <w:rPr>
+          <w:rFonts w:asciiTheme="majorHAnsi" w:hAnsiTheme="majorHAnsi" w:cstheme="majorHAnsi"/>
+        </w:rPr>
         <w:br/>
       </w:r>
+      <w:sdt>
+        <w:sdtPr>
+          <w:tag w:val="goog_rdk_5"/>
+          <w:id w:val="1198506054"/>
+          <w:showingPlcHdr/>
+        </w:sdtPr>
+        <w:sdtEndPr/>
+        <w:sdtContent>
+          <w:r>
+            <w:t xml:space="preserve">     </w:t>
+          </w:r>
+          <w:commentRangeStart w:id="10"/>
+        </w:sdtContent>
+      </w:sdt>
       <w:r>
         <w:rPr>
           <w:b/>
         </w:rPr>
-        <w:t>Used: Microsoft Excel, Google Analytics, HTML, JavaScript, Spotfire and IronPython</w:t>
+        <w:t xml:space="preserve">Used: Microsoft Excel, Google Analytics, HTML, JavaScript, Spotfire and </w:t>
+      </w:r>
+      <w:proofErr w:type="spellStart"/>
+      <w:r>
+        <w:rPr>
+          <w:b/>
+        </w:rPr>
+        <w:t>IronPython</w:t>
+      </w:r>
+      <w:commentRangeEnd w:id="10"/>
+      <w:proofErr w:type="spellEnd"/>
+      <w:r>
+        <w:commentReference w:id="10"/>
       </w:r>
     </w:p>
     <w:p/>
@@ -988,8 +904,8 @@
         <w:pStyle w:val="Heading2"/>
         <w:spacing w:before="0"/>
       </w:pPr>
-      <w:bookmarkStart w:id="4" w:name="_777yav3jgwst" w:colFirst="0" w:colLast="0"/>
-      <w:bookmarkEnd w:id="4"/>
+      <w:bookmarkStart w:id="11" w:name="_heading=h.3znysh7" w:colFirst="0" w:colLast="0"/>
+      <w:bookmarkEnd w:id="11"/>
       <w:r>
         <w:rPr>
           <w:sz w:val="22"/>
@@ -1013,70 +929,7 @@
           <w:sz w:val="22"/>
           <w:szCs w:val="22"/>
         </w:rPr>
-        <w:t xml:space="preserve">                            </w:t>
-      </w:r>
-      <w:r>
-        <w:rPr>
-          <w:b w:val="0"/>
-          <w:color w:val="666666"/>
-          <w:sz w:val="22"/>
-          <w:szCs w:val="22"/>
-        </w:rPr>
-        <w:t xml:space="preserve">                                             </w:t>
-      </w:r>
-      <w:r>
-        <w:rPr>
-          <w:b w:val="0"/>
-          <w:color w:val="666666"/>
-          <w:sz w:val="22"/>
-          <w:szCs w:val="22"/>
-        </w:rPr>
-        <w:t xml:space="preserve">    </w:t>
-      </w:r>
-      <w:r>
-        <w:rPr>
-          <w:b w:val="0"/>
-          <w:color w:val="666666"/>
-          <w:sz w:val="22"/>
-          <w:szCs w:val="22"/>
-        </w:rPr>
-        <w:t xml:space="preserve">        </w:t>
-      </w:r>
-      <w:r>
-        <w:rPr>
-          <w:b w:val="0"/>
-          <w:color w:val="666666"/>
-          <w:sz w:val="22"/>
-          <w:szCs w:val="22"/>
-        </w:rPr>
-        <w:t xml:space="preserve"> </w:t>
-      </w:r>
-      <w:r>
-        <w:rPr>
-          <w:b w:val="0"/>
-          <w:color w:val="666666"/>
-          <w:sz w:val="22"/>
-          <w:szCs w:val="22"/>
-        </w:rPr>
-        <w:t xml:space="preserve">    May 2017 </w:t>
-      </w:r>
-      <w:r>
-        <w:rPr>
-          <w:b w:val="0"/>
-          <w:color w:val="666666"/>
-          <w:sz w:val="22"/>
-          <w:szCs w:val="22"/>
-        </w:rPr>
-        <w:t>–</w:t>
-      </w:r>
-      <w:r>
-        <w:rPr>
-          <w:b w:val="0"/>
-          <w:color w:val="666666"/>
-          <w:sz w:val="22"/>
-          <w:szCs w:val="22"/>
-        </w:rPr>
-        <w:t xml:space="preserve"> August 2017</w:t>
+        <w:t xml:space="preserve">                                                                                          May 2017 – August 2017</w:t>
       </w:r>
     </w:p>
     <w:p>
@@ -1095,28 +948,7 @@
           <w:sz w:val="22"/>
           <w:szCs w:val="22"/>
         </w:rPr>
-        <w:t>Conducted usability tests to</w:t>
-      </w:r>
-      <w:r>
-        <w:rPr>
-          <w:sz w:val="22"/>
-          <w:szCs w:val="22"/>
-        </w:rPr>
-        <w:t xml:space="preserve"> gather</w:t>
-      </w:r>
-      <w:r>
-        <w:rPr>
-          <w:sz w:val="22"/>
-          <w:szCs w:val="22"/>
-        </w:rPr>
-        <w:t xml:space="preserve"> feedback and</w:t>
-      </w:r>
-      <w:r>
-        <w:rPr>
-          <w:sz w:val="22"/>
-          <w:szCs w:val="22"/>
-        </w:rPr>
-        <w:t xml:space="preserve"> improve mobile user experience</w:t>
+        <w:t>Conducted usability tests to gather feedback and improve mobile user experience</w:t>
       </w:r>
     </w:p>
     <w:p>
@@ -1135,21 +967,7 @@
           <w:sz w:val="22"/>
           <w:szCs w:val="22"/>
         </w:rPr>
-        <w:t>Gathered and compiled c</w:t>
-      </w:r>
-      <w:r>
-        <w:rPr>
-          <w:sz w:val="22"/>
-          <w:szCs w:val="22"/>
-        </w:rPr>
-        <w:t>ompetitive analysis and research</w:t>
-      </w:r>
-      <w:r>
-        <w:rPr>
-          <w:sz w:val="22"/>
-          <w:szCs w:val="22"/>
-        </w:rPr>
-        <w:t xml:space="preserve"> </w:t>
+        <w:t xml:space="preserve">Gathered and compiled competitive analysis and research </w:t>
       </w:r>
     </w:p>
     <w:p>
@@ -1168,7 +986,23 @@
           <w:sz w:val="22"/>
           <w:szCs w:val="22"/>
         </w:rPr>
-        <w:t>Created and developed wireframes for a new app, Mockfolio, as part of an Agile team</w:t>
+        <w:t xml:space="preserve">Created and developed wireframes for a new app, </w:t>
+      </w:r>
+      <w:proofErr w:type="spellStart"/>
+      <w:r>
+        <w:rPr>
+          <w:sz w:val="22"/>
+          <w:szCs w:val="22"/>
+        </w:rPr>
+        <w:t>Mockfolio</w:t>
+      </w:r>
+      <w:proofErr w:type="spellEnd"/>
+      <w:r>
+        <w:rPr>
+          <w:sz w:val="22"/>
+          <w:szCs w:val="22"/>
+        </w:rPr>
+        <w:t>, as part of an Agile team</w:t>
       </w:r>
     </w:p>
     <w:p>
@@ -1178,6 +1012,31 @@
           <w:b/>
         </w:rPr>
       </w:pPr>
+      <w:sdt>
+        <w:sdtPr>
+          <w:rPr>
+            <w:rFonts w:asciiTheme="majorHAnsi" w:hAnsiTheme="majorHAnsi" w:cstheme="majorHAnsi"/>
+          </w:rPr>
+          <w:tag w:val="goog_rdk_4"/>
+          <w:id w:val="200752569"/>
+          <w:showingPlcHdr/>
+        </w:sdtPr>
+        <w:sdtEndPr/>
+        <w:sdtContent>
+          <w:r>
+            <w:rPr>
+              <w:rFonts w:asciiTheme="majorHAnsi" w:hAnsiTheme="majorHAnsi" w:cstheme="majorHAnsi"/>
+            </w:rPr>
+            <w:t xml:space="preserve">     </w:t>
+          </w:r>
+        </w:sdtContent>
+      </w:sdt>
+      <w:r>
+        <w:rPr>
+          <w:b/>
+        </w:rPr>
+        <w:t xml:space="preserve"> </w:t>
+      </w:r>
       <w:r>
         <w:rPr>
           <w:b/>
@@ -1204,17 +1063,15 @@
       <w:pPr>
         <w:pStyle w:val="Heading1"/>
         <w:pBdr>
-          <w:bottom w:val="single" w:sz="4" w:space="1" w:color="auto"/>
+          <w:bottom w:val="single" w:sz="4" w:space="1" w:color="000000"/>
         </w:pBdr>
         <w:rPr>
           <w:sz w:val="24"/>
           <w:szCs w:val="24"/>
         </w:rPr>
       </w:pPr>
-      <w:bookmarkStart w:id="5" w:name="_1stknmt494xx" w:colFirst="0" w:colLast="0"/>
-      <w:bookmarkStart w:id="6" w:name="_7gdmgcujgcw7" w:colFirst="0" w:colLast="0"/>
-      <w:bookmarkEnd w:id="5"/>
-      <w:bookmarkEnd w:id="6"/>
+      <w:bookmarkStart w:id="12" w:name="_heading=h.2et92p0" w:colFirst="0" w:colLast="0"/>
+      <w:bookmarkEnd w:id="12"/>
       <w:r>
         <w:rPr>
           <w:b w:val="0"/>
@@ -1224,8 +1081,22 @@
         </w:rPr>
         <w:t xml:space="preserve"> </w:t>
       </w:r>
-      <w:commentRangeStart w:id="7"/>
-      <w:commentRangeStart w:id="8"/>
+      <w:sdt>
+        <w:sdtPr>
+          <w:tag w:val="goog_rdk_6"/>
+          <w:id w:val="1460150362"/>
+        </w:sdtPr>
+        <w:sdtEndPr/>
+        <w:sdtContent/>
+      </w:sdt>
+      <w:sdt>
+        <w:sdtPr>
+          <w:tag w:val="goog_rdk_7"/>
+          <w:id w:val="1856846707"/>
+        </w:sdtPr>
+        <w:sdtEndPr/>
+        <w:sdtContent/>
+      </w:sdt>
       <w:r>
         <w:rPr>
           <w:sz w:val="24"/>
@@ -1233,36 +1104,390 @@
         </w:rPr>
         <w:t>PROJECTS &amp; EXTRA CURRICULAR</w:t>
       </w:r>
-      <w:commentRangeEnd w:id="7"/>
+    </w:p>
+    <w:p>
+      <w:pPr>
+        <w:pStyle w:val="Heading2"/>
+        <w:spacing w:before="0"/>
+        <w:rPr>
+          <w:sz w:val="22"/>
+          <w:szCs w:val="22"/>
+        </w:rPr>
+      </w:pPr>
+      <w:bookmarkStart w:id="13" w:name="_heading=h.tyjcwt" w:colFirst="0" w:colLast="0"/>
+      <w:bookmarkEnd w:id="13"/>
+    </w:p>
+    <w:p>
+      <w:pPr>
+        <w:pStyle w:val="Heading2"/>
+        <w:spacing w:before="0"/>
+        <w:rPr>
+          <w:b w:val="0"/>
+        </w:rPr>
+      </w:pPr>
+      <w:r>
+        <w:rPr>
+          <w:sz w:val="22"/>
+          <w:szCs w:val="22"/>
+        </w:rPr>
+        <w:t>Agile Scrum Certification</w:t>
+      </w:r>
+      <w:r>
+        <w:t xml:space="preserve">                                                                                                                        </w:t>
+      </w:r>
+      <w:r>
+        <w:rPr>
+          <w:b w:val="0"/>
+          <w:color w:val="666666"/>
+          <w:sz w:val="22"/>
+          <w:szCs w:val="22"/>
+        </w:rPr>
+        <w:t>November 2019</w:t>
+      </w:r>
+    </w:p>
+    <w:p>
+      <w:r>
+        <w:t>Participated in a workshop run by Agile Starts, which teaches the basics of the Scrum framework</w:t>
+      </w:r>
+      <w:r>
+        <w:br/>
+      </w:r>
+    </w:p>
+    <w:p>
+      <w:pPr>
+        <w:pStyle w:val="Heading2"/>
+        <w:spacing w:before="0"/>
+        <w:rPr>
+          <w:b w:val="0"/>
+          <w:sz w:val="22"/>
+          <w:szCs w:val="22"/>
+        </w:rPr>
+      </w:pPr>
+      <w:proofErr w:type="spellStart"/>
+      <w:r>
+        <w:rPr>
+          <w:sz w:val="22"/>
+          <w:szCs w:val="22"/>
+        </w:rPr>
+        <w:t>ReBurgaBuilder</w:t>
+      </w:r>
+      <w:proofErr w:type="spellEnd"/>
+      <w:r>
+        <w:rPr>
+          <w:sz w:val="22"/>
+          <w:szCs w:val="22"/>
+        </w:rPr>
+        <w:t xml:space="preserve"> </w:t>
+      </w:r>
+      <w:r>
+        <w:rPr>
+          <w:b w:val="0"/>
+          <w:sz w:val="22"/>
+          <w:szCs w:val="22"/>
+        </w:rPr>
+        <w:t xml:space="preserve">                                                     </w:t>
+      </w:r>
+      <w:r>
+        <w:rPr>
+          <w:b w:val="0"/>
+          <w:sz w:val="22"/>
+          <w:szCs w:val="22"/>
+        </w:rPr>
+        <w:tab/>
+      </w:r>
+      <w:r>
+        <w:rPr>
+          <w:b w:val="0"/>
+          <w:sz w:val="22"/>
+          <w:szCs w:val="22"/>
+        </w:rPr>
+        <w:tab/>
+      </w:r>
+      <w:r>
+        <w:rPr>
+          <w:b w:val="0"/>
+          <w:sz w:val="22"/>
+          <w:szCs w:val="22"/>
+        </w:rPr>
+        <w:tab/>
+      </w:r>
+      <w:r>
+        <w:rPr>
+          <w:b w:val="0"/>
+          <w:sz w:val="22"/>
+          <w:szCs w:val="22"/>
+        </w:rPr>
+        <w:tab/>
+      </w:r>
+      <w:r>
+        <w:rPr>
+          <w:b w:val="0"/>
+          <w:sz w:val="22"/>
+          <w:szCs w:val="22"/>
+        </w:rPr>
+        <w:tab/>
+      </w:r>
+      <w:r>
+        <w:rPr>
+          <w:b w:val="0"/>
+          <w:sz w:val="22"/>
+          <w:szCs w:val="22"/>
+        </w:rPr>
+        <w:t xml:space="preserve">         </w:t>
+      </w:r>
+      <w:r>
+        <w:rPr>
+          <w:b w:val="0"/>
+          <w:sz w:val="22"/>
+          <w:szCs w:val="22"/>
+        </w:rPr>
+        <w:t xml:space="preserve"> </w:t>
+      </w:r>
+      <w:sdt>
+        <w:sdtPr>
+          <w:tag w:val="goog_rdk_8"/>
+          <w:id w:val="-943455679"/>
+        </w:sdtPr>
+        <w:sdtEndPr/>
+        <w:sdtContent>
+          <w:commentRangeStart w:id="14"/>
+        </w:sdtContent>
+      </w:sdt>
+      <w:r>
+        <w:rPr>
+          <w:b w:val="0"/>
+          <w:sz w:val="22"/>
+          <w:szCs w:val="22"/>
+        </w:rPr>
+        <w:t>J</w:t>
+      </w:r>
+      <w:r>
+        <w:rPr>
+          <w:b w:val="0"/>
+          <w:color w:val="666666"/>
+          <w:sz w:val="22"/>
+          <w:szCs w:val="22"/>
+        </w:rPr>
+        <w:t>anuary 2020 – Ongoing</w:t>
+      </w:r>
+      <w:commentRangeEnd w:id="14"/>
+      <w:r>
+        <w:commentReference w:id="14"/>
+      </w:r>
+    </w:p>
+    <w:p>
+      <w:pPr>
+        <w:ind w:left="357" w:right="301" w:firstLine="0"/>
+      </w:pPr>
+      <w:r>
+        <w:t>Developed and deployed a burger building single page application using React.js</w:t>
+      </w:r>
+    </w:p>
+    <w:p>
+      <w:bookmarkStart w:id="15" w:name="_heading=h.3dy6vkm" w:colFirst="0" w:colLast="0"/>
+      <w:bookmarkEnd w:id="15"/>
+      <w:r>
+        <w:rPr>
+          <w:b/>
+        </w:rPr>
+        <w:t>Used: React.JS, Redux, Firebase, NPM, React Hooks</w:t>
+      </w:r>
+      <w:r>
+        <w:rPr>
+          <w:b/>
+        </w:rPr>
+        <w:br/>
+      </w:r>
+    </w:p>
+    <w:p>
+      <w:pPr>
+        <w:pStyle w:val="Heading2"/>
+        <w:spacing w:before="0"/>
+        <w:rPr>
+          <w:b w:val="0"/>
+          <w:sz w:val="22"/>
+          <w:szCs w:val="22"/>
+        </w:rPr>
+      </w:pPr>
+      <w:bookmarkStart w:id="16" w:name="_heading=h.1t3h5sf" w:colFirst="0" w:colLast="0"/>
+      <w:bookmarkEnd w:id="16"/>
+      <w:r>
+        <w:rPr>
+          <w:sz w:val="22"/>
+          <w:szCs w:val="22"/>
+        </w:rPr>
+        <w:t>FreshBooks</w:t>
+      </w:r>
+      <w:r>
+        <w:rPr>
+          <w:b w:val="0"/>
+          <w:sz w:val="22"/>
+          <w:szCs w:val="22"/>
+        </w:rPr>
+        <w:t xml:space="preserve">                                                                                                                                          J</w:t>
+      </w:r>
+      <w:r>
+        <w:rPr>
+          <w:b w:val="0"/>
+          <w:color w:val="666666"/>
+          <w:sz w:val="22"/>
+          <w:szCs w:val="22"/>
+        </w:rPr>
+        <w:t>anuary 2018 – May 2018</w:t>
+      </w:r>
+    </w:p>
+    <w:p>
+      <w:r>
+        <w:t>Worked effectively with a team to create an online bookstore with a complete frontend and backend</w:t>
+      </w:r>
+    </w:p>
+    <w:p>
+      <w:pPr>
+        <w:rPr>
+          <w:b/>
+          <w:sz w:val="16"/>
+          <w:szCs w:val="16"/>
+        </w:rPr>
+      </w:pPr>
+      <w:r>
+        <w:rPr>
+          <w:b/>
+        </w:rPr>
+        <w:t>Used: Java, Apache, SQL, XAMPP, CSS, JavaScript, AJAX</w:t>
+      </w:r>
+      <w:r>
+        <w:rPr>
+          <w:b/>
+        </w:rPr>
+        <w:br/>
+      </w:r>
+    </w:p>
+    <w:p>
+      <w:pPr>
+        <w:pStyle w:val="Heading2"/>
+        <w:spacing w:before="0"/>
+        <w:rPr>
+          <w:sz w:val="22"/>
+          <w:szCs w:val="22"/>
+        </w:rPr>
+      </w:pPr>
+      <w:bookmarkStart w:id="17" w:name="_heading=h.4d34og8" w:colFirst="0" w:colLast="0"/>
+      <w:bookmarkEnd w:id="17"/>
+      <w:r>
+        <w:rPr>
+          <w:sz w:val="22"/>
+          <w:szCs w:val="22"/>
+        </w:rPr>
+        <w:t>GitHub Workshop</w:t>
+      </w:r>
+      <w:r>
+        <w:rPr>
+          <w:b w:val="0"/>
+          <w:sz w:val="22"/>
+          <w:szCs w:val="22"/>
+        </w:rPr>
+        <w:t xml:space="preserve">                                                                                                                                                          </w:t>
+      </w:r>
+      <w:r>
+        <w:rPr>
+          <w:b w:val="0"/>
+          <w:color w:val="666666"/>
+          <w:sz w:val="22"/>
+          <w:szCs w:val="22"/>
+        </w:rPr>
+        <w:t>May 2017</w:t>
+      </w:r>
+    </w:p>
+    <w:p>
+      <w:pPr>
+        <w:ind w:left="357" w:right="301" w:firstLine="0"/>
+      </w:pPr>
+      <w:r>
+        <w:t>Created, facilitated and led multiple workshops at York University partnering with WISE (</w:t>
+      </w:r>
+      <w:r>
+        <w:rPr>
+          <w:i/>
+        </w:rPr>
+        <w:t xml:space="preserve">Women in Science and Engineering) </w:t>
+      </w:r>
+      <w:r>
+        <w:t>to teach Git and related technologies</w:t>
+      </w:r>
+    </w:p>
+    <w:p>
+      <w:r>
+        <w:rPr>
+          <w:b/>
+        </w:rPr>
+        <w:t>Used: GitHub, GIT, PowerPoint</w:t>
+      </w:r>
+      <w:r>
+        <w:br/>
+      </w:r>
+    </w:p>
+    <w:bookmarkStart w:id="18" w:name="_heading=h.2s8eyo1" w:colFirst="0" w:colLast="0"/>
+    <w:bookmarkEnd w:id="18"/>
+    <w:p>
+      <w:pPr>
+        <w:pStyle w:val="Heading1"/>
+        <w:pBdr>
+          <w:bottom w:val="single" w:sz="4" w:space="1" w:color="000000"/>
+        </w:pBdr>
+        <w:rPr>
+          <w:sz w:val="24"/>
+          <w:szCs w:val="24"/>
+        </w:rPr>
+      </w:pPr>
+      <w:sdt>
+        <w:sdtPr>
+          <w:tag w:val="goog_rdk_9"/>
+          <w:id w:val="161055718"/>
+        </w:sdtPr>
+        <w:sdtEndPr/>
+        <w:sdtContent>
+          <w:commentRangeStart w:id="19"/>
+          <w:commentRangeStart w:id="20"/>
+          <w:commentRangeStart w:id="21"/>
+        </w:sdtContent>
+      </w:sdt>
+      <w:r>
+        <w:rPr>
+          <w:sz w:val="24"/>
+          <w:szCs w:val="24"/>
+        </w:rPr>
+        <w:t>EDUCATION</w:t>
+      </w:r>
+      <w:commentRangeEnd w:id="21"/>
+      <w:r>
+        <w:commentReference w:id="21"/>
+      </w:r>
+      <w:commentRangeEnd w:id="20"/>
       <w:r>
         <w:rPr>
           <w:rStyle w:val="CommentReference"/>
           <w:b w:val="0"/>
           <w:color w:val="666666"/>
         </w:rPr>
-        <w:commentReference w:id="7"/>
-      </w:r>
-      <w:commentRangeEnd w:id="8"/>
+        <w:commentReference w:id="20"/>
+      </w:r>
+      <w:commentRangeEnd w:id="19"/>
       <w:r>
         <w:rPr>
           <w:rStyle w:val="CommentReference"/>
           <w:b w:val="0"/>
           <w:color w:val="666666"/>
         </w:rPr>
-        <w:commentReference w:id="8"/>
+        <w:commentReference w:id="19"/>
       </w:r>
     </w:p>
     <w:p>
       <w:pPr>
         <w:pStyle w:val="Heading2"/>
         <w:spacing w:before="0"/>
-        <w:rPr>
-          <w:sz w:val="22"/>
-          <w:szCs w:val="22"/>
-        </w:rPr>
-      </w:pPr>
-      <w:bookmarkStart w:id="9" w:name="_fnirtl6h3dhp" w:colFirst="0" w:colLast="0"/>
-      <w:bookmarkEnd w:id="9"/>
+      </w:pPr>
+      <w:bookmarkStart w:id="22" w:name="_heading=h.17dp8vu" w:colFirst="0" w:colLast="0"/>
+      <w:bookmarkEnd w:id="22"/>
     </w:p>
     <w:p>
       <w:pPr>
@@ -1270,539 +1495,26 @@
         <w:spacing w:before="0"/>
         <w:rPr>
           <w:b w:val="0"/>
-        </w:rPr>
-      </w:pPr>
-      <w:r>
-        <w:rPr>
-          <w:sz w:val="22"/>
-          <w:szCs w:val="22"/>
-        </w:rPr>
-        <w:t>Agile Scrum Certification</w:t>
-      </w:r>
-      <w:r>
-        <w:t xml:space="preserve">                                 </w:t>
-      </w:r>
-      <w:r>
-        <w:t xml:space="preserve"> </w:t>
-      </w:r>
-      <w:r>
-        <w:t xml:space="preserve">                                                                            </w:t>
-      </w:r>
-      <w:r>
-        <w:t xml:space="preserve">          </w:t>
-      </w:r>
-      <w:r>
-        <w:rPr>
-          <w:b w:val="0"/>
-          <w:color w:val="666666"/>
-          <w:sz w:val="22"/>
-          <w:szCs w:val="22"/>
-        </w:rPr>
-        <w:t>November</w:t>
-      </w:r>
-      <w:r>
-        <w:rPr>
-          <w:b w:val="0"/>
-          <w:color w:val="666666"/>
-          <w:sz w:val="22"/>
-          <w:szCs w:val="22"/>
-        </w:rPr>
-        <w:t xml:space="preserve"> 2019</w:t>
-      </w:r>
-    </w:p>
-    <w:p>
-      <w:r>
-        <w:t>Participated in a workshop run by Agile Starts, which teaches the basics of the Scrum framework</w:t>
-      </w:r>
-      <w:r>
-        <w:br/>
-      </w:r>
-    </w:p>
-    <w:p>
-      <w:pPr>
-        <w:pStyle w:val="Heading2"/>
-        <w:spacing w:before="0"/>
-        <w:rPr>
-          <w:b w:val="0"/>
-          <w:sz w:val="22"/>
-          <w:szCs w:val="22"/>
-        </w:rPr>
-      </w:pPr>
+          <w:i/>
+        </w:rPr>
+      </w:pPr>
+      <w:bookmarkStart w:id="23" w:name="_heading=h.3rdcrjn" w:colFirst="0" w:colLast="0"/>
+      <w:bookmarkEnd w:id="23"/>
       <w:proofErr w:type="spellStart"/>
       <w:r>
-        <w:rPr>
-          <w:sz w:val="22"/>
-          <w:szCs w:val="22"/>
-        </w:rPr>
-        <w:t>ReBurgaBuilder</w:t>
+        <w:t>Honours</w:t>
       </w:r>
       <w:proofErr w:type="spellEnd"/>
       <w:r>
-        <w:rPr>
-          <w:sz w:val="22"/>
-          <w:szCs w:val="22"/>
-        </w:rPr>
-        <w:t xml:space="preserve"> </w:t>
-      </w:r>
-      <w:r>
-        <w:rPr>
-          <w:b w:val="0"/>
-          <w:sz w:val="22"/>
-          <w:szCs w:val="22"/>
-        </w:rPr>
-        <w:t xml:space="preserve">                  </w:t>
-      </w:r>
-      <w:r>
-        <w:rPr>
-          <w:b w:val="0"/>
-          <w:sz w:val="22"/>
-          <w:szCs w:val="22"/>
-        </w:rPr>
-        <w:t xml:space="preserve">                                   </w:t>
-      </w:r>
-      <w:r>
-        <w:rPr>
-          <w:b w:val="0"/>
-          <w:sz w:val="22"/>
-          <w:szCs w:val="22"/>
-        </w:rPr>
-        <w:tab/>
-      </w:r>
-      <w:r>
-        <w:rPr>
-          <w:b w:val="0"/>
-          <w:sz w:val="22"/>
-          <w:szCs w:val="22"/>
-        </w:rPr>
-        <w:tab/>
-      </w:r>
-      <w:r>
-        <w:rPr>
-          <w:b w:val="0"/>
-          <w:sz w:val="22"/>
-          <w:szCs w:val="22"/>
-        </w:rPr>
-        <w:tab/>
-      </w:r>
-      <w:r>
-        <w:rPr>
-          <w:b w:val="0"/>
-          <w:sz w:val="22"/>
-          <w:szCs w:val="22"/>
-        </w:rPr>
-        <w:tab/>
-      </w:r>
-      <w:r>
-        <w:rPr>
-          <w:b w:val="0"/>
-          <w:sz w:val="22"/>
-          <w:szCs w:val="22"/>
-        </w:rPr>
-        <w:tab/>
-        <w:t xml:space="preserve"> J</w:t>
-      </w:r>
-      <w:r>
-        <w:rPr>
-          <w:b w:val="0"/>
-          <w:color w:val="666666"/>
-          <w:sz w:val="22"/>
-          <w:szCs w:val="22"/>
-        </w:rPr>
-        <w:t>anuary 2020 – Ongoing</w:t>
-      </w:r>
-    </w:p>
-    <w:p>
-      <w:pPr>
-        <w:ind w:left="357" w:right="301" w:firstLine="0"/>
-      </w:pPr>
-      <w:r>
-        <w:t>Developed and deployed a burger building single page application using React.js</w:t>
-      </w:r>
-    </w:p>
-    <w:p>
-      <w:r>
-        <w:rPr>
-          <w:b/>
-        </w:rPr>
-        <w:t>Used: React.JS, Redux, Firebase, NPM</w:t>
-      </w:r>
-      <w:r>
-        <w:rPr>
-          <w:b/>
-        </w:rPr>
-        <w:t>, React Hooks</w:t>
-      </w:r>
-      <w:r>
-        <w:rPr>
-          <w:b/>
-        </w:rPr>
-        <w:br/>
-      </w:r>
-      <w:bookmarkStart w:id="10" w:name="_gvrnwzclsnm7" w:colFirst="0" w:colLast="0"/>
-      <w:bookmarkStart w:id="11" w:name="_xojk11sepuxy" w:colFirst="0" w:colLast="0"/>
-      <w:bookmarkEnd w:id="10"/>
-      <w:bookmarkEnd w:id="11"/>
-    </w:p>
-    <w:p>
-      <w:pPr>
-        <w:pStyle w:val="Heading2"/>
-        <w:spacing w:before="0"/>
-        <w:rPr>
-          <w:b w:val="0"/>
-          <w:sz w:val="22"/>
-          <w:szCs w:val="22"/>
-        </w:rPr>
-      </w:pPr>
-      <w:bookmarkStart w:id="12" w:name="_mxkhnzcefnoy" w:colFirst="0" w:colLast="0"/>
-      <w:bookmarkEnd w:id="12"/>
-      <w:r>
-        <w:rPr>
-          <w:sz w:val="22"/>
-          <w:szCs w:val="22"/>
-        </w:rPr>
-        <w:t>FreshBooks</w:t>
-      </w:r>
-      <w:r>
-        <w:rPr>
-          <w:b w:val="0"/>
-          <w:sz w:val="22"/>
-          <w:szCs w:val="22"/>
-        </w:rPr>
-        <w:t xml:space="preserve">                            </w:t>
-      </w:r>
-      <w:r>
-        <w:rPr>
-          <w:b w:val="0"/>
-          <w:sz w:val="22"/>
-          <w:szCs w:val="22"/>
-        </w:rPr>
-        <w:t xml:space="preserve">                    </w:t>
-      </w:r>
-      <w:r>
-        <w:rPr>
-          <w:b w:val="0"/>
-          <w:sz w:val="22"/>
-          <w:szCs w:val="22"/>
-        </w:rPr>
-        <w:t xml:space="preserve">                                                                             </w:t>
-      </w:r>
-      <w:r>
-        <w:rPr>
-          <w:b w:val="0"/>
-          <w:sz w:val="22"/>
-          <w:szCs w:val="22"/>
-        </w:rPr>
-        <w:t xml:space="preserve">     </w:t>
-      </w:r>
-      <w:r>
-        <w:rPr>
-          <w:b w:val="0"/>
-          <w:sz w:val="22"/>
-          <w:szCs w:val="22"/>
-        </w:rPr>
-        <w:t xml:space="preserve">    </w:t>
-      </w:r>
-      <w:r>
-        <w:rPr>
-          <w:b w:val="0"/>
-          <w:sz w:val="22"/>
-          <w:szCs w:val="22"/>
-        </w:rPr>
-        <w:t xml:space="preserve">   </w:t>
-      </w:r>
-      <w:r>
-        <w:rPr>
-          <w:b w:val="0"/>
-          <w:sz w:val="22"/>
-          <w:szCs w:val="22"/>
-        </w:rPr>
-        <w:t xml:space="preserve"> J</w:t>
-      </w:r>
-      <w:r>
-        <w:rPr>
-          <w:b w:val="0"/>
-          <w:color w:val="666666"/>
-          <w:sz w:val="22"/>
-          <w:szCs w:val="22"/>
-        </w:rPr>
-        <w:t>anuary 2018</w:t>
-      </w:r>
-      <w:r>
-        <w:rPr>
-          <w:b w:val="0"/>
-          <w:color w:val="666666"/>
-          <w:sz w:val="22"/>
-          <w:szCs w:val="22"/>
-        </w:rPr>
-        <w:t xml:space="preserve"> – </w:t>
-      </w:r>
-      <w:r>
-        <w:rPr>
-          <w:b w:val="0"/>
-          <w:color w:val="666666"/>
-          <w:sz w:val="22"/>
-          <w:szCs w:val="22"/>
-        </w:rPr>
-        <w:t>M</w:t>
-      </w:r>
-      <w:r>
-        <w:rPr>
-          <w:b w:val="0"/>
-          <w:color w:val="666666"/>
-          <w:sz w:val="22"/>
-          <w:szCs w:val="22"/>
-        </w:rPr>
-        <w:t>ay 2018</w:t>
-      </w:r>
-    </w:p>
-    <w:p>
-      <w:r>
-        <w:t>Worked effectively with a</w:t>
-      </w:r>
-      <w:r>
-        <w:t xml:space="preserve"> team to create an </w:t>
-      </w:r>
-      <w:r>
-        <w:t>online bookstore</w:t>
-      </w:r>
-      <w:r>
-        <w:t xml:space="preserve"> with a complete frontend and backend</w:t>
-      </w:r>
-    </w:p>
-    <w:p>
-      <w:pPr>
-        <w:rPr>
-          <w:b/>
-          <w:sz w:val="16"/>
-          <w:szCs w:val="16"/>
-        </w:rPr>
-      </w:pPr>
-      <w:r>
-        <w:rPr>
-          <w:b/>
-        </w:rPr>
-        <w:t>Used: Java,</w:t>
-      </w:r>
-      <w:r>
-        <w:rPr>
-          <w:b/>
-        </w:rPr>
-        <w:t xml:space="preserve"> </w:t>
-      </w:r>
-      <w:r>
-        <w:rPr>
-          <w:b/>
-        </w:rPr>
-        <w:t>Apache, SQL, XAMPP, CSS, JavaScript, AJAX</w:t>
-      </w:r>
-      <w:r>
-        <w:rPr>
-          <w:b/>
-        </w:rPr>
-        <w:br/>
-      </w:r>
-    </w:p>
-    <w:p>
-      <w:pPr>
-        <w:pStyle w:val="Heading2"/>
-        <w:spacing w:before="0"/>
-        <w:rPr>
-          <w:sz w:val="22"/>
-          <w:szCs w:val="22"/>
-        </w:rPr>
-      </w:pPr>
-      <w:bookmarkStart w:id="13" w:name="_rtdolc8vpvmb" w:colFirst="0" w:colLast="0"/>
-      <w:bookmarkEnd w:id="13"/>
-      <w:r>
-        <w:rPr>
-          <w:sz w:val="22"/>
-          <w:szCs w:val="22"/>
-        </w:rPr>
-        <w:t>GitHub Workshop</w:t>
-      </w:r>
-      <w:r>
-        <w:rPr>
-          <w:b w:val="0"/>
-          <w:sz w:val="22"/>
-          <w:szCs w:val="22"/>
-        </w:rPr>
-        <w:t xml:space="preserve">              </w:t>
-      </w:r>
-      <w:r>
-        <w:rPr>
-          <w:b w:val="0"/>
-          <w:sz w:val="22"/>
-          <w:szCs w:val="22"/>
-        </w:rPr>
-        <w:t xml:space="preserve">                                                                                                                                  </w:t>
-      </w:r>
-      <w:r>
-        <w:rPr>
-          <w:b w:val="0"/>
-          <w:sz w:val="22"/>
-          <w:szCs w:val="22"/>
-        </w:rPr>
-        <w:t xml:space="preserve">          </w:t>
-      </w:r>
-      <w:r>
-        <w:rPr>
-          <w:b w:val="0"/>
-          <w:color w:val="666666"/>
-          <w:sz w:val="22"/>
-          <w:szCs w:val="22"/>
-        </w:rPr>
-        <w:t xml:space="preserve">May </w:t>
-      </w:r>
-      <w:r>
-        <w:rPr>
-          <w:b w:val="0"/>
-          <w:color w:val="666666"/>
-          <w:sz w:val="22"/>
-          <w:szCs w:val="22"/>
-        </w:rPr>
-        <w:t>2017</w:t>
-      </w:r>
-    </w:p>
-    <w:p>
-      <w:pPr>
-        <w:ind w:left="357" w:right="301" w:firstLine="0"/>
-      </w:pPr>
-      <w:r>
-        <w:t xml:space="preserve">Created, </w:t>
-      </w:r>
-      <w:r>
-        <w:t>facilitated</w:t>
-      </w:r>
-      <w:r>
-        <w:t xml:space="preserve"> and led</w:t>
-      </w:r>
-      <w:r>
-        <w:t xml:space="preserve"> multiple workshops at York University partnering with WISE (</w:t>
-      </w:r>
-      <w:r>
-        <w:rPr>
-          <w:i/>
-        </w:rPr>
-        <w:t>W</w:t>
-      </w:r>
-      <w:r>
-        <w:rPr>
-          <w:i/>
-        </w:rPr>
-        <w:t xml:space="preserve">omen </w:t>
-      </w:r>
-      <w:r>
-        <w:rPr>
-          <w:i/>
-        </w:rPr>
-        <w:t>in Science and</w:t>
-      </w:r>
-      <w:r>
-        <w:rPr>
-          <w:i/>
-        </w:rPr>
-        <w:t xml:space="preserve"> Engineering</w:t>
-      </w:r>
-      <w:r>
-        <w:rPr>
-          <w:i/>
-        </w:rPr>
-        <w:t xml:space="preserve">) </w:t>
-      </w:r>
-      <w:r>
-        <w:t>to teach Git and related technologies</w:t>
-      </w:r>
-    </w:p>
-    <w:p>
-      <w:r>
-        <w:rPr>
-          <w:b/>
-        </w:rPr>
-        <w:t>Used: GitH</w:t>
-      </w:r>
-      <w:r>
-        <w:rPr>
-          <w:b/>
-        </w:rPr>
-        <w:t>ub,</w:t>
-      </w:r>
-      <w:r>
-        <w:rPr>
-          <w:b/>
-        </w:rPr>
-        <w:t xml:space="preserve"> </w:t>
-      </w:r>
-      <w:r>
-        <w:rPr>
-          <w:b/>
-        </w:rPr>
-        <w:t>GIT,</w:t>
-      </w:r>
-      <w:r>
-        <w:rPr>
-          <w:b/>
-        </w:rPr>
-        <w:t xml:space="preserve"> PowerPoint</w:t>
-      </w:r>
-      <w:r>
-        <w:br/>
-      </w:r>
-    </w:p>
-    <w:p>
-      <w:pPr>
-        <w:pStyle w:val="Heading1"/>
-        <w:pBdr>
-          <w:bottom w:val="single" w:sz="4" w:space="1" w:color="auto"/>
-        </w:pBdr>
-        <w:rPr>
-          <w:sz w:val="24"/>
-          <w:szCs w:val="24"/>
-        </w:rPr>
-      </w:pPr>
-      <w:bookmarkStart w:id="14" w:name="_yhlm05wj74dv" w:colFirst="0" w:colLast="0"/>
-      <w:bookmarkEnd w:id="14"/>
-      <w:r>
-        <w:rPr>
-          <w:sz w:val="24"/>
-          <w:szCs w:val="24"/>
-        </w:rPr>
-        <w:t>EDUCATION</w:t>
-      </w:r>
-    </w:p>
-    <w:p>
-      <w:pPr>
-        <w:pStyle w:val="Heading2"/>
-        <w:spacing w:before="0"/>
-      </w:pPr>
-      <w:bookmarkStart w:id="15" w:name="_k8ji3tsrcf33" w:colFirst="0" w:colLast="0"/>
-      <w:bookmarkEnd w:id="15"/>
-    </w:p>
-    <w:p>
-      <w:pPr>
-        <w:pStyle w:val="Heading2"/>
-        <w:spacing w:before="0"/>
+        <w:t xml:space="preserve"> BA Computer Science, </w:t>
+      </w:r>
+      <w:r>
         <w:rPr>
           <w:b w:val="0"/>
           <w:i/>
         </w:rPr>
-      </w:pPr>
-      <w:proofErr w:type="spellStart"/>
-      <w:r>
-        <w:t>Honours</w:t>
-      </w:r>
-      <w:proofErr w:type="spellEnd"/>
-      <w:r>
-        <w:t xml:space="preserve"> BA Computer Science, </w:t>
-      </w:r>
-      <w:r>
-        <w:rPr>
-          <w:b w:val="0"/>
-          <w:i/>
-        </w:rPr>
         <w:t>Lassonde School of Engineering-York University</w:t>
       </w:r>
-      <w:bookmarkStart w:id="16" w:name="_uyi92t8snhda" w:colFirst="0" w:colLast="0"/>
-      <w:bookmarkEnd w:id="16"/>
     </w:p>
     <w:p>
       <w:pPr>
@@ -1824,7 +1536,21 @@
           <w:sz w:val="18"/>
           <w:szCs w:val="18"/>
         </w:rPr>
-        <w:t>Graduated February 2019</w:t>
+        <w:t>Graduated</w:t>
+      </w:r>
+      <w:r>
+        <w:rPr>
+          <w:sz w:val="18"/>
+          <w:szCs w:val="18"/>
+        </w:rPr>
+        <w:t xml:space="preserve"> in</w:t>
+      </w:r>
+      <w:r>
+        <w:rPr>
+          <w:sz w:val="18"/>
+          <w:szCs w:val="18"/>
+        </w:rPr>
+        <w:t xml:space="preserve"> 2019</w:t>
       </w:r>
     </w:p>
     <w:sectPr>
@@ -1839,7 +1565,36 @@
 
 <file path=word/comments.xml><?xml version="1.0" encoding="utf-8"?>
 <w:comments xmlns:wpc="http://schemas.microsoft.com/office/word/2010/wordprocessingCanvas" xmlns:cx="http://schemas.microsoft.com/office/drawing/2014/chartex" xmlns:cx1="http://schemas.microsoft.com/office/drawing/2015/9/8/chartex" xmlns:cx2="http://schemas.microsoft.com/office/drawing/2015/10/21/chartex" xmlns:cx3="http://schemas.microsoft.com/office/drawing/2016/5/9/chartex" xmlns:cx4="http://schemas.microsoft.com/office/drawing/2016/5/10/chartex" xmlns:cx5="http://schemas.microsoft.com/office/drawing/2016/5/11/chartex" xmlns:cx6="http://schemas.microsoft.com/office/drawing/2016/5/12/chartex" xmlns:cx7="http://schemas.microsoft.com/office/drawing/2016/5/13/chartex" xmlns:cx8="http://schemas.microsoft.com/office/drawing/2016/5/14/chartex" xmlns:mc="http://schemas.openxmlformats.org/markup-compatibility/2006" xmlns:aink="http://schemas.microsoft.com/office/drawing/2016/ink" xmlns:am3d="http://schemas.microsoft.com/office/drawing/2017/model3d" xmlns:o="urn:schemas-microsoft-com:office:office" xmlns:r="http://schemas.openxmlformats.org/officeDocument/2006/relationships" xmlns:m="http://schemas.openxmlformats.org/officeDocument/2006/math" xmlns:v="urn:schemas-microsoft-com:vml" xmlns:wp14="http://schemas.microsoft.com/office/word/2010/wordprocessingDrawing" xmlns:wp="http://schemas.openxmlformats.org/drawingml/2006/wordprocessingDrawing" xmlns:w10="urn:schemas-microsoft-com:office:word" xmlns:w="http://schemas.openxmlformats.org/wordprocessingml/2006/main" xmlns:w14="http://schemas.microsoft.com/office/word/2010/wordml" xmlns:w15="http://schemas.microsoft.com/office/word/2012/wordml" xmlns:w16cid="http://schemas.microsoft.com/office/word/2016/wordml/cid" xmlns:w16se="http://schemas.microsoft.com/office/word/2015/wordml/symex" xmlns:wpg="http://schemas.microsoft.com/office/word/2010/wordprocessingGroup" xmlns:wpi="http://schemas.microsoft.com/office/word/2010/wordprocessingInk" xmlns:wne="http://schemas.microsoft.com/office/word/2006/wordml" xmlns:wps="http://schemas.microsoft.com/office/word/2010/wordprocessingShape" mc:Ignorable="w14 w15 w16se w16cid wp14">
-  <w:comment w:id="3" w:author="Tyler Noble" w:date="2020-04-07T15:05:00Z" w:initials="TN">
+  <w:comment w:id="2" w:author="mari6ka2010" w:date="2020-04-15T21:26:00Z" w:initials="">
+    <w:p>
+      <w:pPr>
+        <w:pBdr>
+          <w:top w:val="nil"/>
+          <w:left w:val="nil"/>
+          <w:bottom w:val="nil"/>
+          <w:right w:val="nil"/>
+          <w:between w:val="nil"/>
+        </w:pBdr>
+        <w:ind w:left="0" w:right="0" w:firstLine="0"/>
+        <w:rPr>
+          <w:rFonts w:ascii="Arial" w:eastAsia="Arial" w:hAnsi="Arial" w:cs="Arial"/>
+          <w:color w:val="000000"/>
+          <w:sz w:val="22"/>
+          <w:szCs w:val="22"/>
+        </w:rPr>
+      </w:pPr>
+      <w:r>
+        <w:rPr>
+          <w:rFonts w:ascii="Arial" w:eastAsia="Arial" w:hAnsi="Arial" w:cs="Arial"/>
+          <w:color w:val="000000"/>
+          <w:sz w:val="22"/>
+          <w:szCs w:val="22"/>
+        </w:rPr>
+        <w:t>make sure to remove hyperlink (if resume is found on your github they are already linked to it)</w:t>
+      </w:r>
+    </w:p>
+  </w:comment>
+  <w:comment w:id="1" w:author="Tyler Noble" w:date="2020-04-15T17:29:00Z" w:initials="TN">
     <w:p>
       <w:pPr>
         <w:pStyle w:val="CommentText"/>
@@ -1851,11 +1606,19 @@
         <w:annotationRef/>
       </w:r>
       <w:r>
-        <w:t>Say more of what you did</w:t>
+        <w:t>Problem is I don’t always just host it on github. But if I did only link the github one it would make sense.</w:t>
+      </w:r>
+    </w:p>
+    <w:p>
+      <w:pPr>
+        <w:pStyle w:val="CommentText"/>
+      </w:pPr>
+      <w:r>
+        <w:t>Sometimes I have to email it though or attach it to stuff.</w:t>
       </w:r>
     </w:p>
   </w:comment>
-  <w:comment w:id="7" w:author="Tyler Noble" w:date="2020-04-07T15:06:00Z" w:initials="TN">
+  <w:comment w:id="0" w:author="Tyler Noble" w:date="2020-04-15T17:30:00Z" w:initials="TN">
     <w:p>
       <w:pPr>
         <w:pStyle w:val="CommentText"/>
@@ -1866,12 +1629,38 @@
         </w:rPr>
         <w:annotationRef/>
       </w:r>
-      <w:r>
-        <w:t>Shrink this</w:t>
-      </w:r>
     </w:p>
   </w:comment>
-  <w:comment w:id="8" w:author="Tyler Noble" w:date="2020-04-14T14:33:00Z" w:initials="TN">
+  <w:comment w:id="5" w:author="mari6ka2010" w:date="2020-04-15T21:25:00Z" w:initials="">
+    <w:p>
+      <w:pPr>
+        <w:pBdr>
+          <w:top w:val="nil"/>
+          <w:left w:val="nil"/>
+          <w:bottom w:val="nil"/>
+          <w:right w:val="nil"/>
+          <w:between w:val="nil"/>
+        </w:pBdr>
+        <w:ind w:left="0" w:right="0" w:firstLine="0"/>
+        <w:rPr>
+          <w:rFonts w:ascii="Arial" w:eastAsia="Arial" w:hAnsi="Arial" w:cs="Arial"/>
+          <w:color w:val="000000"/>
+          <w:sz w:val="22"/>
+          <w:szCs w:val="22"/>
+        </w:rPr>
+      </w:pPr>
+      <w:r>
+        <w:rPr>
+          <w:rFonts w:ascii="Arial" w:eastAsia="Arial" w:hAnsi="Arial" w:cs="Arial"/>
+          <w:color w:val="000000"/>
+          <w:sz w:val="22"/>
+          <w:szCs w:val="22"/>
+        </w:rPr>
+        <w:t>still concerned about the table format, but it's up to you</w:t>
+      </w:r>
+    </w:p>
+  </w:comment>
+  <w:comment w:id="4" w:author="Tyler Noble" w:date="2020-04-15T17:50:00Z" w:initials="TN">
     <w:p>
       <w:pPr>
         <w:pStyle w:val="CommentText"/>
@@ -1881,6 +1670,202 @@
           <w:rStyle w:val="CommentReference"/>
         </w:rPr>
         <w:annotationRef/>
+      </w:r>
+      <w:r>
+        <w:t>Yeah, I think for ATS’ I might create a stripped down version of my resume that is just a txt file.</w:t>
+      </w:r>
+    </w:p>
+    <w:p>
+      <w:pPr>
+        <w:pStyle w:val="CommentText"/>
+      </w:pPr>
+      <w:r>
+        <w:t xml:space="preserve">    I’ll just run a script and it will make the most machine readable resume. Thoughts?</w:t>
+      </w:r>
+    </w:p>
+  </w:comment>
+  <w:comment w:id="8" w:author="mari6ka2010" w:date="2020-04-15T21:22:00Z" w:initials="">
+    <w:p>
+      <w:pPr>
+        <w:pBdr>
+          <w:top w:val="nil"/>
+          <w:left w:val="nil"/>
+          <w:bottom w:val="nil"/>
+          <w:right w:val="nil"/>
+          <w:between w:val="nil"/>
+        </w:pBdr>
+        <w:ind w:left="0" w:right="0" w:firstLine="0"/>
+        <w:rPr>
+          <w:rFonts w:ascii="Arial" w:eastAsia="Arial" w:hAnsi="Arial" w:cs="Arial"/>
+          <w:color w:val="000000"/>
+          <w:sz w:val="22"/>
+          <w:szCs w:val="22"/>
+        </w:rPr>
+      </w:pPr>
+      <w:r>
+        <w:rPr>
+          <w:rFonts w:ascii="Arial" w:eastAsia="Arial" w:hAnsi="Arial" w:cs="Arial"/>
+          <w:color w:val="000000"/>
+          <w:sz w:val="22"/>
+          <w:szCs w:val="22"/>
+        </w:rPr>
+        <w:t>I would use black for your text, especially "Tools Used" so it stands out more, bigger font, seems to get lost with the other text</w:t>
+      </w:r>
+    </w:p>
+  </w:comment>
+  <w:comment w:id="9" w:author="mari6ka2010" w:date="2020-04-15T21:22:00Z" w:initials="">
+    <w:p>
+      <w:pPr>
+        <w:pBdr>
+          <w:top w:val="nil"/>
+          <w:left w:val="nil"/>
+          <w:bottom w:val="nil"/>
+          <w:right w:val="nil"/>
+          <w:between w:val="nil"/>
+        </w:pBdr>
+        <w:ind w:left="0" w:right="0" w:firstLine="0"/>
+        <w:rPr>
+          <w:rFonts w:ascii="Arial" w:eastAsia="Arial" w:hAnsi="Arial" w:cs="Arial"/>
+          <w:color w:val="000000"/>
+          <w:sz w:val="22"/>
+          <w:szCs w:val="22"/>
+        </w:rPr>
+      </w:pPr>
+      <w:r>
+        <w:rPr>
+          <w:rFonts w:ascii="Arial" w:eastAsia="Arial" w:hAnsi="Arial" w:cs="Arial"/>
+          <w:color w:val="000000"/>
+          <w:sz w:val="22"/>
+          <w:szCs w:val="22"/>
+        </w:rPr>
+        <w:t>This bullet point is smaller than the others</w:t>
+      </w:r>
+    </w:p>
+  </w:comment>
+  <w:comment w:id="10" w:author="mari6ka2010" w:date="2020-04-15T21:23:00Z" w:initials="">
+    <w:p>
+      <w:pPr>
+        <w:pBdr>
+          <w:top w:val="nil"/>
+          <w:left w:val="nil"/>
+          <w:bottom w:val="nil"/>
+          <w:right w:val="nil"/>
+          <w:between w:val="nil"/>
+        </w:pBdr>
+        <w:ind w:left="0" w:right="0" w:firstLine="0"/>
+        <w:rPr>
+          <w:rFonts w:ascii="Arial" w:eastAsia="Arial" w:hAnsi="Arial" w:cs="Arial"/>
+          <w:color w:val="000000"/>
+          <w:sz w:val="22"/>
+          <w:szCs w:val="22"/>
+        </w:rPr>
+      </w:pPr>
+      <w:r>
+        <w:rPr>
+          <w:rFonts w:ascii="Arial" w:eastAsia="Arial" w:hAnsi="Arial" w:cs="Arial"/>
+          <w:color w:val="000000"/>
+          <w:sz w:val="22"/>
+          <w:szCs w:val="22"/>
+        </w:rPr>
+        <w:t>Off center with the other "Used"  lines</w:t>
+      </w:r>
+    </w:p>
+  </w:comment>
+  <w:comment w:id="14" w:author="mari6ka2010" w:date="2020-04-15T21:23:00Z" w:initials="">
+    <w:p>
+      <w:pPr>
+        <w:pBdr>
+          <w:top w:val="nil"/>
+          <w:left w:val="nil"/>
+          <w:bottom w:val="nil"/>
+          <w:right w:val="nil"/>
+          <w:between w:val="nil"/>
+        </w:pBdr>
+        <w:ind w:left="0" w:right="0" w:firstLine="0"/>
+        <w:rPr>
+          <w:rFonts w:ascii="Arial" w:eastAsia="Arial" w:hAnsi="Arial" w:cs="Arial"/>
+          <w:color w:val="000000"/>
+          <w:sz w:val="22"/>
+          <w:szCs w:val="22"/>
+        </w:rPr>
+      </w:pPr>
+      <w:r>
+        <w:rPr>
+          <w:rFonts w:ascii="Arial" w:eastAsia="Arial" w:hAnsi="Arial" w:cs="Arial"/>
+          <w:color w:val="000000"/>
+          <w:sz w:val="22"/>
+          <w:szCs w:val="22"/>
+        </w:rPr>
+        <w:t>align to right of page, most recent dates are first</w:t>
+      </w:r>
+    </w:p>
+  </w:comment>
+  <w:comment w:id="21" w:author="mari6ka2010" w:date="2020-04-15T21:25:00Z" w:initials="">
+    <w:p>
+      <w:pPr>
+        <w:pBdr>
+          <w:top w:val="nil"/>
+          <w:left w:val="nil"/>
+          <w:bottom w:val="nil"/>
+          <w:right w:val="nil"/>
+          <w:between w:val="nil"/>
+        </w:pBdr>
+        <w:ind w:left="0" w:right="0" w:firstLine="0"/>
+        <w:rPr>
+          <w:rFonts w:ascii="Arial" w:eastAsia="Arial" w:hAnsi="Arial" w:cs="Arial"/>
+          <w:color w:val="000000"/>
+          <w:sz w:val="22"/>
+          <w:szCs w:val="22"/>
+        </w:rPr>
+      </w:pPr>
+      <w:r>
+        <w:rPr>
+          <w:rFonts w:ascii="Arial" w:eastAsia="Arial" w:hAnsi="Arial" w:cs="Arial"/>
+          <w:color w:val="000000"/>
+          <w:sz w:val="22"/>
+          <w:szCs w:val="22"/>
+        </w:rPr>
+        <w:t>place education right after work experience</w:t>
+      </w:r>
+    </w:p>
+  </w:comment>
+  <w:comment w:id="20" w:author="Tyler Noble" w:date="2020-04-15T17:49:00Z" w:initials="TN">
+    <w:p>
+      <w:pPr>
+        <w:pStyle w:val="CommentText"/>
+      </w:pPr>
+      <w:r>
+        <w:rPr>
+          <w:rStyle w:val="CommentReference"/>
+        </w:rPr>
+        <w:annotationRef/>
+      </w:r>
+      <w:r>
+        <w:t xml:space="preserve">I think it’s super normal for tech people to put their education at the bottom. Usually because it is a given. </w:t>
+      </w:r>
+    </w:p>
+  </w:comment>
+  <w:comment w:id="19" w:author="Tyler Noble" w:date="2020-04-15T17:50:00Z" w:initials="TN">
+    <w:p>
+      <w:pPr>
+        <w:pStyle w:val="CommentText"/>
+      </w:pPr>
+      <w:r>
+        <w:rPr>
+          <w:rStyle w:val="CommentReference"/>
+        </w:rPr>
+        <w:annotationRef/>
+      </w:r>
+      <w:r>
+        <w:t xml:space="preserve">Unless you went to </w:t>
+      </w:r>
+      <w:proofErr w:type="spellStart"/>
+      <w:r>
+        <w:t>harvard</w:t>
+      </w:r>
+      <w:proofErr w:type="spellEnd"/>
+      <w:r>
+        <w:t xml:space="preserve"> or something then I’d advertise that hard</w:t>
       </w:r>
     </w:p>
   </w:comment>
@@ -1889,36 +1874,56 @@
 
 <file path=word/commentsExtended.xml><?xml version="1.0" encoding="utf-8"?>
 <w15:commentsEx xmlns:wpc="http://schemas.microsoft.com/office/word/2010/wordprocessingCanvas" xmlns:cx="http://schemas.microsoft.com/office/drawing/2014/chartex" xmlns:cx1="http://schemas.microsoft.com/office/drawing/2015/9/8/chartex" xmlns:cx2="http://schemas.microsoft.com/office/drawing/2015/10/21/chartex" xmlns:cx3="http://schemas.microsoft.com/office/drawing/2016/5/9/chartex" xmlns:cx4="http://schemas.microsoft.com/office/drawing/2016/5/10/chartex" xmlns:cx5="http://schemas.microsoft.com/office/drawing/2016/5/11/chartex" xmlns:cx6="http://schemas.microsoft.com/office/drawing/2016/5/12/chartex" xmlns:cx7="http://schemas.microsoft.com/office/drawing/2016/5/13/chartex" xmlns:cx8="http://schemas.microsoft.com/office/drawing/2016/5/14/chartex" xmlns:mc="http://schemas.openxmlformats.org/markup-compatibility/2006" xmlns:aink="http://schemas.microsoft.com/office/drawing/2016/ink" xmlns:am3d="http://schemas.microsoft.com/office/drawing/2017/model3d" xmlns:o="urn:schemas-microsoft-com:office:office" xmlns:r="http://schemas.openxmlformats.org/officeDocument/2006/relationships" xmlns:m="http://schemas.openxmlformats.org/officeDocument/2006/math" xmlns:v="urn:schemas-microsoft-com:vml" xmlns:wp14="http://schemas.microsoft.com/office/word/2010/wordprocessingDrawing" xmlns:wp="http://schemas.openxmlformats.org/drawingml/2006/wordprocessingDrawing" xmlns:w10="urn:schemas-microsoft-com:office:word" xmlns:w="http://schemas.openxmlformats.org/wordprocessingml/2006/main" xmlns:w14="http://schemas.microsoft.com/office/word/2010/wordml" xmlns:w15="http://schemas.microsoft.com/office/word/2012/wordml" xmlns:w16cid="http://schemas.microsoft.com/office/word/2016/wordml/cid" xmlns:w16se="http://schemas.microsoft.com/office/word/2015/wordml/symex" xmlns:wpg="http://schemas.microsoft.com/office/word/2010/wordprocessingGroup" xmlns:wpi="http://schemas.microsoft.com/office/word/2010/wordprocessingInk" xmlns:wne="http://schemas.microsoft.com/office/word/2006/wordml" xmlns:wps="http://schemas.microsoft.com/office/word/2010/wordprocessingShape" mc:Ignorable="w14 w15 w16se w16cid wp14">
-  <w15:commentEx w15:paraId="09E57C21" w15:done="1"/>
-  <w15:commentEx w15:paraId="196AD23E" w15:done="0"/>
-  <w15:commentEx w15:paraId="0EFDA496" w15:paraIdParent="196AD23E" w15:done="0"/>
+  <w15:commentEx w15:paraId="00000037" w15:done="0"/>
+  <w15:commentEx w15:paraId="01E37EAB" w15:paraIdParent="00000037" w15:done="0"/>
+  <w15:commentEx w15:paraId="10A71BC3" w15:paraIdParent="00000037" w15:done="0"/>
+  <w15:commentEx w15:paraId="0000003E" w15:done="0"/>
+  <w15:commentEx w15:paraId="72313479" w15:paraIdParent="0000003E" w15:done="0"/>
+  <w15:commentEx w15:paraId="00000039" w15:done="0"/>
+  <w15:commentEx w15:paraId="0000003D" w15:done="1"/>
+  <w15:commentEx w15:paraId="00000035" w15:done="1"/>
+  <w15:commentEx w15:paraId="00000036" w15:done="1"/>
+  <w15:commentEx w15:paraId="0000003A" w15:done="0"/>
+  <w15:commentEx w15:paraId="3B026460" w15:paraIdParent="0000003A" w15:done="0"/>
+  <w15:commentEx w15:paraId="3867ABA9" w15:paraIdParent="0000003A" w15:done="0"/>
 </w15:commentsEx>
 </file>
 
 <file path=word/commentsIds.xml><?xml version="1.0" encoding="utf-8"?>
 <w16cid:commentsIds xmlns:wpc="http://schemas.microsoft.com/office/word/2010/wordprocessingCanvas" xmlns:cx="http://schemas.microsoft.com/office/drawing/2014/chartex" xmlns:cx1="http://schemas.microsoft.com/office/drawing/2015/9/8/chartex" xmlns:cx2="http://schemas.microsoft.com/office/drawing/2015/10/21/chartex" xmlns:cx3="http://schemas.microsoft.com/office/drawing/2016/5/9/chartex" xmlns:cx4="http://schemas.microsoft.com/office/drawing/2016/5/10/chartex" xmlns:cx5="http://schemas.microsoft.com/office/drawing/2016/5/11/chartex" xmlns:cx6="http://schemas.microsoft.com/office/drawing/2016/5/12/chartex" xmlns:cx7="http://schemas.microsoft.com/office/drawing/2016/5/13/chartex" xmlns:cx8="http://schemas.microsoft.com/office/drawing/2016/5/14/chartex" xmlns:mc="http://schemas.openxmlformats.org/markup-compatibility/2006" xmlns:aink="http://schemas.microsoft.com/office/drawing/2016/ink" xmlns:am3d="http://schemas.microsoft.com/office/drawing/2017/model3d" xmlns:o="urn:schemas-microsoft-com:office:office" xmlns:r="http://schemas.openxmlformats.org/officeDocument/2006/relationships" xmlns:m="http://schemas.openxmlformats.org/officeDocument/2006/math" xmlns:v="urn:schemas-microsoft-com:vml" xmlns:wp14="http://schemas.microsoft.com/office/word/2010/wordprocessingDrawing" xmlns:wp="http://schemas.openxmlformats.org/drawingml/2006/wordprocessingDrawing" xmlns:w10="urn:schemas-microsoft-com:office:word" xmlns:w="http://schemas.openxmlformats.org/wordprocessingml/2006/main" xmlns:w14="http://schemas.microsoft.com/office/word/2010/wordml" xmlns:w15="http://schemas.microsoft.com/office/word/2012/wordml" xmlns:w16cid="http://schemas.microsoft.com/office/word/2016/wordml/cid" xmlns:w16se="http://schemas.microsoft.com/office/word/2015/wordml/symex" xmlns:wpg="http://schemas.microsoft.com/office/word/2010/wordprocessingGroup" xmlns:wpi="http://schemas.microsoft.com/office/word/2010/wordprocessingInk" xmlns:wne="http://schemas.microsoft.com/office/word/2006/wordml" xmlns:wps="http://schemas.microsoft.com/office/word/2010/wordprocessingShape" mc:Ignorable="w14 w15 w16se w16cid wp14">
-  <w16cid:commentId w16cid:paraId="09E57C21" w16cid:durableId="22371552"/>
-  <w16cid:commentId w16cid:paraId="196AD23E" w16cid:durableId="2237158F"/>
-  <w16cid:commentId w16cid:paraId="0EFDA496" w16cid:durableId="2240483F"/>
+  <w16cid:commentId w16cid:paraId="00000037" w16cid:durableId="2241C2DF"/>
+  <w16cid:commentId w16cid:paraId="01E37EAB" w16cid:durableId="2241C2F2"/>
+  <w16cid:commentId w16cid:paraId="10A71BC3" w16cid:durableId="2241C31F"/>
+  <w16cid:commentId w16cid:paraId="0000003E" w16cid:durableId="2241C2DE"/>
+  <w16cid:commentId w16cid:paraId="72313479" w16cid:durableId="2241C803"/>
+  <w16cid:commentId w16cid:paraId="00000039" w16cid:durableId="2241C2DC"/>
+  <w16cid:commentId w16cid:paraId="0000003D" w16cid:durableId="2241C2DB"/>
+  <w16cid:commentId w16cid:paraId="00000035" w16cid:durableId="2241C2DA"/>
+  <w16cid:commentId w16cid:paraId="00000036" w16cid:durableId="2241C2D7"/>
+  <w16cid:commentId w16cid:paraId="0000003A" w16cid:durableId="2241C2D6"/>
+  <w16cid:commentId w16cid:paraId="3B026460" w16cid:durableId="2241C79B"/>
+  <w16cid:commentId w16cid:paraId="3867ABA9" w16cid:durableId="2241C7D3"/>
 </w16cid:commentsIds>
 </file>
 
 <file path=word/numbering.xml><?xml version="1.0" encoding="utf-8"?>
 <w:numbering xmlns:wpc="http://schemas.microsoft.com/office/word/2010/wordprocessingCanvas" xmlns:cx="http://schemas.microsoft.com/office/drawing/2014/chartex" xmlns:cx1="http://schemas.microsoft.com/office/drawing/2015/9/8/chartex" xmlns:cx2="http://schemas.microsoft.com/office/drawing/2015/10/21/chartex" xmlns:cx3="http://schemas.microsoft.com/office/drawing/2016/5/9/chartex" xmlns:cx4="http://schemas.microsoft.com/office/drawing/2016/5/10/chartex" xmlns:cx5="http://schemas.microsoft.com/office/drawing/2016/5/11/chartex" xmlns:cx6="http://schemas.microsoft.com/office/drawing/2016/5/12/chartex" xmlns:cx7="http://schemas.microsoft.com/office/drawing/2016/5/13/chartex" xmlns:cx8="http://schemas.microsoft.com/office/drawing/2016/5/14/chartex" xmlns:mc="http://schemas.openxmlformats.org/markup-compatibility/2006" xmlns:aink="http://schemas.microsoft.com/office/drawing/2016/ink" xmlns:am3d="http://schemas.microsoft.com/office/drawing/2017/model3d" xmlns:o="urn:schemas-microsoft-com:office:office" xmlns:r="http://schemas.openxmlformats.org/officeDocument/2006/relationships" xmlns:m="http://schemas.openxmlformats.org/officeDocument/2006/math" xmlns:v="urn:schemas-microsoft-com:vml" xmlns:wp14="http://schemas.microsoft.com/office/word/2010/wordprocessingDrawing" xmlns:wp="http://schemas.openxmlformats.org/drawingml/2006/wordprocessingDrawing" xmlns:w10="urn:schemas-microsoft-com:office:word" xmlns:w="http://schemas.openxmlformats.org/wordprocessingml/2006/main" xmlns:w14="http://schemas.microsoft.com/office/word/2010/wordml" xmlns:w15="http://schemas.microsoft.com/office/word/2012/wordml" xmlns:w16cid="http://schemas.microsoft.com/office/word/2016/wordml/cid" xmlns:w16se="http://schemas.microsoft.com/office/word/2015/wordml/symex" xmlns:wpg="http://schemas.microsoft.com/office/word/2010/wordprocessingGroup" xmlns:wpi="http://schemas.microsoft.com/office/word/2010/wordprocessingInk" xmlns:wne="http://schemas.microsoft.com/office/word/2006/wordml" xmlns:wps="http://schemas.microsoft.com/office/word/2010/wordprocessingShape" mc:Ignorable="w14 w15 w16se w16cid wp14">
   <w:abstractNum w:abstractNumId="0" w15:restartNumberingAfterBreak="0">
-    <w:nsid w:val="03A87131"/>
+    <w:nsid w:val="089F68EC"/>
     <w:multiLevelType w:val="multilevel"/>
-    <w:tmpl w:val="00F2BE34"/>
+    <w:tmpl w:val="DBA00BC4"/>
     <w:lvl w:ilvl="0">
       <w:start w:val="1"/>
       <w:numFmt w:val="bullet"/>
-      <w:lvlText w:val=""/>
+      <w:lvlText w:val="●"/>
       <w:lvlJc w:val="left"/>
       <w:pPr>
         <w:ind w:left="720" w:hanging="360"/>
       </w:pPr>
       <w:rPr>
-        <w:rFonts w:ascii="Symbol" w:hAnsi="Symbol" w:hint="default"/>
+        <w:rFonts w:ascii="Noto Sans Symbols" w:eastAsia="Noto Sans Symbols" w:hAnsi="Noto Sans Symbols" w:cs="Noto Sans Symbols"/>
+        <w:sz w:val="20"/>
+        <w:szCs w:val="20"/>
         <w:u w:val="none"/>
       </w:rPr>
     </w:lvl>
@@ -2020,21 +2025,19 @@
     </w:lvl>
   </w:abstractNum>
   <w:abstractNum w:abstractNumId="1" w15:restartNumberingAfterBreak="0">
-    <w:nsid w:val="51277C82"/>
+    <w:nsid w:val="60E614AE"/>
     <w:multiLevelType w:val="multilevel"/>
-    <w:tmpl w:val="2D1ABE98"/>
+    <w:tmpl w:val="1340CDA0"/>
     <w:lvl w:ilvl="0">
       <w:start w:val="1"/>
       <w:numFmt w:val="bullet"/>
-      <w:lvlText w:val=""/>
+      <w:lvlText w:val="●"/>
       <w:lvlJc w:val="left"/>
       <w:pPr>
         <w:ind w:left="720" w:hanging="360"/>
       </w:pPr>
       <w:rPr>
-        <w:rFonts w:ascii="Symbol" w:hAnsi="Symbol" w:hint="default"/>
-        <w:sz w:val="20"/>
-        <w:szCs w:val="20"/>
+        <w:rFonts w:ascii="Noto Sans Symbols" w:eastAsia="Noto Sans Symbols" w:hAnsi="Noto Sans Symbols" w:cs="Noto Sans Symbols"/>
         <w:u w:val="none"/>
       </w:rPr>
     </w:lvl>
@@ -2135,127 +2138,11 @@
       </w:rPr>
     </w:lvl>
   </w:abstractNum>
-  <w:abstractNum w:abstractNumId="2" w15:restartNumberingAfterBreak="0">
-    <w:nsid w:val="61F24D88"/>
-    <w:multiLevelType w:val="multilevel"/>
-    <w:tmpl w:val="39364B5C"/>
-    <w:lvl w:ilvl="0">
-      <w:start w:val="1"/>
-      <w:numFmt w:val="bullet"/>
-      <w:lvlText w:val="●"/>
-      <w:lvlJc w:val="left"/>
-      <w:pPr>
-        <w:ind w:left="1440" w:hanging="360"/>
-      </w:pPr>
-      <w:rPr>
-        <w:u w:val="none"/>
-      </w:rPr>
-    </w:lvl>
-    <w:lvl w:ilvl="1">
-      <w:start w:val="1"/>
-      <w:numFmt w:val="bullet"/>
-      <w:lvlText w:val="○"/>
-      <w:lvlJc w:val="left"/>
-      <w:pPr>
-        <w:ind w:left="2160" w:hanging="360"/>
-      </w:pPr>
-      <w:rPr>
-        <w:u w:val="none"/>
-      </w:rPr>
-    </w:lvl>
-    <w:lvl w:ilvl="2">
-      <w:start w:val="1"/>
-      <w:numFmt w:val="bullet"/>
-      <w:lvlText w:val="■"/>
-      <w:lvlJc w:val="left"/>
-      <w:pPr>
-        <w:ind w:left="2880" w:hanging="360"/>
-      </w:pPr>
-      <w:rPr>
-        <w:u w:val="none"/>
-      </w:rPr>
-    </w:lvl>
-    <w:lvl w:ilvl="3">
-      <w:start w:val="1"/>
-      <w:numFmt w:val="bullet"/>
-      <w:lvlText w:val="●"/>
-      <w:lvlJc w:val="left"/>
-      <w:pPr>
-        <w:ind w:left="3600" w:hanging="360"/>
-      </w:pPr>
-      <w:rPr>
-        <w:u w:val="none"/>
-      </w:rPr>
-    </w:lvl>
-    <w:lvl w:ilvl="4">
-      <w:start w:val="1"/>
-      <w:numFmt w:val="bullet"/>
-      <w:lvlText w:val="○"/>
-      <w:lvlJc w:val="left"/>
-      <w:pPr>
-        <w:ind w:left="4320" w:hanging="360"/>
-      </w:pPr>
-      <w:rPr>
-        <w:u w:val="none"/>
-      </w:rPr>
-    </w:lvl>
-    <w:lvl w:ilvl="5">
-      <w:start w:val="1"/>
-      <w:numFmt w:val="bullet"/>
-      <w:lvlText w:val="■"/>
-      <w:lvlJc w:val="left"/>
-      <w:pPr>
-        <w:ind w:left="5040" w:hanging="360"/>
-      </w:pPr>
-      <w:rPr>
-        <w:u w:val="none"/>
-      </w:rPr>
-    </w:lvl>
-    <w:lvl w:ilvl="6">
-      <w:start w:val="1"/>
-      <w:numFmt w:val="bullet"/>
-      <w:lvlText w:val="●"/>
-      <w:lvlJc w:val="left"/>
-      <w:pPr>
-        <w:ind w:left="5760" w:hanging="360"/>
-      </w:pPr>
-      <w:rPr>
-        <w:u w:val="none"/>
-      </w:rPr>
-    </w:lvl>
-    <w:lvl w:ilvl="7">
-      <w:start w:val="1"/>
-      <w:numFmt w:val="bullet"/>
-      <w:lvlText w:val="○"/>
-      <w:lvlJc w:val="left"/>
-      <w:pPr>
-        <w:ind w:left="6480" w:hanging="360"/>
-      </w:pPr>
-      <w:rPr>
-        <w:u w:val="none"/>
-      </w:rPr>
-    </w:lvl>
-    <w:lvl w:ilvl="8">
-      <w:start w:val="1"/>
-      <w:numFmt w:val="bullet"/>
-      <w:lvlText w:val="■"/>
-      <w:lvlJc w:val="left"/>
-      <w:pPr>
-        <w:ind w:left="7200" w:hanging="360"/>
-      </w:pPr>
-      <w:rPr>
-        <w:u w:val="none"/>
-      </w:rPr>
-    </w:lvl>
-  </w:abstractNum>
   <w:num w:numId="1">
-    <w:abstractNumId w:val="1"/>
+    <w:abstractNumId w:val="0"/>
   </w:num>
   <w:num w:numId="2">
-    <w:abstractNumId w:val="0"/>
-  </w:num>
-  <w:num w:numId="3">
-    <w:abstractNumId w:val="2"/>
+    <w:abstractNumId w:val="1"/>
   </w:num>
 </w:numbering>
 </file>
@@ -2288,7 +2175,7 @@
   <w:latentStyles w:defLockedState="0" w:defUIPriority="99" w:defSemiHidden="0" w:defUnhideWhenUsed="0" w:defQFormat="0" w:count="376">
     <w:lsdException w:name="Normal" w:uiPriority="0" w:qFormat="1"/>
     <w:lsdException w:name="heading 1" w:uiPriority="9" w:qFormat="1"/>
-    <w:lsdException w:name="heading 2" w:semiHidden="1" w:uiPriority="0" w:unhideWhenUsed="1" w:qFormat="1"/>
+    <w:lsdException w:name="heading 2" w:semiHidden="1" w:uiPriority="9" w:unhideWhenUsed="1" w:qFormat="1"/>
     <w:lsdException w:name="heading 3" w:semiHidden="1" w:uiPriority="9" w:unhideWhenUsed="1" w:qFormat="1"/>
     <w:lsdException w:name="heading 4" w:semiHidden="1" w:uiPriority="9" w:unhideWhenUsed="1" w:qFormat="1"/>
     <w:lsdException w:name="heading 5" w:semiHidden="1" w:uiPriority="9" w:unhideWhenUsed="1" w:qFormat="1"/>
@@ -2440,7 +2327,7 @@
     <w:lsdException w:name="Table Web 2" w:semiHidden="1" w:unhideWhenUsed="1"/>
     <w:lsdException w:name="Table Web 3" w:semiHidden="1" w:unhideWhenUsed="1"/>
     <w:lsdException w:name="Balloon Text" w:semiHidden="1" w:unhideWhenUsed="1"/>
-    <w:lsdException w:name="Table Grid" w:uiPriority="59"/>
+    <w:lsdException w:name="Table Grid" w:uiPriority="39"/>
     <w:lsdException w:name="Table Theme" w:semiHidden="1" w:unhideWhenUsed="1"/>
     <w:lsdException w:name="Placeholder Text" w:semiHidden="1"/>
     <w:lsdException w:name="No Spacing" w:uiPriority="1" w:qFormat="1"/>
@@ -2665,12 +2552,15 @@
   </w:latentStyles>
   <w:style w:type="paragraph" w:default="1" w:styleId="Normal">
     <w:name w:val="Normal"/>
+    <w:qFormat/>
     <w:rsid w:val="00836EC9"/>
   </w:style>
   <w:style w:type="paragraph" w:styleId="Heading1">
     <w:name w:val="heading 1"/>
     <w:basedOn w:val="Normal"/>
     <w:next w:val="Normal"/>
+    <w:uiPriority w:val="9"/>
+    <w:qFormat/>
     <w:pPr>
       <w:outlineLvl w:val="0"/>
     </w:pPr>
@@ -2686,6 +2576,9 @@
     <w:basedOn w:val="Normal"/>
     <w:next w:val="Normal"/>
     <w:link w:val="Heading2Char"/>
+    <w:uiPriority w:val="9"/>
+    <w:unhideWhenUsed/>
+    <w:qFormat/>
     <w:pPr>
       <w:keepNext/>
       <w:keepLines/>
@@ -2703,6 +2596,10 @@
     <w:name w:val="heading 3"/>
     <w:basedOn w:val="Normal"/>
     <w:next w:val="Normal"/>
+    <w:uiPriority w:val="9"/>
+    <w:semiHidden/>
+    <w:unhideWhenUsed/>
+    <w:qFormat/>
     <w:pPr>
       <w:keepNext/>
       <w:keepLines/>
@@ -2719,6 +2616,10 @@
     <w:name w:val="heading 4"/>
     <w:basedOn w:val="Normal"/>
     <w:next w:val="Normal"/>
+    <w:uiPriority w:val="9"/>
+    <w:semiHidden/>
+    <w:unhideWhenUsed/>
+    <w:qFormat/>
     <w:pPr>
       <w:keepNext/>
       <w:keepLines/>
@@ -2735,6 +2636,10 @@
     <w:name w:val="heading 5"/>
     <w:basedOn w:val="Normal"/>
     <w:next w:val="Normal"/>
+    <w:uiPriority w:val="9"/>
+    <w:semiHidden/>
+    <w:unhideWhenUsed/>
+    <w:qFormat/>
     <w:pPr>
       <w:keepNext/>
       <w:keepLines/>
@@ -2751,6 +2656,10 @@
     <w:name w:val="heading 6"/>
     <w:basedOn w:val="Normal"/>
     <w:next w:val="Normal"/>
+    <w:uiPriority w:val="9"/>
+    <w:semiHidden/>
+    <w:unhideWhenUsed/>
+    <w:qFormat/>
     <w:pPr>
       <w:keepNext/>
       <w:keepLines/>
@@ -2795,6 +2704,8 @@
     <w:name w:val="Title"/>
     <w:basedOn w:val="Normal"/>
     <w:next w:val="Normal"/>
+    <w:uiPriority w:val="10"/>
+    <w:qFormat/>
     <w:pPr>
       <w:spacing w:after="120"/>
     </w:pPr>
@@ -2809,6 +2720,8 @@
     <w:name w:val="Subtitle"/>
     <w:basedOn w:val="Normal"/>
     <w:next w:val="Normal"/>
+    <w:uiPriority w:val="11"/>
+    <w:qFormat/>
     <w:pPr>
       <w:spacing w:line="276" w:lineRule="auto"/>
     </w:pPr>
@@ -2934,7 +2847,6 @@
     <w:basedOn w:val="Normal"/>
     <w:link w:val="CommentTextChar"/>
     <w:uiPriority w:val="99"/>
-    <w:semiHidden/>
     <w:unhideWhenUsed/>
     <w:rsid w:val="00441010"/>
   </w:style>
@@ -2943,7 +2855,6 @@
     <w:basedOn w:val="DefaultParagraphFont"/>
     <w:link w:val="CommentText"/>
     <w:uiPriority w:val="99"/>
-    <w:semiHidden/>
     <w:rsid w:val="00441010"/>
   </w:style>
   <w:style w:type="paragraph" w:styleId="CommentSubject">
@@ -3274,6 +3185,57 @@
       <w:tblPr/>
       <w:tcPr>
         <w:shd w:val="clear" w:color="auto" w:fill="F2F2F2" w:themeFill="background1" w:themeFillShade="F2"/>
+      </w:tcPr>
+    </w:tblStylePr>
+  </w:style>
+  <w:style w:type="table" w:customStyle="1" w:styleId="a1">
+    <w:basedOn w:val="TableNormal"/>
+    <w:tblPr>
+      <w:tblStyleRowBandSize w:val="1"/>
+      <w:tblStyleColBandSize w:val="1"/>
+      <w:tblCellMar>
+        <w:top w:w="100" w:type="dxa"/>
+        <w:left w:w="100" w:type="dxa"/>
+        <w:bottom w:w="100" w:type="dxa"/>
+        <w:right w:w="100" w:type="dxa"/>
+      </w:tblCellMar>
+    </w:tblPr>
+    <w:tblStylePr w:type="firstRow">
+      <w:rPr>
+        <w:b/>
+      </w:rPr>
+    </w:tblStylePr>
+    <w:tblStylePr w:type="lastRow">
+      <w:rPr>
+        <w:b/>
+      </w:rPr>
+      <w:tblPr/>
+      <w:tcPr>
+        <w:tcBorders>
+          <w:top w:val="single" w:sz="4" w:space="0" w:color="BFBFBF"/>
+        </w:tcBorders>
+      </w:tcPr>
+    </w:tblStylePr>
+    <w:tblStylePr w:type="firstCol">
+      <w:rPr>
+        <w:b/>
+      </w:rPr>
+    </w:tblStylePr>
+    <w:tblStylePr w:type="lastCol">
+      <w:rPr>
+        <w:b/>
+      </w:rPr>
+    </w:tblStylePr>
+    <w:tblStylePr w:type="band1Vert">
+      <w:tblPr/>
+      <w:tcPr>
+        <w:shd w:val="clear" w:color="auto" w:fill="F2F2F2"/>
+      </w:tcPr>
+    </w:tblStylePr>
+    <w:tblStylePr w:type="band1Horz">
+      <w:tblPr/>
+      <w:tcPr>
+        <w:shd w:val="clear" w:color="auto" w:fill="F2F2F2"/>
       </w:tcPr>
     </w:tblStylePr>
   </w:style>
@@ -3598,4 +3560,19 @@
   </a:objectDefaults>
   <a:extraClrSchemeLst/>
 </a:theme>
+</file>
+
+<file path=customXml/item1.xml><?xml version="1.0" encoding="utf-8"?>
+<go:gDocsCustomXmlDataStorage xmlns:go="http://customooxmlschemas.google.com/" xmlns:r="http://schemas.openxmlformats.org/officeDocument/2006/relationships">
+  <go:docsCustomData xmlns:go="http://customooxmlschemas.google.com/" roundtripDataSignature="AMtx7mjA/mwxz8rf5eUrnlJklH4Lb9UVrw==">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</go:docsCustomData>
+</go:gDocsCustomXmlDataStorage>
+</file>
+
+<file path=customXml/itemProps1.xml><?xml version="1.0" encoding="utf-8"?>
+<ds:datastoreItem xmlns:ds="http://schemas.openxmlformats.org/officeDocument/2006/customXml" ds:itemID="{11111111-1234-1234-1234-123412341234}">
+  <ds:schemaRefs>
+    <ds:schemaRef ds:uri="http://customooxmlschemas.google.com/"/>
+    <ds:schemaRef ds:uri="http://schemas.openxmlformats.org/officeDocument/2006/relationships"/>
+  </ds:schemaRefs>
+</ds:datastoreItem>
 </file>
</xml_diff>

<commit_message>
Fixed indent in resume
</commit_message>
<xml_diff>
--- a/Resume/TylerNobleResume.docx
+++ b/Resume/TylerNobleResume.docx
@@ -136,11 +136,7 @@
           <w:id w:val="-974607617"/>
         </w:sdtPr>
         <w:sdtEndPr/>
-        <w:sdtContent>
-          <w:commentRangeStart w:id="0"/>
-          <w:commentRangeStart w:id="1"/>
-          <w:commentRangeStart w:id="2"/>
-        </w:sdtContent>
+        <w:sdtContent/>
       </w:sdt>
       <w:r>
         <w:rPr>
@@ -158,24 +154,6 @@
           <w:t xml:space="preserve">NobleTyler.github.io </w:t>
         </w:r>
       </w:hyperlink>
-      <w:commentRangeEnd w:id="2"/>
-      <w:r>
-        <w:commentReference w:id="2"/>
-      </w:r>
-      <w:commentRangeEnd w:id="1"/>
-      <w:r>
-        <w:rPr>
-          <w:rStyle w:val="CommentReference"/>
-        </w:rPr>
-        <w:commentReference w:id="1"/>
-      </w:r>
-      <w:commentRangeEnd w:id="0"/>
-      <w:r>
-        <w:rPr>
-          <w:rStyle w:val="CommentReference"/>
-        </w:rPr>
-        <w:commentReference w:id="0"/>
-      </w:r>
       <w:r>
         <w:rPr>
           <w:b/>
@@ -201,7 +179,7 @@
                     <pic:cNvPicPr preferRelativeResize="0"/>
                   </pic:nvPicPr>
                   <pic:blipFill>
-                    <a:blip r:embed="rId12"/>
+                    <a:blip r:embed="rId9"/>
                     <a:srcRect/>
                     <a:stretch>
                       <a:fillRect/>
@@ -229,7 +207,7 @@
         </w:rPr>
         <w:t xml:space="preserve"> </w:t>
       </w:r>
-      <w:hyperlink r:id="rId13">
+      <w:hyperlink r:id="rId10">
         <w:proofErr w:type="spellStart"/>
         <w:r>
           <w:rPr>
@@ -240,8 +218,8 @@
         <w:proofErr w:type="spellEnd"/>
       </w:hyperlink>
     </w:p>
-    <w:bookmarkStart w:id="3" w:name="_heading=h.gjdgxs" w:colFirst="0" w:colLast="0"/>
-    <w:bookmarkEnd w:id="3"/>
+    <w:bookmarkStart w:id="0" w:name="_heading=h.gjdgxs" w:colFirst="0" w:colLast="0"/>
+    <w:bookmarkEnd w:id="0"/>
     <w:p>
       <w:pPr>
         <w:pStyle w:val="Heading1"/>
@@ -259,10 +237,7 @@
           <w:id w:val="1348146978"/>
         </w:sdtPr>
         <w:sdtEndPr/>
-        <w:sdtContent>
-          <w:commentRangeStart w:id="4"/>
-          <w:commentRangeStart w:id="5"/>
-        </w:sdtContent>
+        <w:sdtContent/>
       </w:sdt>
       <w:r>
         <w:rPr>
@@ -270,19 +245,6 @@
           <w:szCs w:val="24"/>
         </w:rPr>
         <w:t>TECHNICAL SKILLS</w:t>
-      </w:r>
-      <w:commentRangeEnd w:id="5"/>
-      <w:r>
-        <w:commentReference w:id="5"/>
-      </w:r>
-      <w:commentRangeEnd w:id="4"/>
-      <w:r>
-        <w:rPr>
-          <w:rStyle w:val="CommentReference"/>
-          <w:b w:val="0"/>
-          <w:color w:val="666666"/>
-        </w:rPr>
-        <w:commentReference w:id="4"/>
       </w:r>
     </w:p>
     <w:tbl>
@@ -324,8 +286,8 @@
             <w:pPr>
               <w:ind w:left="0" w:firstLine="0"/>
             </w:pPr>
-            <w:bookmarkStart w:id="6" w:name="_heading=h.30j0zll" w:colFirst="0" w:colLast="0"/>
-            <w:bookmarkEnd w:id="6"/>
+            <w:bookmarkStart w:id="1" w:name="_heading=h.30j0zll" w:colFirst="0" w:colLast="0"/>
+            <w:bookmarkEnd w:id="1"/>
             <w:r>
               <w:t>Java</w:t>
             </w:r>
@@ -532,8 +494,8 @@
           <w:szCs w:val="22"/>
         </w:rPr>
       </w:pPr>
-      <w:bookmarkStart w:id="7" w:name="_heading=h.1fob9te" w:colFirst="0" w:colLast="0"/>
-      <w:bookmarkEnd w:id="7"/>
+      <w:bookmarkStart w:id="2" w:name="_heading=h.1fob9te" w:colFirst="0" w:colLast="0"/>
+      <w:bookmarkEnd w:id="2"/>
       <w:r>
         <w:rPr>
           <w:sz w:val="22"/>
@@ -622,14 +584,6 @@
           <w:szCs w:val="22"/>
         </w:rPr>
       </w:pPr>
-      <w:sdt>
-        <w:sdtPr>
-          <w:tag w:val="goog_rdk_2"/>
-          <w:id w:val="222111090"/>
-        </w:sdtPr>
-        <w:sdtEndPr/>
-        <w:sdtContent/>
-      </w:sdt>
       <w:r>
         <w:rPr>
           <w:sz w:val="22"/>
@@ -713,7 +667,6 @@
           <w:r>
             <w:t xml:space="preserve">     </w:t>
           </w:r>
-          <w:commentRangeStart w:id="8"/>
         </w:sdtContent>
       </w:sdt>
       <w:r>
@@ -721,10 +674,6 @@
           <w:b/>
         </w:rPr>
         <w:t>Used: Microsoft Excel, MS Access, Microsoft Teams, SharePoint, VBA</w:t>
-      </w:r>
-      <w:commentRangeEnd w:id="8"/>
-      <w:r>
-        <w:commentReference w:id="8"/>
       </w:r>
     </w:p>
     <w:p>
@@ -835,29 +784,13 @@
           <w:numId w:val="1"/>
         </w:numPr>
       </w:pPr>
-      <w:commentRangeStart w:id="9"/>
       <w:r>
         <w:rPr>
           <w:rFonts w:asciiTheme="majorHAnsi" w:hAnsiTheme="majorHAnsi" w:cstheme="majorHAnsi"/>
           <w:sz w:val="22"/>
           <w:szCs w:val="22"/>
         </w:rPr>
-        <w:t>Executed</w:t>
-      </w:r>
-      <w:commentRangeEnd w:id="9"/>
-      <w:r>
-        <w:rPr>
-          <w:rFonts w:asciiTheme="majorHAnsi" w:hAnsiTheme="majorHAnsi" w:cstheme="majorHAnsi"/>
-        </w:rPr>
-        <w:commentReference w:id="9"/>
-      </w:r>
-      <w:r>
-        <w:rPr>
-          <w:rFonts w:asciiTheme="majorHAnsi" w:hAnsiTheme="majorHAnsi" w:cstheme="majorHAnsi"/>
-          <w:sz w:val="22"/>
-          <w:szCs w:val="22"/>
-        </w:rPr>
-        <w:t xml:space="preserve"> data cleaning procedures to ensure data quality of customer information and procurement operations</w:t>
+        <w:t>Executed data cleaning procedures to ensure data quality of customer information and procurement operations</w:t>
       </w:r>
       <w:r>
         <w:rPr>
@@ -876,7 +809,6 @@
           <w:r>
             <w:t xml:space="preserve">     </w:t>
           </w:r>
-          <w:commentRangeStart w:id="10"/>
         </w:sdtContent>
       </w:sdt>
       <w:r>
@@ -892,11 +824,7 @@
         </w:rPr>
         <w:t>IronPython</w:t>
       </w:r>
-      <w:commentRangeEnd w:id="10"/>
       <w:proofErr w:type="spellEnd"/>
-      <w:r>
-        <w:commentReference w:id="10"/>
-      </w:r>
     </w:p>
     <w:p/>
     <w:p>
@@ -904,8 +832,8 @@
         <w:pStyle w:val="Heading2"/>
         <w:spacing w:before="0"/>
       </w:pPr>
-      <w:bookmarkStart w:id="11" w:name="_heading=h.3znysh7" w:colFirst="0" w:colLast="0"/>
-      <w:bookmarkEnd w:id="11"/>
+      <w:bookmarkStart w:id="3" w:name="_heading=h.3znysh7" w:colFirst="0" w:colLast="0"/>
+      <w:bookmarkEnd w:id="3"/>
       <w:r>
         <w:rPr>
           <w:sz w:val="22"/>
@@ -1070,8 +998,8 @@
           <w:szCs w:val="24"/>
         </w:rPr>
       </w:pPr>
-      <w:bookmarkStart w:id="12" w:name="_heading=h.2et92p0" w:colFirst="0" w:colLast="0"/>
-      <w:bookmarkEnd w:id="12"/>
+      <w:bookmarkStart w:id="4" w:name="_heading=h.2et92p0" w:colFirst="0" w:colLast="0"/>
+      <w:bookmarkEnd w:id="4"/>
       <w:r>
         <w:rPr>
           <w:b w:val="0"/>
@@ -1114,8 +1042,8 @@
           <w:szCs w:val="22"/>
         </w:rPr>
       </w:pPr>
-      <w:bookmarkStart w:id="13" w:name="_heading=h.tyjcwt" w:colFirst="0" w:colLast="0"/>
-      <w:bookmarkEnd w:id="13"/>
+      <w:bookmarkStart w:id="5" w:name="_heading=h.tyjcwt" w:colFirst="0" w:colLast="0"/>
+      <w:bookmarkEnd w:id="5"/>
     </w:p>
     <w:p>
       <w:pPr>
@@ -1249,9 +1177,7 @@
           <w:id w:val="-943455679"/>
         </w:sdtPr>
         <w:sdtEndPr/>
-        <w:sdtContent>
-          <w:commentRangeStart w:id="14"/>
-        </w:sdtContent>
+        <w:sdtContent/>
       </w:sdt>
       <w:r>
         <w:rPr>
@@ -1270,10 +1196,6 @@
         </w:rPr>
         <w:t>anuary 2020 – Ongoing</w:t>
       </w:r>
-      <w:commentRangeEnd w:id="14"/>
-      <w:r>
-        <w:commentReference w:id="14"/>
-      </w:r>
     </w:p>
     <w:p>
       <w:pPr>
@@ -1284,8 +1206,8 @@
       </w:r>
     </w:p>
     <w:p>
-      <w:bookmarkStart w:id="15" w:name="_heading=h.3dy6vkm" w:colFirst="0" w:colLast="0"/>
-      <w:bookmarkEnd w:id="15"/>
+      <w:bookmarkStart w:id="6" w:name="_heading=h.3dy6vkm" w:colFirst="0" w:colLast="0"/>
+      <w:bookmarkEnd w:id="6"/>
       <w:r>
         <w:rPr>
           <w:b/>
@@ -1309,8 +1231,8 @@
           <w:szCs w:val="22"/>
         </w:rPr>
       </w:pPr>
-      <w:bookmarkStart w:id="16" w:name="_heading=h.1t3h5sf" w:colFirst="0" w:colLast="0"/>
-      <w:bookmarkEnd w:id="16"/>
+      <w:bookmarkStart w:id="7" w:name="_heading=h.1t3h5sf" w:colFirst="0" w:colLast="0"/>
+      <w:bookmarkEnd w:id="7"/>
       <w:r>
         <w:rPr>
           <w:sz w:val="22"/>
@@ -1371,8 +1293,8 @@
           <w:szCs w:val="22"/>
         </w:rPr>
       </w:pPr>
-      <w:bookmarkStart w:id="17" w:name="_heading=h.4d34og8" w:colFirst="0" w:colLast="0"/>
-      <w:bookmarkEnd w:id="17"/>
+      <w:bookmarkStart w:id="8" w:name="_heading=h.4d34og8" w:colFirst="0" w:colLast="0"/>
+      <w:bookmarkEnd w:id="8"/>
       <w:r>
         <w:rPr>
           <w:sz w:val="22"/>
@@ -1403,7 +1325,15 @@
         <w:ind w:left="357" w:right="301" w:firstLine="0"/>
       </w:pPr>
       <w:r>
-        <w:t>Created, facilitated and led multiple workshops at York University partnering with WISE (</w:t>
+        <w:t xml:space="preserve">Created, </w:t>
+      </w:r>
+      <w:proofErr w:type="gramStart"/>
+      <w:r>
+        <w:t>facilitated</w:t>
+      </w:r>
+      <w:proofErr w:type="gramEnd"/>
+      <w:r>
+        <w:t xml:space="preserve"> and led multiple workshops at York University partnering with WISE (</w:t>
       </w:r>
       <w:r>
         <w:rPr>
@@ -1426,8 +1356,8 @@
         <w:br/>
       </w:r>
     </w:p>
-    <w:bookmarkStart w:id="18" w:name="_heading=h.2s8eyo1" w:colFirst="0" w:colLast="0"/>
-    <w:bookmarkEnd w:id="18"/>
+    <w:bookmarkStart w:id="9" w:name="_heading=h.2s8eyo1" w:colFirst="0" w:colLast="0"/>
+    <w:bookmarkEnd w:id="9"/>
     <w:p>
       <w:pPr>
         <w:pStyle w:val="Heading1"/>
@@ -1445,11 +1375,7 @@
           <w:id w:val="161055718"/>
         </w:sdtPr>
         <w:sdtEndPr/>
-        <w:sdtContent>
-          <w:commentRangeStart w:id="19"/>
-          <w:commentRangeStart w:id="20"/>
-          <w:commentRangeStart w:id="21"/>
-        </w:sdtContent>
+        <w:sdtContent/>
       </w:sdt>
       <w:r>
         <w:rPr>
@@ -1458,36 +1384,14 @@
         </w:rPr>
         <w:t>EDUCATION</w:t>
       </w:r>
-      <w:commentRangeEnd w:id="21"/>
-      <w:r>
-        <w:commentReference w:id="21"/>
-      </w:r>
-      <w:commentRangeEnd w:id="20"/>
-      <w:r>
-        <w:rPr>
-          <w:rStyle w:val="CommentReference"/>
-          <w:b w:val="0"/>
-          <w:color w:val="666666"/>
-        </w:rPr>
-        <w:commentReference w:id="20"/>
-      </w:r>
-      <w:commentRangeEnd w:id="19"/>
-      <w:r>
-        <w:rPr>
-          <w:rStyle w:val="CommentReference"/>
-          <w:b w:val="0"/>
-          <w:color w:val="666666"/>
-        </w:rPr>
-        <w:commentReference w:id="19"/>
-      </w:r>
     </w:p>
     <w:p>
       <w:pPr>
         <w:pStyle w:val="Heading2"/>
         <w:spacing w:before="0"/>
       </w:pPr>
-      <w:bookmarkStart w:id="22" w:name="_heading=h.17dp8vu" w:colFirst="0" w:colLast="0"/>
-      <w:bookmarkEnd w:id="22"/>
+      <w:bookmarkStart w:id="10" w:name="_heading=h.17dp8vu" w:colFirst="0" w:colLast="0"/>
+      <w:bookmarkEnd w:id="10"/>
     </w:p>
     <w:p>
       <w:pPr>
@@ -1498,8 +1402,8 @@
           <w:i/>
         </w:rPr>
       </w:pPr>
-      <w:bookmarkStart w:id="23" w:name="_heading=h.3rdcrjn" w:colFirst="0" w:colLast="0"/>
-      <w:bookmarkEnd w:id="23"/>
+      <w:bookmarkStart w:id="11" w:name="_heading=h.3rdcrjn" w:colFirst="0" w:colLast="0"/>
+      <w:bookmarkEnd w:id="11"/>
       <w:proofErr w:type="spellStart"/>
       <w:r>
         <w:t>Honours</w:t>
@@ -1561,349 +1465,6 @@
     </w:sectPr>
   </w:body>
 </w:document>
-</file>
-
-<file path=word/comments.xml><?xml version="1.0" encoding="utf-8"?>
-<w:comments xmlns:wpc="http://schemas.microsoft.com/office/word/2010/wordprocessingCanvas" xmlns:cx="http://schemas.microsoft.com/office/drawing/2014/chartex" xmlns:cx1="http://schemas.microsoft.com/office/drawing/2015/9/8/chartex" xmlns:cx2="http://schemas.microsoft.com/office/drawing/2015/10/21/chartex" xmlns:cx3="http://schemas.microsoft.com/office/drawing/2016/5/9/chartex" xmlns:cx4="http://schemas.microsoft.com/office/drawing/2016/5/10/chartex" xmlns:cx5="http://schemas.microsoft.com/office/drawing/2016/5/11/chartex" xmlns:cx6="http://schemas.microsoft.com/office/drawing/2016/5/12/chartex" xmlns:cx7="http://schemas.microsoft.com/office/drawing/2016/5/13/chartex" xmlns:cx8="http://schemas.microsoft.com/office/drawing/2016/5/14/chartex" xmlns:mc="http://schemas.openxmlformats.org/markup-compatibility/2006" xmlns:aink="http://schemas.microsoft.com/office/drawing/2016/ink" xmlns:am3d="http://schemas.microsoft.com/office/drawing/2017/model3d" xmlns:o="urn:schemas-microsoft-com:office:office" xmlns:r="http://schemas.openxmlformats.org/officeDocument/2006/relationships" xmlns:m="http://schemas.openxmlformats.org/officeDocument/2006/math" xmlns:v="urn:schemas-microsoft-com:vml" xmlns:wp14="http://schemas.microsoft.com/office/word/2010/wordprocessingDrawing" xmlns:wp="http://schemas.openxmlformats.org/drawingml/2006/wordprocessingDrawing" xmlns:w10="urn:schemas-microsoft-com:office:word" xmlns:w="http://schemas.openxmlformats.org/wordprocessingml/2006/main" xmlns:w14="http://schemas.microsoft.com/office/word/2010/wordml" xmlns:w15="http://schemas.microsoft.com/office/word/2012/wordml" xmlns:w16cid="http://schemas.microsoft.com/office/word/2016/wordml/cid" xmlns:w16se="http://schemas.microsoft.com/office/word/2015/wordml/symex" xmlns:wpg="http://schemas.microsoft.com/office/word/2010/wordprocessingGroup" xmlns:wpi="http://schemas.microsoft.com/office/word/2010/wordprocessingInk" xmlns:wne="http://schemas.microsoft.com/office/word/2006/wordml" xmlns:wps="http://schemas.microsoft.com/office/word/2010/wordprocessingShape" mc:Ignorable="w14 w15 w16se w16cid wp14">
-  <w:comment w:id="2" w:author="mari6ka2010" w:date="2020-04-15T21:26:00Z" w:initials="">
-    <w:p>
-      <w:pPr>
-        <w:pBdr>
-          <w:top w:val="nil"/>
-          <w:left w:val="nil"/>
-          <w:bottom w:val="nil"/>
-          <w:right w:val="nil"/>
-          <w:between w:val="nil"/>
-        </w:pBdr>
-        <w:ind w:left="0" w:right="0" w:firstLine="0"/>
-        <w:rPr>
-          <w:rFonts w:ascii="Arial" w:eastAsia="Arial" w:hAnsi="Arial" w:cs="Arial"/>
-          <w:color w:val="000000"/>
-          <w:sz w:val="22"/>
-          <w:szCs w:val="22"/>
-        </w:rPr>
-      </w:pPr>
-      <w:r>
-        <w:rPr>
-          <w:rFonts w:ascii="Arial" w:eastAsia="Arial" w:hAnsi="Arial" w:cs="Arial"/>
-          <w:color w:val="000000"/>
-          <w:sz w:val="22"/>
-          <w:szCs w:val="22"/>
-        </w:rPr>
-        <w:t>make sure to remove hyperlink (if resume is found on your github they are already linked to it)</w:t>
-      </w:r>
-    </w:p>
-  </w:comment>
-  <w:comment w:id="1" w:author="Tyler Noble" w:date="2020-04-15T17:29:00Z" w:initials="TN">
-    <w:p>
-      <w:pPr>
-        <w:pStyle w:val="CommentText"/>
-      </w:pPr>
-      <w:r>
-        <w:rPr>
-          <w:rStyle w:val="CommentReference"/>
-        </w:rPr>
-        <w:annotationRef/>
-      </w:r>
-      <w:r>
-        <w:t>Problem is I don’t always just host it on github. But if I did only link the github one it would make sense.</w:t>
-      </w:r>
-    </w:p>
-    <w:p>
-      <w:pPr>
-        <w:pStyle w:val="CommentText"/>
-      </w:pPr>
-      <w:r>
-        <w:t>Sometimes I have to email it though or attach it to stuff.</w:t>
-      </w:r>
-    </w:p>
-  </w:comment>
-  <w:comment w:id="0" w:author="Tyler Noble" w:date="2020-04-15T17:30:00Z" w:initials="TN">
-    <w:p>
-      <w:pPr>
-        <w:pStyle w:val="CommentText"/>
-      </w:pPr>
-      <w:r>
-        <w:rPr>
-          <w:rStyle w:val="CommentReference"/>
-        </w:rPr>
-        <w:annotationRef/>
-      </w:r>
-    </w:p>
-  </w:comment>
-  <w:comment w:id="5" w:author="mari6ka2010" w:date="2020-04-15T21:25:00Z" w:initials="">
-    <w:p>
-      <w:pPr>
-        <w:pBdr>
-          <w:top w:val="nil"/>
-          <w:left w:val="nil"/>
-          <w:bottom w:val="nil"/>
-          <w:right w:val="nil"/>
-          <w:between w:val="nil"/>
-        </w:pBdr>
-        <w:ind w:left="0" w:right="0" w:firstLine="0"/>
-        <w:rPr>
-          <w:rFonts w:ascii="Arial" w:eastAsia="Arial" w:hAnsi="Arial" w:cs="Arial"/>
-          <w:color w:val="000000"/>
-          <w:sz w:val="22"/>
-          <w:szCs w:val="22"/>
-        </w:rPr>
-      </w:pPr>
-      <w:r>
-        <w:rPr>
-          <w:rFonts w:ascii="Arial" w:eastAsia="Arial" w:hAnsi="Arial" w:cs="Arial"/>
-          <w:color w:val="000000"/>
-          <w:sz w:val="22"/>
-          <w:szCs w:val="22"/>
-        </w:rPr>
-        <w:t>still concerned about the table format, but it's up to you</w:t>
-      </w:r>
-    </w:p>
-  </w:comment>
-  <w:comment w:id="4" w:author="Tyler Noble" w:date="2020-04-15T17:50:00Z" w:initials="TN">
-    <w:p>
-      <w:pPr>
-        <w:pStyle w:val="CommentText"/>
-      </w:pPr>
-      <w:r>
-        <w:rPr>
-          <w:rStyle w:val="CommentReference"/>
-        </w:rPr>
-        <w:annotationRef/>
-      </w:r>
-      <w:r>
-        <w:t>Yeah, I think for ATS’ I might create a stripped down version of my resume that is just a txt file.</w:t>
-      </w:r>
-    </w:p>
-    <w:p>
-      <w:pPr>
-        <w:pStyle w:val="CommentText"/>
-      </w:pPr>
-      <w:r>
-        <w:t xml:space="preserve">    I’ll just run a script and it will make the most machine readable resume. Thoughts?</w:t>
-      </w:r>
-    </w:p>
-  </w:comment>
-  <w:comment w:id="8" w:author="mari6ka2010" w:date="2020-04-15T21:22:00Z" w:initials="">
-    <w:p>
-      <w:pPr>
-        <w:pBdr>
-          <w:top w:val="nil"/>
-          <w:left w:val="nil"/>
-          <w:bottom w:val="nil"/>
-          <w:right w:val="nil"/>
-          <w:between w:val="nil"/>
-        </w:pBdr>
-        <w:ind w:left="0" w:right="0" w:firstLine="0"/>
-        <w:rPr>
-          <w:rFonts w:ascii="Arial" w:eastAsia="Arial" w:hAnsi="Arial" w:cs="Arial"/>
-          <w:color w:val="000000"/>
-          <w:sz w:val="22"/>
-          <w:szCs w:val="22"/>
-        </w:rPr>
-      </w:pPr>
-      <w:r>
-        <w:rPr>
-          <w:rFonts w:ascii="Arial" w:eastAsia="Arial" w:hAnsi="Arial" w:cs="Arial"/>
-          <w:color w:val="000000"/>
-          <w:sz w:val="22"/>
-          <w:szCs w:val="22"/>
-        </w:rPr>
-        <w:t>I would use black for your text, especially "Tools Used" so it stands out more, bigger font, seems to get lost with the other text</w:t>
-      </w:r>
-    </w:p>
-  </w:comment>
-  <w:comment w:id="9" w:author="mari6ka2010" w:date="2020-04-15T21:22:00Z" w:initials="">
-    <w:p>
-      <w:pPr>
-        <w:pBdr>
-          <w:top w:val="nil"/>
-          <w:left w:val="nil"/>
-          <w:bottom w:val="nil"/>
-          <w:right w:val="nil"/>
-          <w:between w:val="nil"/>
-        </w:pBdr>
-        <w:ind w:left="0" w:right="0" w:firstLine="0"/>
-        <w:rPr>
-          <w:rFonts w:ascii="Arial" w:eastAsia="Arial" w:hAnsi="Arial" w:cs="Arial"/>
-          <w:color w:val="000000"/>
-          <w:sz w:val="22"/>
-          <w:szCs w:val="22"/>
-        </w:rPr>
-      </w:pPr>
-      <w:r>
-        <w:rPr>
-          <w:rFonts w:ascii="Arial" w:eastAsia="Arial" w:hAnsi="Arial" w:cs="Arial"/>
-          <w:color w:val="000000"/>
-          <w:sz w:val="22"/>
-          <w:szCs w:val="22"/>
-        </w:rPr>
-        <w:t>This bullet point is smaller than the others</w:t>
-      </w:r>
-    </w:p>
-  </w:comment>
-  <w:comment w:id="10" w:author="mari6ka2010" w:date="2020-04-15T21:23:00Z" w:initials="">
-    <w:p>
-      <w:pPr>
-        <w:pBdr>
-          <w:top w:val="nil"/>
-          <w:left w:val="nil"/>
-          <w:bottom w:val="nil"/>
-          <w:right w:val="nil"/>
-          <w:between w:val="nil"/>
-        </w:pBdr>
-        <w:ind w:left="0" w:right="0" w:firstLine="0"/>
-        <w:rPr>
-          <w:rFonts w:ascii="Arial" w:eastAsia="Arial" w:hAnsi="Arial" w:cs="Arial"/>
-          <w:color w:val="000000"/>
-          <w:sz w:val="22"/>
-          <w:szCs w:val="22"/>
-        </w:rPr>
-      </w:pPr>
-      <w:r>
-        <w:rPr>
-          <w:rFonts w:ascii="Arial" w:eastAsia="Arial" w:hAnsi="Arial" w:cs="Arial"/>
-          <w:color w:val="000000"/>
-          <w:sz w:val="22"/>
-          <w:szCs w:val="22"/>
-        </w:rPr>
-        <w:t>Off center with the other "Used"  lines</w:t>
-      </w:r>
-    </w:p>
-  </w:comment>
-  <w:comment w:id="14" w:author="mari6ka2010" w:date="2020-04-15T21:23:00Z" w:initials="">
-    <w:p>
-      <w:pPr>
-        <w:pBdr>
-          <w:top w:val="nil"/>
-          <w:left w:val="nil"/>
-          <w:bottom w:val="nil"/>
-          <w:right w:val="nil"/>
-          <w:between w:val="nil"/>
-        </w:pBdr>
-        <w:ind w:left="0" w:right="0" w:firstLine="0"/>
-        <w:rPr>
-          <w:rFonts w:ascii="Arial" w:eastAsia="Arial" w:hAnsi="Arial" w:cs="Arial"/>
-          <w:color w:val="000000"/>
-          <w:sz w:val="22"/>
-          <w:szCs w:val="22"/>
-        </w:rPr>
-      </w:pPr>
-      <w:r>
-        <w:rPr>
-          <w:rFonts w:ascii="Arial" w:eastAsia="Arial" w:hAnsi="Arial" w:cs="Arial"/>
-          <w:color w:val="000000"/>
-          <w:sz w:val="22"/>
-          <w:szCs w:val="22"/>
-        </w:rPr>
-        <w:t>align to right of page, most recent dates are first</w:t>
-      </w:r>
-    </w:p>
-  </w:comment>
-  <w:comment w:id="21" w:author="mari6ka2010" w:date="2020-04-15T21:25:00Z" w:initials="">
-    <w:p>
-      <w:pPr>
-        <w:pBdr>
-          <w:top w:val="nil"/>
-          <w:left w:val="nil"/>
-          <w:bottom w:val="nil"/>
-          <w:right w:val="nil"/>
-          <w:between w:val="nil"/>
-        </w:pBdr>
-        <w:ind w:left="0" w:right="0" w:firstLine="0"/>
-        <w:rPr>
-          <w:rFonts w:ascii="Arial" w:eastAsia="Arial" w:hAnsi="Arial" w:cs="Arial"/>
-          <w:color w:val="000000"/>
-          <w:sz w:val="22"/>
-          <w:szCs w:val="22"/>
-        </w:rPr>
-      </w:pPr>
-      <w:r>
-        <w:rPr>
-          <w:rFonts w:ascii="Arial" w:eastAsia="Arial" w:hAnsi="Arial" w:cs="Arial"/>
-          <w:color w:val="000000"/>
-          <w:sz w:val="22"/>
-          <w:szCs w:val="22"/>
-        </w:rPr>
-        <w:t>place education right after work experience</w:t>
-      </w:r>
-    </w:p>
-  </w:comment>
-  <w:comment w:id="20" w:author="Tyler Noble" w:date="2020-04-15T17:49:00Z" w:initials="TN">
-    <w:p>
-      <w:pPr>
-        <w:pStyle w:val="CommentText"/>
-      </w:pPr>
-      <w:r>
-        <w:rPr>
-          <w:rStyle w:val="CommentReference"/>
-        </w:rPr>
-        <w:annotationRef/>
-      </w:r>
-      <w:r>
-        <w:t xml:space="preserve">I think it’s super normal for tech people to put their education at the bottom. Usually because it is a given. </w:t>
-      </w:r>
-    </w:p>
-  </w:comment>
-  <w:comment w:id="19" w:author="Tyler Noble" w:date="2020-04-15T17:50:00Z" w:initials="TN">
-    <w:p>
-      <w:pPr>
-        <w:pStyle w:val="CommentText"/>
-      </w:pPr>
-      <w:r>
-        <w:rPr>
-          <w:rStyle w:val="CommentReference"/>
-        </w:rPr>
-        <w:annotationRef/>
-      </w:r>
-      <w:r>
-        <w:t xml:space="preserve">Unless you went to </w:t>
-      </w:r>
-      <w:proofErr w:type="spellStart"/>
-      <w:r>
-        <w:t>harvard</w:t>
-      </w:r>
-      <w:proofErr w:type="spellEnd"/>
-      <w:r>
-        <w:t xml:space="preserve"> or something then I’d advertise that hard</w:t>
-      </w:r>
-    </w:p>
-  </w:comment>
-</w:comments>
-</file>
-
-<file path=word/commentsExtended.xml><?xml version="1.0" encoding="utf-8"?>
-<w15:commentsEx xmlns:wpc="http://schemas.microsoft.com/office/word/2010/wordprocessingCanvas" xmlns:cx="http://schemas.microsoft.com/office/drawing/2014/chartex" xmlns:cx1="http://schemas.microsoft.com/office/drawing/2015/9/8/chartex" xmlns:cx2="http://schemas.microsoft.com/office/drawing/2015/10/21/chartex" xmlns:cx3="http://schemas.microsoft.com/office/drawing/2016/5/9/chartex" xmlns:cx4="http://schemas.microsoft.com/office/drawing/2016/5/10/chartex" xmlns:cx5="http://schemas.microsoft.com/office/drawing/2016/5/11/chartex" xmlns:cx6="http://schemas.microsoft.com/office/drawing/2016/5/12/chartex" xmlns:cx7="http://schemas.microsoft.com/office/drawing/2016/5/13/chartex" xmlns:cx8="http://schemas.microsoft.com/office/drawing/2016/5/14/chartex" xmlns:mc="http://schemas.openxmlformats.org/markup-compatibility/2006" xmlns:aink="http://schemas.microsoft.com/office/drawing/2016/ink" xmlns:am3d="http://schemas.microsoft.com/office/drawing/2017/model3d" xmlns:o="urn:schemas-microsoft-com:office:office" xmlns:r="http://schemas.openxmlformats.org/officeDocument/2006/relationships" xmlns:m="http://schemas.openxmlformats.org/officeDocument/2006/math" xmlns:v="urn:schemas-microsoft-com:vml" xmlns:wp14="http://schemas.microsoft.com/office/word/2010/wordprocessingDrawing" xmlns:wp="http://schemas.openxmlformats.org/drawingml/2006/wordprocessingDrawing" xmlns:w10="urn:schemas-microsoft-com:office:word" xmlns:w="http://schemas.openxmlformats.org/wordprocessingml/2006/main" xmlns:w14="http://schemas.microsoft.com/office/word/2010/wordml" xmlns:w15="http://schemas.microsoft.com/office/word/2012/wordml" xmlns:w16cid="http://schemas.microsoft.com/office/word/2016/wordml/cid" xmlns:w16se="http://schemas.microsoft.com/office/word/2015/wordml/symex" xmlns:wpg="http://schemas.microsoft.com/office/word/2010/wordprocessingGroup" xmlns:wpi="http://schemas.microsoft.com/office/word/2010/wordprocessingInk" xmlns:wne="http://schemas.microsoft.com/office/word/2006/wordml" xmlns:wps="http://schemas.microsoft.com/office/word/2010/wordprocessingShape" mc:Ignorable="w14 w15 w16se w16cid wp14">
-  <w15:commentEx w15:paraId="00000037" w15:done="0"/>
-  <w15:commentEx w15:paraId="01E37EAB" w15:paraIdParent="00000037" w15:done="0"/>
-  <w15:commentEx w15:paraId="10A71BC3" w15:paraIdParent="00000037" w15:done="0"/>
-  <w15:commentEx w15:paraId="0000003E" w15:done="0"/>
-  <w15:commentEx w15:paraId="72313479" w15:paraIdParent="0000003E" w15:done="0"/>
-  <w15:commentEx w15:paraId="00000039" w15:done="0"/>
-  <w15:commentEx w15:paraId="0000003D" w15:done="1"/>
-  <w15:commentEx w15:paraId="00000035" w15:done="1"/>
-  <w15:commentEx w15:paraId="00000036" w15:done="1"/>
-  <w15:commentEx w15:paraId="0000003A" w15:done="0"/>
-  <w15:commentEx w15:paraId="3B026460" w15:paraIdParent="0000003A" w15:done="0"/>
-  <w15:commentEx w15:paraId="3867ABA9" w15:paraIdParent="0000003A" w15:done="0"/>
-</w15:commentsEx>
-</file>
-
-<file path=word/commentsIds.xml><?xml version="1.0" encoding="utf-8"?>
-<w16cid:commentsIds xmlns:wpc="http://schemas.microsoft.com/office/word/2010/wordprocessingCanvas" xmlns:cx="http://schemas.microsoft.com/office/drawing/2014/chartex" xmlns:cx1="http://schemas.microsoft.com/office/drawing/2015/9/8/chartex" xmlns:cx2="http://schemas.microsoft.com/office/drawing/2015/10/21/chartex" xmlns:cx3="http://schemas.microsoft.com/office/drawing/2016/5/9/chartex" xmlns:cx4="http://schemas.microsoft.com/office/drawing/2016/5/10/chartex" xmlns:cx5="http://schemas.microsoft.com/office/drawing/2016/5/11/chartex" xmlns:cx6="http://schemas.microsoft.com/office/drawing/2016/5/12/chartex" xmlns:cx7="http://schemas.microsoft.com/office/drawing/2016/5/13/chartex" xmlns:cx8="http://schemas.microsoft.com/office/drawing/2016/5/14/chartex" xmlns:mc="http://schemas.openxmlformats.org/markup-compatibility/2006" xmlns:aink="http://schemas.microsoft.com/office/drawing/2016/ink" xmlns:am3d="http://schemas.microsoft.com/office/drawing/2017/model3d" xmlns:o="urn:schemas-microsoft-com:office:office" xmlns:r="http://schemas.openxmlformats.org/officeDocument/2006/relationships" xmlns:m="http://schemas.openxmlformats.org/officeDocument/2006/math" xmlns:v="urn:schemas-microsoft-com:vml" xmlns:wp14="http://schemas.microsoft.com/office/word/2010/wordprocessingDrawing" xmlns:wp="http://schemas.openxmlformats.org/drawingml/2006/wordprocessingDrawing" xmlns:w10="urn:schemas-microsoft-com:office:word" xmlns:w="http://schemas.openxmlformats.org/wordprocessingml/2006/main" xmlns:w14="http://schemas.microsoft.com/office/word/2010/wordml" xmlns:w15="http://schemas.microsoft.com/office/word/2012/wordml" xmlns:w16cid="http://schemas.microsoft.com/office/word/2016/wordml/cid" xmlns:w16se="http://schemas.microsoft.com/office/word/2015/wordml/symex" xmlns:wpg="http://schemas.microsoft.com/office/word/2010/wordprocessingGroup" xmlns:wpi="http://schemas.microsoft.com/office/word/2010/wordprocessingInk" xmlns:wne="http://schemas.microsoft.com/office/word/2006/wordml" xmlns:wps="http://schemas.microsoft.com/office/word/2010/wordprocessingShape" mc:Ignorable="w14 w15 w16se w16cid wp14">
-  <w16cid:commentId w16cid:paraId="00000037" w16cid:durableId="2241C2DF"/>
-  <w16cid:commentId w16cid:paraId="01E37EAB" w16cid:durableId="2241C2F2"/>
-  <w16cid:commentId w16cid:paraId="10A71BC3" w16cid:durableId="2241C31F"/>
-  <w16cid:commentId w16cid:paraId="0000003E" w16cid:durableId="2241C2DE"/>
-  <w16cid:commentId w16cid:paraId="72313479" w16cid:durableId="2241C803"/>
-  <w16cid:commentId w16cid:paraId="00000039" w16cid:durableId="2241C2DC"/>
-  <w16cid:commentId w16cid:paraId="0000003D" w16cid:durableId="2241C2DB"/>
-  <w16cid:commentId w16cid:paraId="00000035" w16cid:durableId="2241C2DA"/>
-  <w16cid:commentId w16cid:paraId="00000036" w16cid:durableId="2241C2D7"/>
-  <w16cid:commentId w16cid:paraId="0000003A" w16cid:durableId="2241C2D6"/>
-  <w16cid:commentId w16cid:paraId="3B026460" w16cid:durableId="2241C79B"/>
-  <w16cid:commentId w16cid:paraId="3867ABA9" w16cid:durableId="2241C7D3"/>
-</w16cid:commentsIds>
 </file>
 
 <file path=word/numbering.xml><?xml version="1.0" encoding="utf-8"?>
@@ -2145,14 +1706,6 @@
     <w:abstractNumId w:val="1"/>
   </w:num>
 </w:numbering>
-</file>
-
-<file path=word/people.xml><?xml version="1.0" encoding="utf-8"?>
-<w15:people xmlns:wpc="http://schemas.microsoft.com/office/word/2010/wordprocessingCanvas" xmlns:cx="http://schemas.microsoft.com/office/drawing/2014/chartex" xmlns:cx1="http://schemas.microsoft.com/office/drawing/2015/9/8/chartex" xmlns:cx2="http://schemas.microsoft.com/office/drawing/2015/10/21/chartex" xmlns:cx3="http://schemas.microsoft.com/office/drawing/2016/5/9/chartex" xmlns:cx4="http://schemas.microsoft.com/office/drawing/2016/5/10/chartex" xmlns:cx5="http://schemas.microsoft.com/office/drawing/2016/5/11/chartex" xmlns:cx6="http://schemas.microsoft.com/office/drawing/2016/5/12/chartex" xmlns:cx7="http://schemas.microsoft.com/office/drawing/2016/5/13/chartex" xmlns:cx8="http://schemas.microsoft.com/office/drawing/2016/5/14/chartex" xmlns:mc="http://schemas.openxmlformats.org/markup-compatibility/2006" xmlns:aink="http://schemas.microsoft.com/office/drawing/2016/ink" xmlns:am3d="http://schemas.microsoft.com/office/drawing/2017/model3d" xmlns:o="urn:schemas-microsoft-com:office:office" xmlns:r="http://schemas.openxmlformats.org/officeDocument/2006/relationships" xmlns:m="http://schemas.openxmlformats.org/officeDocument/2006/math" xmlns:v="urn:schemas-microsoft-com:vml" xmlns:wp14="http://schemas.microsoft.com/office/word/2010/wordprocessingDrawing" xmlns:wp="http://schemas.openxmlformats.org/drawingml/2006/wordprocessingDrawing" xmlns:w10="urn:schemas-microsoft-com:office:word" xmlns:w="http://schemas.openxmlformats.org/wordprocessingml/2006/main" xmlns:w14="http://schemas.microsoft.com/office/word/2010/wordml" xmlns:w15="http://schemas.microsoft.com/office/word/2012/wordml" xmlns:w16cid="http://schemas.microsoft.com/office/word/2016/wordml/cid" xmlns:w16se="http://schemas.microsoft.com/office/word/2015/wordml/symex" xmlns:wpg="http://schemas.microsoft.com/office/word/2010/wordprocessingGroup" xmlns:wpi="http://schemas.microsoft.com/office/word/2010/wordprocessingInk" xmlns:wne="http://schemas.microsoft.com/office/word/2006/wordml" xmlns:wps="http://schemas.microsoft.com/office/word/2010/wordprocessingShape" mc:Ignorable="w14 w15 w16se w16cid wp14">
-  <w15:person w15:author="Tyler Noble">
-    <w15:presenceInfo w15:providerId="Windows Live" w15:userId="ecb3fe31b177bd48"/>
-  </w15:person>
-</w15:people>
 </file>
 
 <file path=word/styles.xml><?xml version="1.0" encoding="utf-8"?>

</xml_diff>

<commit_message>
Got rid of table
</commit_message>
<xml_diff>
--- a/Resume/TylerNobleResume.docx
+++ b/Resume/TylerNobleResume.docx
@@ -247,212 +247,169 @@
         <w:t>TECHNICAL SKILLS</w:t>
       </w:r>
     </w:p>
-    <w:tbl>
-      <w:tblPr>
-        <w:tblStyle w:val="a1"/>
-        <w:tblW w:w="9951" w:type="dxa"/>
-        <w:tblInd w:w="534" w:type="dxa"/>
-        <w:tblBorders>
-          <w:top w:val="single" w:sz="4" w:space="0" w:color="7F7F7F"/>
-          <w:left w:val="single" w:sz="4" w:space="0" w:color="BFBFBF"/>
-          <w:bottom w:val="single" w:sz="4" w:space="0" w:color="7F7F7F"/>
-          <w:right w:val="single" w:sz="4" w:space="0" w:color="BFBFBF"/>
-          <w:insideH w:val="single" w:sz="4" w:space="0" w:color="BFBFBF"/>
-          <w:insideV w:val="single" w:sz="4" w:space="0" w:color="BFBFBF"/>
-        </w:tblBorders>
-        <w:tblLayout w:type="fixed"/>
-        <w:tblLook w:val="0200" w:firstRow="0" w:lastRow="0" w:firstColumn="0" w:lastColumn="0" w:noHBand="1" w:noVBand="0"/>
-      </w:tblPr>
-      <w:tblGrid>
-        <w:gridCol w:w="1733"/>
-        <w:gridCol w:w="2281"/>
-        <w:gridCol w:w="2281"/>
-        <w:gridCol w:w="2281"/>
-        <w:gridCol w:w="1375"/>
-      </w:tblGrid>
-      <w:tr>
-        <w:trPr>
-          <w:trHeight w:val="146"/>
-        </w:trPr>
-        <w:tc>
-          <w:tcPr>
-            <w:cnfStyle w:val="000010000000" w:firstRow="0" w:lastRow="0" w:firstColumn="0" w:lastColumn="0" w:oddVBand="1" w:evenVBand="0" w:oddHBand="0" w:evenHBand="0" w:firstRowFirstColumn="0" w:firstRowLastColumn="0" w:lastRowFirstColumn="0" w:lastRowLastColumn="0"/>
-            <w:tcW w:w="1733" w:type="dxa"/>
-            <w:tcBorders>
-              <w:bottom w:val="single" w:sz="4" w:space="0" w:color="000000"/>
-            </w:tcBorders>
-          </w:tcPr>
-          <w:p>
-            <w:pPr>
-              <w:ind w:left="0" w:firstLine="0"/>
-            </w:pPr>
-            <w:bookmarkStart w:id="1" w:name="_heading=h.30j0zll" w:colFirst="0" w:colLast="0"/>
-            <w:bookmarkEnd w:id="1"/>
-            <w:r>
-              <w:t>Java</w:t>
-            </w:r>
-          </w:p>
-        </w:tc>
-        <w:tc>
-          <w:tcPr>
-            <w:tcW w:w="2281" w:type="dxa"/>
-            <w:tcBorders>
-              <w:bottom w:val="single" w:sz="4" w:space="0" w:color="000000"/>
-            </w:tcBorders>
-          </w:tcPr>
-          <w:p>
-            <w:pPr>
-              <w:ind w:left="0" w:firstLine="0"/>
-              <w:cnfStyle w:val="000000000000" w:firstRow="0" w:lastRow="0" w:firstColumn="0" w:lastColumn="0" w:oddVBand="0" w:evenVBand="0" w:oddHBand="0" w:evenHBand="0" w:firstRowFirstColumn="0" w:firstRowLastColumn="0" w:lastRowFirstColumn="0" w:lastRowLastColumn="0"/>
-            </w:pPr>
-            <w:r>
-              <w:t>Android</w:t>
-            </w:r>
-          </w:p>
-        </w:tc>
-        <w:tc>
-          <w:tcPr>
-            <w:cnfStyle w:val="000010000000" w:firstRow="0" w:lastRow="0" w:firstColumn="0" w:lastColumn="0" w:oddVBand="1" w:evenVBand="0" w:oddHBand="0" w:evenHBand="0" w:firstRowFirstColumn="0" w:firstRowLastColumn="0" w:lastRowFirstColumn="0" w:lastRowLastColumn="0"/>
-            <w:tcW w:w="2281" w:type="dxa"/>
-            <w:tcBorders>
-              <w:bottom w:val="single" w:sz="4" w:space="0" w:color="000000"/>
-            </w:tcBorders>
-          </w:tcPr>
-          <w:p>
-            <w:pPr>
-              <w:ind w:left="0" w:firstLine="0"/>
-            </w:pPr>
-            <w:r>
-              <w:t>GIT</w:t>
-            </w:r>
-          </w:p>
-        </w:tc>
-        <w:tc>
-          <w:tcPr>
-            <w:tcW w:w="2281" w:type="dxa"/>
-            <w:tcBorders>
-              <w:bottom w:val="single" w:sz="4" w:space="0" w:color="000000"/>
-            </w:tcBorders>
-          </w:tcPr>
-          <w:p>
-            <w:pPr>
-              <w:ind w:left="0" w:firstLine="0"/>
-              <w:cnfStyle w:val="000000000000" w:firstRow="0" w:lastRow="0" w:firstColumn="0" w:lastColumn="0" w:oddVBand="0" w:evenVBand="0" w:oddHBand="0" w:evenHBand="0" w:firstRowFirstColumn="0" w:firstRowLastColumn="0" w:lastRowFirstColumn="0" w:lastRowLastColumn="0"/>
-            </w:pPr>
-            <w:r>
-              <w:t>SQL</w:t>
-            </w:r>
-          </w:p>
-        </w:tc>
-        <w:tc>
-          <w:tcPr>
-            <w:cnfStyle w:val="000010000000" w:firstRow="0" w:lastRow="0" w:firstColumn="0" w:lastColumn="0" w:oddVBand="1" w:evenVBand="0" w:oddHBand="0" w:evenHBand="0" w:firstRowFirstColumn="0" w:firstRowLastColumn="0" w:lastRowFirstColumn="0" w:lastRowLastColumn="0"/>
-            <w:tcW w:w="1375" w:type="dxa"/>
-            <w:tcBorders>
-              <w:bottom w:val="single" w:sz="4" w:space="0" w:color="000000"/>
-            </w:tcBorders>
-          </w:tcPr>
-          <w:p>
-            <w:pPr>
-              <w:ind w:left="0" w:firstLine="0"/>
-            </w:pPr>
-            <w:r>
-              <w:t>React.js</w:t>
-            </w:r>
-          </w:p>
-        </w:tc>
-      </w:tr>
-      <w:tr>
-        <w:trPr>
-          <w:trHeight w:val="284"/>
-        </w:trPr>
-        <w:tc>
-          <w:tcPr>
-            <w:cnfStyle w:val="000010000000" w:firstRow="0" w:lastRow="0" w:firstColumn="0" w:lastColumn="0" w:oddVBand="1" w:evenVBand="0" w:oddHBand="0" w:evenHBand="0" w:firstRowFirstColumn="0" w:firstRowLastColumn="0" w:lastRowFirstColumn="0" w:lastRowLastColumn="0"/>
-            <w:tcW w:w="1733" w:type="dxa"/>
-            <w:tcBorders>
-              <w:top w:val="single" w:sz="4" w:space="0" w:color="000000"/>
-            </w:tcBorders>
-          </w:tcPr>
-          <w:p>
-            <w:pPr>
-              <w:ind w:left="0" w:firstLine="0"/>
-            </w:pPr>
-            <w:r>
-              <w:t>Python</w:t>
-            </w:r>
-          </w:p>
-        </w:tc>
-        <w:tc>
-          <w:tcPr>
-            <w:tcW w:w="2281" w:type="dxa"/>
-            <w:tcBorders>
-              <w:top w:val="single" w:sz="4" w:space="0" w:color="000000"/>
-            </w:tcBorders>
-          </w:tcPr>
-          <w:p>
-            <w:pPr>
-              <w:ind w:left="0" w:firstLine="0"/>
-              <w:cnfStyle w:val="000000000000" w:firstRow="0" w:lastRow="0" w:firstColumn="0" w:lastColumn="0" w:oddVBand="0" w:evenVBand="0" w:oddHBand="0" w:evenHBand="0" w:firstRowFirstColumn="0" w:firstRowLastColumn="0" w:lastRowFirstColumn="0" w:lastRowLastColumn="0"/>
-            </w:pPr>
-            <w:r>
-              <w:t>Node/Express.js</w:t>
-            </w:r>
-          </w:p>
-        </w:tc>
-        <w:tc>
-          <w:tcPr>
-            <w:cnfStyle w:val="000010000000" w:firstRow="0" w:lastRow="0" w:firstColumn="0" w:lastColumn="0" w:oddVBand="1" w:evenVBand="0" w:oddHBand="0" w:evenHBand="0" w:firstRowFirstColumn="0" w:firstRowLastColumn="0" w:lastRowFirstColumn="0" w:lastRowLastColumn="0"/>
-            <w:tcW w:w="2281" w:type="dxa"/>
-            <w:tcBorders>
-              <w:top w:val="single" w:sz="4" w:space="0" w:color="000000"/>
-            </w:tcBorders>
-          </w:tcPr>
-          <w:p>
-            <w:pPr>
-              <w:ind w:left="0" w:firstLine="0"/>
-            </w:pPr>
-            <w:r>
-              <w:t>Linux/Bash</w:t>
-            </w:r>
-          </w:p>
-        </w:tc>
-        <w:tc>
-          <w:tcPr>
-            <w:tcW w:w="2281" w:type="dxa"/>
-            <w:tcBorders>
-              <w:top w:val="single" w:sz="4" w:space="0" w:color="000000"/>
-            </w:tcBorders>
-          </w:tcPr>
-          <w:p>
-            <w:pPr>
-              <w:ind w:left="0" w:firstLine="0"/>
-              <w:cnfStyle w:val="000000000000" w:firstRow="0" w:lastRow="0" w:firstColumn="0" w:lastColumn="0" w:oddVBand="0" w:evenVBand="0" w:oddHBand="0" w:evenHBand="0" w:firstRowFirstColumn="0" w:firstRowLastColumn="0" w:lastRowFirstColumn="0" w:lastRowLastColumn="0"/>
-            </w:pPr>
-            <w:r>
-              <w:t>MongoDB</w:t>
-            </w:r>
-          </w:p>
-        </w:tc>
-        <w:tc>
-          <w:tcPr>
-            <w:cnfStyle w:val="000010000000" w:firstRow="0" w:lastRow="0" w:firstColumn="0" w:lastColumn="0" w:oddVBand="1" w:evenVBand="0" w:oddHBand="0" w:evenHBand="0" w:firstRowFirstColumn="0" w:firstRowLastColumn="0" w:lastRowFirstColumn="0" w:lastRowLastColumn="0"/>
-            <w:tcW w:w="1375" w:type="dxa"/>
-            <w:tcBorders>
-              <w:top w:val="single" w:sz="4" w:space="0" w:color="000000"/>
-            </w:tcBorders>
-          </w:tcPr>
-          <w:p>
-            <w:pPr>
-              <w:ind w:left="0" w:firstLine="0"/>
-            </w:pPr>
-            <w:r>
-              <w:t>CSS/HTML</w:t>
-            </w:r>
-          </w:p>
-        </w:tc>
-      </w:tr>
-    </w:tbl>
+    <w:p>
+      <w:pPr>
+        <w:jc w:val="center"/>
+        <w:rPr>
+          <w:b/>
+          <w:bCs/>
+          <w:sz w:val="22"/>
+          <w:szCs w:val="22"/>
+        </w:rPr>
+      </w:pPr>
+      <w:r>
+        <w:rPr>
+          <w:b/>
+          <w:bCs/>
+          <w:sz w:val="22"/>
+          <w:szCs w:val="22"/>
+        </w:rPr>
+        <w:t>Java</w:t>
+      </w:r>
+      <w:r>
+        <w:rPr>
+          <w:b/>
+          <w:bCs/>
+          <w:sz w:val="22"/>
+          <w:szCs w:val="22"/>
+        </w:rPr>
+        <w:tab/>
+        <w:t>Android</w:t>
+      </w:r>
+      <w:r>
+        <w:rPr>
+          <w:b/>
+          <w:bCs/>
+          <w:sz w:val="22"/>
+          <w:szCs w:val="22"/>
+        </w:rPr>
+        <w:tab/>
+      </w:r>
+      <w:r>
+        <w:rPr>
+          <w:b/>
+          <w:bCs/>
+          <w:sz w:val="22"/>
+          <w:szCs w:val="22"/>
+        </w:rPr>
+        <w:tab/>
+        <w:t>GIT</w:t>
+      </w:r>
+      <w:r>
+        <w:rPr>
+          <w:b/>
+          <w:bCs/>
+          <w:sz w:val="22"/>
+          <w:szCs w:val="22"/>
+        </w:rPr>
+        <w:tab/>
+      </w:r>
+      <w:r>
+        <w:rPr>
+          <w:b/>
+          <w:bCs/>
+          <w:sz w:val="22"/>
+          <w:szCs w:val="22"/>
+        </w:rPr>
+        <w:tab/>
+      </w:r>
+      <w:r>
+        <w:rPr>
+          <w:b/>
+          <w:bCs/>
+          <w:sz w:val="22"/>
+          <w:szCs w:val="22"/>
+        </w:rPr>
+        <w:t>SQL</w:t>
+      </w:r>
+      <w:r>
+        <w:rPr>
+          <w:b/>
+          <w:bCs/>
+          <w:sz w:val="22"/>
+          <w:szCs w:val="22"/>
+        </w:rPr>
+        <w:tab/>
+      </w:r>
+      <w:r>
+        <w:rPr>
+          <w:b/>
+          <w:bCs/>
+          <w:sz w:val="22"/>
+          <w:szCs w:val="22"/>
+        </w:rPr>
+        <w:tab/>
+      </w:r>
+      <w:r>
+        <w:rPr>
+          <w:b/>
+          <w:bCs/>
+          <w:sz w:val="22"/>
+          <w:szCs w:val="22"/>
+        </w:rPr>
+        <w:t>React.js</w:t>
+      </w:r>
+    </w:p>
+    <w:p>
+      <w:pPr>
+        <w:jc w:val="center"/>
+        <w:rPr>
+          <w:b/>
+          <w:bCs/>
+          <w:sz w:val="22"/>
+          <w:szCs w:val="22"/>
+        </w:rPr>
+      </w:pPr>
+      <w:r>
+        <w:rPr>
+          <w:b/>
+          <w:bCs/>
+          <w:sz w:val="22"/>
+          <w:szCs w:val="22"/>
+        </w:rPr>
+        <w:t>Python</w:t>
+      </w:r>
+      <w:r>
+        <w:rPr>
+          <w:b/>
+          <w:bCs/>
+          <w:sz w:val="22"/>
+          <w:szCs w:val="22"/>
+        </w:rPr>
+        <w:tab/>
+        <w:t>Node/Express.js</w:t>
+      </w:r>
+      <w:r>
+        <w:rPr>
+          <w:b/>
+          <w:bCs/>
+          <w:sz w:val="22"/>
+          <w:szCs w:val="22"/>
+        </w:rPr>
+        <w:tab/>
+        <w:t>Linux/Bash</w:t>
+      </w:r>
+      <w:r>
+        <w:rPr>
+          <w:b/>
+          <w:bCs/>
+          <w:sz w:val="22"/>
+          <w:szCs w:val="22"/>
+        </w:rPr>
+        <w:tab/>
+        <w:t>MongoDB</w:t>
+      </w:r>
+      <w:r>
+        <w:rPr>
+          <w:b/>
+          <w:bCs/>
+          <w:sz w:val="22"/>
+          <w:szCs w:val="22"/>
+        </w:rPr>
+        <w:tab/>
+        <w:t>CSS/HTML</w:t>
+      </w:r>
+    </w:p>
     <w:p>
       <w:pPr>
         <w:pStyle w:val="Heading1"/>
@@ -465,6 +422,8 @@
           <w:u w:val="single"/>
         </w:rPr>
       </w:pPr>
+      <w:bookmarkStart w:id="1" w:name="_heading=h.30j0zll" w:colFirst="0" w:colLast="0"/>
+      <w:bookmarkEnd w:id="1"/>
       <w:r>
         <w:rPr>
           <w:sz w:val="24"/>

</xml_diff>

<commit_message>
Updated the fact that I'm currently working
</commit_message>
<xml_diff>
--- a/Resume/TylerNobleResume.docx
+++ b/Resume/TylerNobleResume.docx
@@ -1,6 +1,6 @@
 
 <file path=word/document.xml><?xml version="1.0" encoding="utf-8"?>
-<w:document xmlns:wpc="http://schemas.microsoft.com/office/word/2010/wordprocessingCanvas" xmlns:cx="http://schemas.microsoft.com/office/drawing/2014/chartex" xmlns:cx1="http://schemas.microsoft.com/office/drawing/2015/9/8/chartex" xmlns:cx2="http://schemas.microsoft.com/office/drawing/2015/10/21/chartex" xmlns:cx3="http://schemas.microsoft.com/office/drawing/2016/5/9/chartex" xmlns:cx4="http://schemas.microsoft.com/office/drawing/2016/5/10/chartex" xmlns:cx5="http://schemas.microsoft.com/office/drawing/2016/5/11/chartex" xmlns:cx6="http://schemas.microsoft.com/office/drawing/2016/5/12/chartex" xmlns:cx7="http://schemas.microsoft.com/office/drawing/2016/5/13/chartex" xmlns:cx8="http://schemas.microsoft.com/office/drawing/2016/5/14/chartex" xmlns:mc="http://schemas.openxmlformats.org/markup-compatibility/2006" xmlns:aink="http://schemas.microsoft.com/office/drawing/2016/ink" xmlns:am3d="http://schemas.microsoft.com/office/drawing/2017/model3d" xmlns:o="urn:schemas-microsoft-com:office:office" xmlns:r="http://schemas.openxmlformats.org/officeDocument/2006/relationships" xmlns:m="http://schemas.openxmlformats.org/officeDocument/2006/math" xmlns:v="urn:schemas-microsoft-com:vml" xmlns:wp14="http://schemas.microsoft.com/office/word/2010/wordprocessingDrawing" xmlns:wp="http://schemas.openxmlformats.org/drawingml/2006/wordprocessingDrawing" xmlns:w10="urn:schemas-microsoft-com:office:word" xmlns:w="http://schemas.openxmlformats.org/wordprocessingml/2006/main" xmlns:w14="http://schemas.microsoft.com/office/word/2010/wordml" xmlns:w15="http://schemas.microsoft.com/office/word/2012/wordml" xmlns:w16cid="http://schemas.microsoft.com/office/word/2016/wordml/cid" xmlns:w16se="http://schemas.microsoft.com/office/word/2015/wordml/symex" xmlns:wpg="http://schemas.microsoft.com/office/word/2010/wordprocessingGroup" xmlns:wpi="http://schemas.microsoft.com/office/word/2010/wordprocessingInk" xmlns:wne="http://schemas.microsoft.com/office/word/2006/wordml" xmlns:wps="http://schemas.microsoft.com/office/word/2010/wordprocessingShape" mc:Ignorable="w14 w15 w16se w16cid wp14">
+<w:document xmlns:wpc="http://schemas.microsoft.com/office/word/2010/wordprocessingCanvas" xmlns:cx="http://schemas.microsoft.com/office/drawing/2014/chartex" xmlns:cx1="http://schemas.microsoft.com/office/drawing/2015/9/8/chartex" xmlns:cx2="http://schemas.microsoft.com/office/drawing/2015/10/21/chartex" xmlns:cx3="http://schemas.microsoft.com/office/drawing/2016/5/9/chartex" xmlns:cx4="http://schemas.microsoft.com/office/drawing/2016/5/10/chartex" xmlns:cx5="http://schemas.microsoft.com/office/drawing/2016/5/11/chartex" xmlns:cx6="http://schemas.microsoft.com/office/drawing/2016/5/12/chartex" xmlns:cx7="http://schemas.microsoft.com/office/drawing/2016/5/13/chartex" xmlns:cx8="http://schemas.microsoft.com/office/drawing/2016/5/14/chartex" xmlns:mc="http://schemas.openxmlformats.org/markup-compatibility/2006" xmlns:aink="http://schemas.microsoft.com/office/drawing/2016/ink" xmlns:am3d="http://schemas.microsoft.com/office/drawing/2017/model3d" xmlns:o="urn:schemas-microsoft-com:office:office" xmlns:r="http://schemas.openxmlformats.org/officeDocument/2006/relationships" xmlns:m="http://schemas.openxmlformats.org/officeDocument/2006/math" xmlns:v="urn:schemas-microsoft-com:vml" xmlns:wp14="http://schemas.microsoft.com/office/word/2010/wordprocessingDrawing" xmlns:wp="http://schemas.openxmlformats.org/drawingml/2006/wordprocessingDrawing" xmlns:w10="urn:schemas-microsoft-com:office:word" xmlns:w="http://schemas.openxmlformats.org/wordprocessingml/2006/main" xmlns:w14="http://schemas.microsoft.com/office/word/2010/wordml" xmlns:w15="http://schemas.microsoft.com/office/word/2012/wordml" xmlns:w16cex="http://schemas.microsoft.com/office/word/2018/wordml/cex" xmlns:w16cid="http://schemas.microsoft.com/office/word/2016/wordml/cid" xmlns:w16="http://schemas.microsoft.com/office/word/2018/wordml" xmlns:w16se="http://schemas.microsoft.com/office/word/2015/wordml/symex" xmlns:wpg="http://schemas.microsoft.com/office/word/2010/wordprocessingGroup" xmlns:wpi="http://schemas.microsoft.com/office/word/2010/wordprocessingInk" xmlns:wne="http://schemas.microsoft.com/office/word/2006/wordml" xmlns:wps="http://schemas.microsoft.com/office/word/2010/wordprocessingShape" mc:Ignorable="w14 w15 w16se w16cid w16 w16cex wp14">
   <w:body>
     <w:p>
       <w:pPr>
@@ -208,14 +208,12 @@
         <w:t xml:space="preserve"> </w:t>
       </w:r>
       <w:hyperlink r:id="rId10">
-        <w:proofErr w:type="spellStart"/>
         <w:r>
           <w:rPr>
             <w:b/>
           </w:rPr>
           <w:t>NobleTyler</w:t>
         </w:r>
-        <w:proofErr w:type="spellEnd"/>
       </w:hyperlink>
     </w:p>
     <w:bookmarkStart w:id="0" w:name="_heading=h.gjdgxs" w:colFirst="0" w:colLast="0"/>
@@ -312,6 +310,7 @@
           <w:szCs w:val="22"/>
         </w:rPr>
         <w:tab/>
+        <w:t>SQL</w:t>
       </w:r>
       <w:r>
         <w:rPr>
@@ -320,7 +319,7 @@
           <w:sz w:val="22"/>
           <w:szCs w:val="22"/>
         </w:rPr>
-        <w:t>SQL</w:t>
+        <w:tab/>
       </w:r>
       <w:r>
         <w:rPr>
@@ -330,23 +329,6 @@
           <w:szCs w:val="22"/>
         </w:rPr>
         <w:tab/>
-      </w:r>
-      <w:r>
-        <w:rPr>
-          <w:b/>
-          <w:bCs/>
-          <w:sz w:val="22"/>
-          <w:szCs w:val="22"/>
-        </w:rPr>
-        <w:tab/>
-      </w:r>
-      <w:r>
-        <w:rPr>
-          <w:b/>
-          <w:bCs/>
-          <w:sz w:val="22"/>
-          <w:szCs w:val="22"/>
-        </w:rPr>
         <w:t>React.js</w:t>
       </w:r>
     </w:p>
@@ -477,6 +459,8 @@
         <w:ind w:left="714" w:right="301" w:hanging="357"/>
         <w:rPr>
           <w:b w:val="0"/>
+          <w:i/>
+          <w:iCs/>
         </w:rPr>
       </w:pPr>
       <w:r>
@@ -525,11 +509,23 @@
       <w:r>
         <w:rPr>
           <w:b w:val="0"/>
+        </w:rPr>
+        <w:tab/>
+      </w:r>
+      <w:r>
+        <w:rPr>
+          <w:b w:val="0"/>
+        </w:rPr>
+        <w:tab/>
+      </w:r>
+      <w:r>
+        <w:rPr>
+          <w:b w:val="0"/>
           <w:color w:val="666666"/>
           <w:sz w:val="22"/>
           <w:szCs w:val="22"/>
         </w:rPr>
-        <w:t>September 2019 – March 2020</w:t>
+        <w:t xml:space="preserve">September 2019 </w:t>
       </w:r>
     </w:p>
     <w:p>
@@ -774,16 +770,8 @@
         <w:rPr>
           <w:b/>
         </w:rPr>
-        <w:t xml:space="preserve">Used: Microsoft Excel, Google Analytics, HTML, JavaScript, Spotfire and </w:t>
-      </w:r>
-      <w:proofErr w:type="spellStart"/>
-      <w:r>
-        <w:rPr>
-          <w:b/>
-        </w:rPr>
-        <w:t>IronPython</w:t>
-      </w:r>
-      <w:proofErr w:type="spellEnd"/>
+        <w:t>Used: Microsoft Excel, Google Analytics, HTML, JavaScript, Spotfire and IronPython</w:t>
+      </w:r>
     </w:p>
     <w:p/>
     <w:p>
@@ -873,23 +861,7 @@
           <w:sz w:val="22"/>
           <w:szCs w:val="22"/>
         </w:rPr>
-        <w:t xml:space="preserve">Created and developed wireframes for a new app, </w:t>
-      </w:r>
-      <w:proofErr w:type="spellStart"/>
-      <w:r>
-        <w:rPr>
-          <w:sz w:val="22"/>
-          <w:szCs w:val="22"/>
-        </w:rPr>
-        <w:t>Mockfolio</w:t>
-      </w:r>
-      <w:proofErr w:type="spellEnd"/>
-      <w:r>
-        <w:rPr>
-          <w:sz w:val="22"/>
-          <w:szCs w:val="22"/>
-        </w:rPr>
-        <w:t>, as part of an Agile team</w:t>
+        <w:t>Created and developed wireframes for a new app, Mockfolio, as part of an Agile team</w:t>
       </w:r>
     </w:p>
     <w:p>
@@ -1050,21 +1022,12 @@
           <w:szCs w:val="22"/>
         </w:rPr>
       </w:pPr>
-      <w:proofErr w:type="spellStart"/>
-      <w:r>
-        <w:rPr>
-          <w:sz w:val="22"/>
-          <w:szCs w:val="22"/>
-        </w:rPr>
-        <w:t>ReBurgaBuilder</w:t>
-      </w:r>
-      <w:proofErr w:type="spellEnd"/>
-      <w:r>
-        <w:rPr>
-          <w:sz w:val="22"/>
-          <w:szCs w:val="22"/>
-        </w:rPr>
-        <w:t xml:space="preserve"> </w:t>
+      <w:r>
+        <w:rPr>
+          <w:sz w:val="22"/>
+          <w:szCs w:val="22"/>
+        </w:rPr>
+        <w:t xml:space="preserve">ReBurgaBuilder </w:t>
       </w:r>
       <w:r>
         <w:rPr>
@@ -1284,15 +1247,7 @@
         <w:ind w:left="357" w:right="301" w:firstLine="0"/>
       </w:pPr>
       <w:r>
-        <w:t xml:space="preserve">Created, </w:t>
-      </w:r>
-      <w:proofErr w:type="gramStart"/>
-      <w:r>
-        <w:t>facilitated</w:t>
-      </w:r>
-      <w:proofErr w:type="gramEnd"/>
-      <w:r>
-        <w:t xml:space="preserve"> and led multiple workshops at York University partnering with WISE (</w:t>
+        <w:t>Created, facilitated and led multiple workshops at York University partnering with WISE (</w:t>
       </w:r>
       <w:r>
         <w:rPr>
@@ -1363,13 +1318,8 @@
       </w:pPr>
       <w:bookmarkStart w:id="11" w:name="_heading=h.3rdcrjn" w:colFirst="0" w:colLast="0"/>
       <w:bookmarkEnd w:id="11"/>
-      <w:proofErr w:type="spellStart"/>
-      <w:r>
-        <w:t>Honours</w:t>
-      </w:r>
-      <w:proofErr w:type="spellEnd"/>
-      <w:r>
-        <w:t xml:space="preserve"> BA Computer Science, </w:t>
+      <w:r>
+        <w:t xml:space="preserve">Honours BA Computer Science, </w:t>
       </w:r>
       <w:r>
         <w:rPr>
@@ -1427,7 +1377,7 @@
 </file>
 
 <file path=word/numbering.xml><?xml version="1.0" encoding="utf-8"?>
-<w:numbering xmlns:wpc="http://schemas.microsoft.com/office/word/2010/wordprocessingCanvas" xmlns:cx="http://schemas.microsoft.com/office/drawing/2014/chartex" xmlns:cx1="http://schemas.microsoft.com/office/drawing/2015/9/8/chartex" xmlns:cx2="http://schemas.microsoft.com/office/drawing/2015/10/21/chartex" xmlns:cx3="http://schemas.microsoft.com/office/drawing/2016/5/9/chartex" xmlns:cx4="http://schemas.microsoft.com/office/drawing/2016/5/10/chartex" xmlns:cx5="http://schemas.microsoft.com/office/drawing/2016/5/11/chartex" xmlns:cx6="http://schemas.microsoft.com/office/drawing/2016/5/12/chartex" xmlns:cx7="http://schemas.microsoft.com/office/drawing/2016/5/13/chartex" xmlns:cx8="http://schemas.microsoft.com/office/drawing/2016/5/14/chartex" xmlns:mc="http://schemas.openxmlformats.org/markup-compatibility/2006" xmlns:aink="http://schemas.microsoft.com/office/drawing/2016/ink" xmlns:am3d="http://schemas.microsoft.com/office/drawing/2017/model3d" xmlns:o="urn:schemas-microsoft-com:office:office" xmlns:r="http://schemas.openxmlformats.org/officeDocument/2006/relationships" xmlns:m="http://schemas.openxmlformats.org/officeDocument/2006/math" xmlns:v="urn:schemas-microsoft-com:vml" xmlns:wp14="http://schemas.microsoft.com/office/word/2010/wordprocessingDrawing" xmlns:wp="http://schemas.openxmlformats.org/drawingml/2006/wordprocessingDrawing" xmlns:w10="urn:schemas-microsoft-com:office:word" xmlns:w="http://schemas.openxmlformats.org/wordprocessingml/2006/main" xmlns:w14="http://schemas.microsoft.com/office/word/2010/wordml" xmlns:w15="http://schemas.microsoft.com/office/word/2012/wordml" xmlns:w16cid="http://schemas.microsoft.com/office/word/2016/wordml/cid" xmlns:w16se="http://schemas.microsoft.com/office/word/2015/wordml/symex" xmlns:wpg="http://schemas.microsoft.com/office/word/2010/wordprocessingGroup" xmlns:wpi="http://schemas.microsoft.com/office/word/2010/wordprocessingInk" xmlns:wne="http://schemas.microsoft.com/office/word/2006/wordml" xmlns:wps="http://schemas.microsoft.com/office/word/2010/wordprocessingShape" mc:Ignorable="w14 w15 w16se w16cid wp14">
+<w:numbering xmlns:wpc="http://schemas.microsoft.com/office/word/2010/wordprocessingCanvas" xmlns:cx="http://schemas.microsoft.com/office/drawing/2014/chartex" xmlns:cx1="http://schemas.microsoft.com/office/drawing/2015/9/8/chartex" xmlns:cx2="http://schemas.microsoft.com/office/drawing/2015/10/21/chartex" xmlns:cx3="http://schemas.microsoft.com/office/drawing/2016/5/9/chartex" xmlns:cx4="http://schemas.microsoft.com/office/drawing/2016/5/10/chartex" xmlns:cx5="http://schemas.microsoft.com/office/drawing/2016/5/11/chartex" xmlns:cx6="http://schemas.microsoft.com/office/drawing/2016/5/12/chartex" xmlns:cx7="http://schemas.microsoft.com/office/drawing/2016/5/13/chartex" xmlns:cx8="http://schemas.microsoft.com/office/drawing/2016/5/14/chartex" xmlns:mc="http://schemas.openxmlformats.org/markup-compatibility/2006" xmlns:aink="http://schemas.microsoft.com/office/drawing/2016/ink" xmlns:am3d="http://schemas.microsoft.com/office/drawing/2017/model3d" xmlns:o="urn:schemas-microsoft-com:office:office" xmlns:r="http://schemas.openxmlformats.org/officeDocument/2006/relationships" xmlns:m="http://schemas.openxmlformats.org/officeDocument/2006/math" xmlns:v="urn:schemas-microsoft-com:vml" xmlns:wp14="http://schemas.microsoft.com/office/word/2010/wordprocessingDrawing" xmlns:wp="http://schemas.openxmlformats.org/drawingml/2006/wordprocessingDrawing" xmlns:w10="urn:schemas-microsoft-com:office:word" xmlns:w="http://schemas.openxmlformats.org/wordprocessingml/2006/main" xmlns:w14="http://schemas.microsoft.com/office/word/2010/wordml" xmlns:w15="http://schemas.microsoft.com/office/word/2012/wordml" xmlns:w16cex="http://schemas.microsoft.com/office/word/2018/wordml/cex" xmlns:w16cid="http://schemas.microsoft.com/office/word/2016/wordml/cid" xmlns:w16="http://schemas.microsoft.com/office/word/2018/wordml" xmlns:w16se="http://schemas.microsoft.com/office/word/2015/wordml/symex" xmlns:wpg="http://schemas.microsoft.com/office/word/2010/wordprocessingGroup" xmlns:wpi="http://schemas.microsoft.com/office/word/2010/wordprocessingInk" xmlns:wne="http://schemas.microsoft.com/office/word/2006/wordml" xmlns:wps="http://schemas.microsoft.com/office/word/2010/wordprocessingShape" mc:Ignorable="w14 w15 w16se w16cid w16 w16cex wp14">
   <w:abstractNum w:abstractNumId="0" w15:restartNumberingAfterBreak="0">
     <w:nsid w:val="089F68EC"/>
     <w:multiLevelType w:val="multilevel"/>
@@ -1668,7 +1618,7 @@
 </file>
 
 <file path=word/styles.xml><?xml version="1.0" encoding="utf-8"?>
-<w:styles xmlns:mc="http://schemas.openxmlformats.org/markup-compatibility/2006" xmlns:r="http://schemas.openxmlformats.org/officeDocument/2006/relationships" xmlns:w="http://schemas.openxmlformats.org/wordprocessingml/2006/main" xmlns:w14="http://schemas.microsoft.com/office/word/2010/wordml" xmlns:w15="http://schemas.microsoft.com/office/word/2012/wordml" xmlns:w16cid="http://schemas.microsoft.com/office/word/2016/wordml/cid" xmlns:w16se="http://schemas.microsoft.com/office/word/2015/wordml/symex" mc:Ignorable="w14 w15 w16se w16cid">
+<w:styles xmlns:mc="http://schemas.openxmlformats.org/markup-compatibility/2006" xmlns:r="http://schemas.openxmlformats.org/officeDocument/2006/relationships" xmlns:w="http://schemas.openxmlformats.org/wordprocessingml/2006/main" xmlns:w14="http://schemas.microsoft.com/office/word/2010/wordml" xmlns:w15="http://schemas.microsoft.com/office/word/2012/wordml" xmlns:w16cex="http://schemas.microsoft.com/office/word/2018/wordml/cex" xmlns:w16cid="http://schemas.microsoft.com/office/word/2016/wordml/cid" xmlns:w16="http://schemas.microsoft.com/office/word/2018/wordml" xmlns:w16se="http://schemas.microsoft.com/office/word/2015/wordml/symex" mc:Ignorable="w14 w15 w16se w16cid w16 w16cex">
   <w:docDefaults>
     <w:rPrDefault>
       <w:rPr>

</xml_diff>

<commit_message>
Added redacted version updated reburgabuilder progress
</commit_message>
<xml_diff>
--- a/Resume/TylerNobleResume.docx
+++ b/Resume/TylerNobleResume.docx
@@ -208,12 +208,14 @@
         <w:t xml:space="preserve"> </w:t>
       </w:r>
       <w:hyperlink r:id="rId10">
+        <w:proofErr w:type="spellStart"/>
         <w:r>
           <w:rPr>
             <w:b/>
           </w:rPr>
           <w:t>NobleTyler</w:t>
         </w:r>
+        <w:proofErr w:type="spellEnd"/>
       </w:hyperlink>
     </w:p>
     <w:bookmarkStart w:id="0" w:name="_heading=h.gjdgxs" w:colFirst="0" w:colLast="0"/>
@@ -777,8 +779,16 @@
         <w:rPr>
           <w:b/>
         </w:rPr>
-        <w:t>Used: Microsoft Excel, Google Analytics, HTML, JavaScript, Spotfire and IronPython</w:t>
-      </w:r>
+        <w:t xml:space="preserve">Used: Microsoft Excel, Google Analytics, HTML, JavaScript, Spotfire and </w:t>
+      </w:r>
+      <w:proofErr w:type="spellStart"/>
+      <w:r>
+        <w:rPr>
+          <w:b/>
+        </w:rPr>
+        <w:t>IronPython</w:t>
+      </w:r>
+      <w:proofErr w:type="spellEnd"/>
     </w:p>
     <w:p/>
     <w:p>
@@ -868,7 +878,23 @@
           <w:sz w:val="22"/>
           <w:szCs w:val="22"/>
         </w:rPr>
-        <w:t>Created and developed wireframes for a new app, Mockfolio, as part of an Agile team</w:t>
+        <w:t xml:space="preserve">Created and developed wireframes for a new app, </w:t>
+      </w:r>
+      <w:proofErr w:type="spellStart"/>
+      <w:r>
+        <w:rPr>
+          <w:sz w:val="22"/>
+          <w:szCs w:val="22"/>
+        </w:rPr>
+        <w:t>Mockfolio</w:t>
+      </w:r>
+      <w:proofErr w:type="spellEnd"/>
+      <w:r>
+        <w:rPr>
+          <w:sz w:val="22"/>
+          <w:szCs w:val="22"/>
+        </w:rPr>
+        <w:t>, as part of an Agile team</w:t>
       </w:r>
     </w:p>
     <w:p>
@@ -1029,20 +1055,29 @@
           <w:szCs w:val="22"/>
         </w:rPr>
       </w:pPr>
-      <w:r>
-        <w:rPr>
-          <w:sz w:val="22"/>
-          <w:szCs w:val="22"/>
-        </w:rPr>
-        <w:t xml:space="preserve">ReBurgaBuilder </w:t>
-      </w:r>
-      <w:r>
-        <w:rPr>
-          <w:b w:val="0"/>
-          <w:sz w:val="22"/>
-          <w:szCs w:val="22"/>
-        </w:rPr>
-        <w:t xml:space="preserve">                                                     </w:t>
+      <w:proofErr w:type="spellStart"/>
+      <w:r>
+        <w:rPr>
+          <w:sz w:val="22"/>
+          <w:szCs w:val="22"/>
+        </w:rPr>
+        <w:t>ReBurgaBuilder</w:t>
+      </w:r>
+      <w:proofErr w:type="spellEnd"/>
+      <w:r>
+        <w:rPr>
+          <w:sz w:val="22"/>
+          <w:szCs w:val="22"/>
+        </w:rPr>
+        <w:t xml:space="preserve"> </w:t>
+      </w:r>
+      <w:r>
+        <w:rPr>
+          <w:b w:val="0"/>
+          <w:sz w:val="22"/>
+          <w:szCs w:val="22"/>
+        </w:rPr>
+        <w:t xml:space="preserve">                                                 </w:t>
       </w:r>
       <w:r>
         <w:rPr>
@@ -1090,7 +1125,23 @@
           <w:sz w:val="22"/>
           <w:szCs w:val="22"/>
         </w:rPr>
-        <w:t xml:space="preserve">         </w:t>
+        <w:t xml:space="preserve">        </w:t>
+      </w:r>
+      <w:r>
+        <w:rPr>
+          <w:b w:val="0"/>
+          <w:sz w:val="22"/>
+          <w:szCs w:val="22"/>
+        </w:rPr>
+        <w:t xml:space="preserve">       </w:t>
+      </w:r>
+      <w:r>
+        <w:rPr>
+          <w:b w:val="0"/>
+          <w:sz w:val="22"/>
+          <w:szCs w:val="22"/>
+        </w:rPr>
+        <w:t xml:space="preserve"> </w:t>
       </w:r>
       <w:r>
         <w:rPr>
@@ -1104,9 +1155,14 @@
         <w:sdtPr>
           <w:tag w:val="goog_rdk_8"/>
           <w:id w:val="-943455679"/>
+          <w:showingPlcHdr/>
         </w:sdtPr>
         <w:sdtEndPr/>
-        <w:sdtContent/>
+        <w:sdtContent>
+          <w:r>
+            <w:t xml:space="preserve">     </w:t>
+          </w:r>
+        </w:sdtContent>
       </w:sdt>
       <w:r>
         <w:rPr>
@@ -1123,7 +1179,16 @@
           <w:sz w:val="22"/>
           <w:szCs w:val="22"/>
         </w:rPr>
-        <w:t>anuary 2020 – Ongoing</w:t>
+        <w:t xml:space="preserve">anuary 2020 – </w:t>
+      </w:r>
+      <w:r>
+        <w:rPr>
+          <w:b w:val="0"/>
+          <w:color w:val="666666"/>
+          <w:sz w:val="22"/>
+          <w:szCs w:val="22"/>
+        </w:rPr>
+        <w:t>July 2020</w:t>
       </w:r>
     </w:p>
     <w:p>
@@ -1331,8 +1396,13 @@
       </w:pPr>
       <w:bookmarkStart w:id="11" w:name="_heading=h.3rdcrjn" w:colFirst="0" w:colLast="0"/>
       <w:bookmarkEnd w:id="11"/>
-      <w:r>
-        <w:t xml:space="preserve">Honours BA Computer Science, </w:t>
+      <w:proofErr w:type="spellStart"/>
+      <w:r>
+        <w:t>Honours</w:t>
+      </w:r>
+      <w:proofErr w:type="spellEnd"/>
+      <w:r>
+        <w:t xml:space="preserve"> BA Computer Science, </w:t>
       </w:r>
       <w:r>
         <w:rPr>

</xml_diff>